<commit_message>
Rebuild site from updated CV; remove about-page boilerplate
Regenerates pages from the new CV_David.docx (journal article count 17 → 19,
new AI/K-12 STEM and AI literacy publications) and drops the meta sentence
about restoring framing from the original site on the About page.

Co-Authored-By: Claude Opus 4.7 (1M context) <noreply@anthropic.com>
</commit_message>
<xml_diff>
--- a/CV_David.docx
+++ b/CV_David.docx
@@ -5158,14 +5158,6 @@
         <w:tblStyle w:val="TableGrid"/>
         <w:tblpPr w:leftFromText="180" w:rightFromText="180" w:vertAnchor="text" w:horzAnchor="margin" w:tblpX="108" w:tblpY="25"/>
         <w:tblW w:w="11088" w:type="dxa"/>
-        <w:tblBorders>
-          <w:top w:val="none" w:sz="0" w:space="0" w:color="auto"/>
-          <w:left w:val="none" w:sz="0" w:space="0" w:color="auto"/>
-          <w:bottom w:val="none" w:sz="0" w:space="0" w:color="auto"/>
-          <w:right w:val="none" w:sz="0" w:space="0" w:color="auto"/>
-          <w:insideH w:val="none" w:sz="0" w:space="0" w:color="auto"/>
-          <w:insideV w:val="none" w:sz="0" w:space="0" w:color="auto"/>
-        </w:tblBorders>
         <w:tblLook w:val="04A0" w:firstRow="1" w:lastRow="0" w:firstColumn="1" w:lastColumn="0" w:noHBand="0" w:noVBand="1"/>
       </w:tblPr>
       <w:tblGrid>
@@ -5217,6 +5209,7 @@
               <w:ind w:left="90"/>
               <w:rPr>
                 <w:rFonts w:ascii="Times New Roman" w:hAnsi="Times New Roman" w:cs="Times New Roman"/>
+                <w:w w:val="90"/>
                 <w:sz w:val="24"/>
                 <w:szCs w:val="24"/>
               </w:rPr>
@@ -5230,6 +5223,162 @@
                 <w:sz w:val="24"/>
                 <w:szCs w:val="24"/>
               </w:rPr>
+              <w:t>Instructor / Course Co-Designer</w:t>
+            </w:r>
+            <w:r>
+              <w:rPr>
+                <w:rFonts w:ascii="Times New Roman" w:hAnsi="Times New Roman" w:cs="Times New Roman"/>
+                <w:b/>
+                <w:bCs/>
+                <w:w w:val="90"/>
+                <w:sz w:val="24"/>
+                <w:szCs w:val="24"/>
+              </w:rPr>
+              <w:br/>
+            </w:r>
+            <w:r>
+              <w:rPr>
+                <w:rFonts w:ascii="Times New Roman" w:hAnsi="Times New Roman" w:cs="Times New Roman"/>
+                <w:w w:val="90"/>
+                <w:sz w:val="24"/>
+                <w:szCs w:val="24"/>
+              </w:rPr>
+              <w:t>The University of Alabama, Tuscaloosa, AL, United States</w:t>
+            </w:r>
+          </w:p>
+          <w:p>
+            <w:pPr>
+              <w:tabs>
+                <w:tab w:val="left" w:pos="8913"/>
+              </w:tabs>
+              <w:spacing w:line="298" w:lineRule="exact"/>
+              <w:ind w:left="90"/>
+              <w:rPr>
+                <w:rFonts w:ascii="Times New Roman" w:hAnsi="Times New Roman" w:cs="Times New Roman"/>
+                <w:w w:val="90"/>
+                <w:sz w:val="24"/>
+                <w:szCs w:val="24"/>
+              </w:rPr>
+            </w:pPr>
+            <w:r>
+              <w:rPr>
+                <w:rFonts w:ascii="Times New Roman" w:hAnsi="Times New Roman" w:cs="Times New Roman"/>
+                <w:w w:val="90"/>
+                <w:sz w:val="24"/>
+                <w:szCs w:val="24"/>
+              </w:rPr>
+              <w:t xml:space="preserve">• Co-designed and developed </w:t>
+            </w:r>
+            <w:r>
+              <w:rPr>
+                <w:rFonts w:ascii="Times New Roman" w:hAnsi="Times New Roman" w:cs="Times New Roman"/>
+                <w:i/>
+                <w:iCs/>
+                <w:w w:val="90"/>
+                <w:sz w:val="24"/>
+                <w:szCs w:val="24"/>
+              </w:rPr>
+              <w:t>AI Fluency for the Workforce</w:t>
+            </w:r>
+            <w:r>
+              <w:rPr>
+                <w:rFonts w:ascii="Times New Roman" w:hAnsi="Times New Roman" w:cs="Times New Roman"/>
+                <w:w w:val="90"/>
+                <w:sz w:val="24"/>
+                <w:szCs w:val="24"/>
+              </w:rPr>
+              <w:t xml:space="preserve"> (CIE 499), an undergraduate course integrating applied AI, ethics, and workforce readiness competencies.</w:t>
+            </w:r>
+            <w:r>
+              <w:rPr>
+                <w:rFonts w:ascii="Times New Roman" w:hAnsi="Times New Roman" w:cs="Times New Roman"/>
+                <w:w w:val="90"/>
+                <w:sz w:val="24"/>
+                <w:szCs w:val="24"/>
+              </w:rPr>
+              <w:br/>
+              <w:t>• Delivered instruction and facilitated active learning for ~30 students, supporting mastery of AI concepts and real-world applications.</w:t>
+            </w:r>
+            <w:r>
+              <w:rPr>
+                <w:rFonts w:ascii="Times New Roman" w:hAnsi="Times New Roman" w:cs="Times New Roman"/>
+                <w:w w:val="90"/>
+                <w:sz w:val="24"/>
+                <w:szCs w:val="24"/>
+              </w:rPr>
+              <w:br/>
+              <w:t>• Designed and evaluated scaffolded assignments (e.g., AI toolkit, portfolio artifacts, chatbot development), providing timely and constructive feedback to enhance student performance.</w:t>
+            </w:r>
+            <w:r>
+              <w:rPr>
+                <w:rFonts w:ascii="Times New Roman" w:hAnsi="Times New Roman" w:cs="Times New Roman"/>
+                <w:w w:val="90"/>
+                <w:sz w:val="24"/>
+                <w:szCs w:val="24"/>
+              </w:rPr>
+              <w:br/>
+              <w:t>• Implemented project-based and experiential learning strategies to strengthen critical thinking, responsible AI use, and professional skills.</w:t>
+            </w:r>
+            <w:r>
+              <w:rPr>
+                <w:rFonts w:ascii="Times New Roman" w:hAnsi="Times New Roman" w:cs="Times New Roman"/>
+                <w:w w:val="90"/>
+                <w:sz w:val="24"/>
+                <w:szCs w:val="24"/>
+              </w:rPr>
+              <w:br/>
+              <w:t>• Collaborated with faculty on curriculum development, aligning course content with emerging industry needs and institutional AI initiatives.</w:t>
+            </w:r>
+            <w:r>
+              <w:rPr>
+                <w:rFonts w:ascii="Times New Roman" w:hAnsi="Times New Roman" w:cs="Times New Roman"/>
+                <w:w w:val="90"/>
+                <w:sz w:val="24"/>
+                <w:szCs w:val="24"/>
+              </w:rPr>
+              <w:br/>
+              <w:t>• Managed the Blackboard learning environment, monitored student progress, and communicated course updates to enrich the learning experience.</w:t>
+            </w:r>
+          </w:p>
+          <w:p>
+            <w:pPr>
+              <w:tabs>
+                <w:tab w:val="left" w:pos="8913"/>
+              </w:tabs>
+              <w:spacing w:line="298" w:lineRule="exact"/>
+              <w:ind w:left="90"/>
+              <w:rPr>
+                <w:rFonts w:ascii="Times New Roman" w:hAnsi="Times New Roman" w:cs="Times New Roman"/>
+                <w:b/>
+                <w:bCs/>
+                <w:w w:val="90"/>
+                <w:sz w:val="24"/>
+                <w:szCs w:val="24"/>
+              </w:rPr>
+            </w:pPr>
+          </w:p>
+          <w:p>
+            <w:pPr>
+              <w:tabs>
+                <w:tab w:val="left" w:pos="8913"/>
+              </w:tabs>
+              <w:spacing w:line="298" w:lineRule="exact"/>
+              <w:ind w:left="90"/>
+              <w:rPr>
+                <w:rFonts w:ascii="Times New Roman" w:hAnsi="Times New Roman" w:cs="Times New Roman"/>
+                <w:sz w:val="24"/>
+                <w:szCs w:val="24"/>
+              </w:rPr>
+            </w:pPr>
+            <w:r>
+              <w:rPr>
+                <w:rFonts w:ascii="Times New Roman" w:hAnsi="Times New Roman" w:cs="Times New Roman"/>
+                <w:b/>
+                <w:bCs/>
+                <w:w w:val="90"/>
+                <w:sz w:val="24"/>
+                <w:szCs w:val="24"/>
+              </w:rPr>
               <w:t>Teaching</w:t>
             </w:r>
             <w:r>
@@ -5257,10 +5406,20 @@
             <w:r>
               <w:rPr>
                 <w:rFonts w:ascii="Times New Roman" w:hAnsi="Times New Roman" w:cs="Times New Roman"/>
-                <w:sz w:val="24"/>
-                <w:szCs w:val="24"/>
-              </w:rPr>
-              <w:tab/>
+                <w:b/>
+                <w:bCs/>
+                <w:spacing w:val="-2"/>
+                <w:sz w:val="24"/>
+                <w:szCs w:val="24"/>
+              </w:rPr>
+              <w:t xml:space="preserve">                                                                                      </w:t>
+            </w:r>
+            <w:r>
+              <w:rPr>
+                <w:rFonts w:ascii="Times New Roman" w:hAnsi="Times New Roman" w:cs="Times New Roman"/>
+                <w:sz w:val="24"/>
+                <w:szCs w:val="24"/>
+              </w:rPr>
               <w:t xml:space="preserve">   </w:t>
             </w:r>
           </w:p>
@@ -6104,7 +6263,227 @@
             <w:pPr>
               <w:pStyle w:val="BodyText"/>
               <w:ind w:left="0" w:firstLine="0"/>
+              <w:rPr>
+                <w:rFonts w:ascii="Times New Roman" w:hAnsi="Times New Roman" w:cs="Times New Roman"/>
+                <w:w w:val="95"/>
+                <w:sz w:val="24"/>
+                <w:szCs w:val="24"/>
+              </w:rPr>
+            </w:pPr>
+          </w:p>
+          <w:p>
+            <w:pPr>
+              <w:pStyle w:val="BodyText"/>
+              <w:ind w:left="0" w:firstLine="0"/>
               <w:jc w:val="right"/>
+              <w:rPr>
+                <w:rFonts w:ascii="Times New Roman" w:hAnsi="Times New Roman" w:cs="Times New Roman"/>
+                <w:spacing w:val="-2"/>
+                <w:w w:val="95"/>
+                <w:sz w:val="24"/>
+                <w:szCs w:val="24"/>
+              </w:rPr>
+            </w:pPr>
+            <w:r>
+              <w:rPr>
+                <w:rFonts w:ascii="Times New Roman" w:hAnsi="Times New Roman" w:cs="Times New Roman"/>
+                <w:w w:val="95"/>
+                <w:sz w:val="24"/>
+                <w:szCs w:val="24"/>
+              </w:rPr>
+              <w:t>05/2026 – 07/2026</w:t>
+            </w:r>
+          </w:p>
+          <w:p>
+            <w:pPr>
+              <w:pStyle w:val="BodyText"/>
+              <w:ind w:left="0" w:firstLine="0"/>
+              <w:jc w:val="right"/>
+              <w:rPr>
+                <w:rFonts w:ascii="Times New Roman" w:hAnsi="Times New Roman" w:cs="Times New Roman"/>
+                <w:spacing w:val="-2"/>
+                <w:w w:val="95"/>
+                <w:sz w:val="24"/>
+                <w:szCs w:val="24"/>
+              </w:rPr>
+            </w:pPr>
+          </w:p>
+          <w:p>
+            <w:pPr>
+              <w:pStyle w:val="BodyText"/>
+              <w:ind w:left="0" w:firstLine="0"/>
+              <w:jc w:val="right"/>
+              <w:rPr>
+                <w:rFonts w:ascii="Times New Roman" w:hAnsi="Times New Roman" w:cs="Times New Roman"/>
+                <w:spacing w:val="-2"/>
+                <w:w w:val="95"/>
+                <w:sz w:val="24"/>
+                <w:szCs w:val="24"/>
+              </w:rPr>
+            </w:pPr>
+          </w:p>
+          <w:p>
+            <w:pPr>
+              <w:pStyle w:val="BodyText"/>
+              <w:ind w:left="0" w:firstLine="0"/>
+              <w:jc w:val="right"/>
+              <w:rPr>
+                <w:rFonts w:ascii="Times New Roman" w:hAnsi="Times New Roman" w:cs="Times New Roman"/>
+                <w:spacing w:val="-2"/>
+                <w:w w:val="95"/>
+                <w:sz w:val="24"/>
+                <w:szCs w:val="24"/>
+              </w:rPr>
+            </w:pPr>
+          </w:p>
+          <w:p>
+            <w:pPr>
+              <w:pStyle w:val="BodyText"/>
+              <w:ind w:left="0" w:firstLine="0"/>
+              <w:rPr>
+                <w:rFonts w:ascii="Times New Roman" w:hAnsi="Times New Roman" w:cs="Times New Roman"/>
+                <w:w w:val="95"/>
+                <w:sz w:val="24"/>
+                <w:szCs w:val="24"/>
+              </w:rPr>
+            </w:pPr>
+          </w:p>
+          <w:p>
+            <w:pPr>
+              <w:pStyle w:val="BodyText"/>
+              <w:ind w:left="0" w:firstLine="0"/>
+              <w:rPr>
+                <w:rFonts w:ascii="Times New Roman" w:hAnsi="Times New Roman" w:cs="Times New Roman"/>
+                <w:w w:val="95"/>
+                <w:sz w:val="24"/>
+                <w:szCs w:val="24"/>
+              </w:rPr>
+            </w:pPr>
+          </w:p>
+          <w:p>
+            <w:pPr>
+              <w:pStyle w:val="BodyText"/>
+              <w:ind w:left="0" w:firstLine="0"/>
+              <w:rPr>
+                <w:rFonts w:ascii="Times New Roman" w:hAnsi="Times New Roman" w:cs="Times New Roman"/>
+                <w:w w:val="95"/>
+                <w:sz w:val="24"/>
+                <w:szCs w:val="24"/>
+              </w:rPr>
+            </w:pPr>
+          </w:p>
+          <w:p>
+            <w:pPr>
+              <w:pStyle w:val="BodyText"/>
+              <w:ind w:left="0" w:firstLine="0"/>
+              <w:rPr>
+                <w:rFonts w:ascii="Times New Roman" w:hAnsi="Times New Roman" w:cs="Times New Roman"/>
+                <w:w w:val="95"/>
+                <w:sz w:val="24"/>
+                <w:szCs w:val="24"/>
+              </w:rPr>
+            </w:pPr>
+          </w:p>
+          <w:p>
+            <w:pPr>
+              <w:pStyle w:val="BodyText"/>
+              <w:ind w:left="0" w:firstLine="0"/>
+              <w:rPr>
+                <w:rFonts w:ascii="Times New Roman" w:hAnsi="Times New Roman" w:cs="Times New Roman"/>
+                <w:w w:val="95"/>
+                <w:sz w:val="24"/>
+                <w:szCs w:val="24"/>
+              </w:rPr>
+            </w:pPr>
+          </w:p>
+          <w:p>
+            <w:pPr>
+              <w:pStyle w:val="BodyText"/>
+              <w:ind w:left="0" w:firstLine="0"/>
+              <w:rPr>
+                <w:rFonts w:ascii="Times New Roman" w:hAnsi="Times New Roman" w:cs="Times New Roman"/>
+                <w:w w:val="95"/>
+                <w:sz w:val="24"/>
+                <w:szCs w:val="24"/>
+              </w:rPr>
+            </w:pPr>
+          </w:p>
+          <w:p>
+            <w:pPr>
+              <w:pStyle w:val="BodyText"/>
+              <w:ind w:left="0" w:firstLine="0"/>
+              <w:rPr>
+                <w:rFonts w:ascii="Times New Roman" w:hAnsi="Times New Roman" w:cs="Times New Roman"/>
+                <w:w w:val="95"/>
+                <w:sz w:val="24"/>
+                <w:szCs w:val="24"/>
+              </w:rPr>
+            </w:pPr>
+          </w:p>
+          <w:p>
+            <w:pPr>
+              <w:pStyle w:val="BodyText"/>
+              <w:ind w:left="0" w:firstLine="0"/>
+              <w:rPr>
+                <w:rFonts w:ascii="Times New Roman" w:hAnsi="Times New Roman" w:cs="Times New Roman"/>
+                <w:w w:val="95"/>
+                <w:sz w:val="24"/>
+                <w:szCs w:val="24"/>
+              </w:rPr>
+            </w:pPr>
+          </w:p>
+          <w:p>
+            <w:pPr>
+              <w:pStyle w:val="BodyText"/>
+              <w:ind w:left="0" w:firstLine="0"/>
+              <w:rPr>
+                <w:rFonts w:ascii="Times New Roman" w:hAnsi="Times New Roman" w:cs="Times New Roman"/>
+                <w:w w:val="95"/>
+                <w:sz w:val="24"/>
+                <w:szCs w:val="24"/>
+              </w:rPr>
+            </w:pPr>
+          </w:p>
+          <w:p>
+            <w:pPr>
+              <w:pStyle w:val="BodyText"/>
+              <w:ind w:left="0" w:firstLine="0"/>
+              <w:rPr>
+                <w:rFonts w:ascii="Times New Roman" w:hAnsi="Times New Roman" w:cs="Times New Roman"/>
+                <w:w w:val="95"/>
+                <w:sz w:val="24"/>
+                <w:szCs w:val="24"/>
+              </w:rPr>
+            </w:pPr>
+          </w:p>
+          <w:p>
+            <w:pPr>
+              <w:pStyle w:val="BodyText"/>
+              <w:ind w:left="0" w:firstLine="0"/>
+              <w:rPr>
+                <w:rFonts w:ascii="Times New Roman" w:hAnsi="Times New Roman" w:cs="Times New Roman"/>
+                <w:w w:val="95"/>
+                <w:sz w:val="24"/>
+                <w:szCs w:val="24"/>
+              </w:rPr>
+            </w:pPr>
+          </w:p>
+          <w:p>
+            <w:pPr>
+              <w:pStyle w:val="BodyText"/>
+              <w:ind w:left="0" w:firstLine="0"/>
+              <w:rPr>
+                <w:rFonts w:ascii="Times New Roman" w:hAnsi="Times New Roman" w:cs="Times New Roman"/>
+                <w:w w:val="95"/>
+                <w:sz w:val="24"/>
+                <w:szCs w:val="24"/>
+              </w:rPr>
+            </w:pPr>
+          </w:p>
+          <w:p>
+            <w:pPr>
+              <w:pStyle w:val="BodyText"/>
+              <w:ind w:left="0" w:firstLine="0"/>
               <w:rPr>
                 <w:rFonts w:ascii="Times New Roman" w:hAnsi="Times New Roman" w:cs="Times New Roman"/>
                 <w:b/>
@@ -6163,6 +6542,51 @@
               </w:rPr>
               <w:t>05/2025</w:t>
             </w:r>
+          </w:p>
+        </w:tc>
+      </w:tr>
+      <w:tr>
+        <w:trPr>
+          <w:trHeight w:val="3591"/>
+        </w:trPr>
+        <w:tc>
+          <w:tcPr>
+            <w:tcW w:w="9018" w:type="dxa"/>
+          </w:tcPr>
+          <w:p>
+            <w:pPr>
+              <w:tabs>
+                <w:tab w:val="left" w:pos="8913"/>
+              </w:tabs>
+              <w:spacing w:line="298" w:lineRule="exact"/>
+              <w:ind w:left="90"/>
+              <w:rPr>
+                <w:rFonts w:ascii="Times New Roman" w:hAnsi="Times New Roman" w:cs="Times New Roman"/>
+                <w:b/>
+                <w:bCs/>
+                <w:w w:val="90"/>
+                <w:sz w:val="24"/>
+                <w:szCs w:val="24"/>
+              </w:rPr>
+            </w:pPr>
+          </w:p>
+        </w:tc>
+        <w:tc>
+          <w:tcPr>
+            <w:tcW w:w="2070" w:type="dxa"/>
+          </w:tcPr>
+          <w:p>
+            <w:pPr>
+              <w:pStyle w:val="BodyText"/>
+              <w:ind w:left="0" w:firstLine="0"/>
+              <w:jc w:val="right"/>
+              <w:rPr>
+                <w:rFonts w:ascii="Times New Roman" w:hAnsi="Times New Roman" w:cs="Times New Roman"/>
+                <w:w w:val="95"/>
+                <w:sz w:val="24"/>
+                <w:szCs w:val="24"/>
+              </w:rPr>
+            </w:pPr>
           </w:p>
         </w:tc>
       </w:tr>
@@ -9956,7 +10380,7 @@
           <w:szCs w:val="24"/>
           <w:shd w:val="clear" w:color="auto" w:fill="FFFFFF"/>
         </w:rPr>
-        <w:t>[1</w:t>
+        <w:t>[</w:t>
       </w:r>
       <w:r>
         <w:rPr>
@@ -9965,7 +10389,16 @@
           <w:szCs w:val="24"/>
           <w:shd w:val="clear" w:color="auto" w:fill="FFFFFF"/>
         </w:rPr>
-        <w:t>7</w:t>
+        <w:t>1</w:t>
+      </w:r>
+      <w:r>
+        <w:rPr>
+          <w:rFonts w:ascii="Times New Roman" w:eastAsia="Calibri" w:hAnsi="Times New Roman" w:cs="Times New Roman"/>
+          <w:sz w:val="24"/>
+          <w:szCs w:val="24"/>
+          <w:shd w:val="clear" w:color="auto" w:fill="FFFFFF"/>
+        </w:rPr>
+        <w:t>9</w:t>
       </w:r>
       <w:r>
         <w:rPr>
@@ -9994,25 +10427,7 @@
           <w:szCs w:val="24"/>
           <w:shd w:val="clear" w:color="auto" w:fill="FFFFFF"/>
         </w:rPr>
-        <w:t xml:space="preserve"> Moon, J., Abu, S., &amp; Siyuan, S. (Under review). </w:t>
-      </w:r>
-      <w:r>
-        <w:rPr>
-          <w:rFonts w:ascii="Times New Roman" w:eastAsia="Times New Roman" w:hAnsi="Times New Roman" w:cs="Times New Roman"/>
-          <w:sz w:val="24"/>
-          <w:szCs w:val="24"/>
-          <w:shd w:val="clear" w:color="auto" w:fill="FFFFFF"/>
-        </w:rPr>
-        <w:t>F</w:t>
-      </w:r>
-      <w:r>
-        <w:rPr>
-          <w:rFonts w:ascii="Times New Roman" w:eastAsia="Times New Roman" w:hAnsi="Times New Roman" w:cs="Times New Roman"/>
-          <w:sz w:val="24"/>
-          <w:szCs w:val="24"/>
-          <w:shd w:val="clear" w:color="auto" w:fill="FFFFFF"/>
-        </w:rPr>
-        <w:t>rom experience to action: sequential dynamics of experiential learning in</w:t>
+        <w:t xml:space="preserve"> Moon, J.,</w:t>
       </w:r>
       <w:r>
         <w:rPr>
@@ -10030,7 +10445,63 @@
           <w:szCs w:val="24"/>
           <w:shd w:val="clear" w:color="auto" w:fill="FFFFFF"/>
         </w:rPr>
-        <w:t>immersive virtual reality-supported safety training</w:t>
+        <w:t>Aldemir</w:t>
+      </w:r>
+      <w:r>
+        <w:rPr>
+          <w:rFonts w:ascii="Times New Roman" w:eastAsia="Times New Roman" w:hAnsi="Times New Roman" w:cs="Times New Roman"/>
+          <w:sz w:val="24"/>
+          <w:szCs w:val="24"/>
+          <w:shd w:val="clear" w:color="auto" w:fill="FFFFFF"/>
+        </w:rPr>
+        <w:t>, T.</w:t>
+      </w:r>
+      <w:r>
+        <w:rPr>
+          <w:rFonts w:ascii="Times New Roman" w:eastAsia="Times New Roman" w:hAnsi="Times New Roman" w:cs="Times New Roman"/>
+          <w:sz w:val="24"/>
+          <w:szCs w:val="24"/>
+          <w:shd w:val="clear" w:color="auto" w:fill="FFFFFF"/>
+        </w:rPr>
+        <w:t xml:space="preserve">, </w:t>
+      </w:r>
+      <w:proofErr w:type="spellStart"/>
+      <w:r>
+        <w:rPr>
+          <w:rFonts w:ascii="Times New Roman" w:eastAsia="Times New Roman" w:hAnsi="Times New Roman" w:cs="Times New Roman"/>
+          <w:sz w:val="24"/>
+          <w:szCs w:val="24"/>
+          <w:shd w:val="clear" w:color="auto" w:fill="FFFFFF"/>
+        </w:rPr>
+        <w:t>Ghooreian</w:t>
+      </w:r>
+      <w:proofErr w:type="spellEnd"/>
+      <w:r>
+        <w:rPr>
+          <w:rFonts w:ascii="Times New Roman" w:eastAsia="Times New Roman" w:hAnsi="Times New Roman" w:cs="Times New Roman"/>
+          <w:sz w:val="24"/>
+          <w:szCs w:val="24"/>
+          <w:shd w:val="clear" w:color="auto" w:fill="FFFFFF"/>
+        </w:rPr>
+        <w:t>, A.</w:t>
+      </w:r>
+      <w:r>
+        <w:rPr>
+          <w:rFonts w:ascii="Times New Roman" w:eastAsia="Times New Roman" w:hAnsi="Times New Roman" w:cs="Times New Roman"/>
+          <w:sz w:val="24"/>
+          <w:szCs w:val="24"/>
+          <w:shd w:val="clear" w:color="auto" w:fill="FFFFFF"/>
+        </w:rPr>
+        <w:t xml:space="preserve">, </w:t>
+      </w:r>
+      <w:r>
+        <w:rPr>
+          <w:rFonts w:ascii="Times New Roman" w:eastAsia="Times New Roman" w:hAnsi="Times New Roman" w:cs="Times New Roman"/>
+          <w:sz w:val="24"/>
+          <w:szCs w:val="24"/>
+          <w:shd w:val="clear" w:color="auto" w:fill="FFFFFF"/>
+        </w:rPr>
+        <w:t>&amp;</w:t>
       </w:r>
       <w:r>
         <w:rPr>
@@ -10041,23 +10512,61 @@
         </w:rPr>
         <w:t xml:space="preserve"> </w:t>
       </w:r>
-      <w:r>
-        <w:rPr>
-          <w:rFonts w:ascii="Times New Roman" w:eastAsia="Times New Roman" w:hAnsi="Times New Roman" w:cs="Times New Roman"/>
-          <w:sz w:val="24"/>
-          <w:szCs w:val="24"/>
-          <w:shd w:val="clear" w:color="auto" w:fill="FFFFFF"/>
-        </w:rPr>
-        <w:t xml:space="preserve">(Manuscript Number: </w:t>
-      </w:r>
-      <w:r>
-        <w:rPr>
-          <w:rFonts w:ascii="Times New Roman" w:eastAsia="Times New Roman" w:hAnsi="Times New Roman" w:cs="Times New Roman"/>
-          <w:sz w:val="24"/>
-          <w:szCs w:val="24"/>
-          <w:shd w:val="clear" w:color="auto" w:fill="FFFFFF"/>
-        </w:rPr>
-        <w:t>264134817</w:t>
+      <w:proofErr w:type="spellStart"/>
+      <w:r>
+        <w:rPr>
+          <w:rFonts w:ascii="Times New Roman" w:eastAsia="Times New Roman" w:hAnsi="Times New Roman" w:cs="Times New Roman"/>
+          <w:sz w:val="24"/>
+          <w:szCs w:val="24"/>
+          <w:shd w:val="clear" w:color="auto" w:fill="FFFFFF"/>
+        </w:rPr>
+        <w:t>Sabanwar</w:t>
+      </w:r>
+      <w:proofErr w:type="spellEnd"/>
+      <w:r>
+        <w:rPr>
+          <w:rFonts w:ascii="Times New Roman" w:eastAsia="Times New Roman" w:hAnsi="Times New Roman" w:cs="Times New Roman"/>
+          <w:sz w:val="24"/>
+          <w:szCs w:val="24"/>
+          <w:shd w:val="clear" w:color="auto" w:fill="FFFFFF"/>
+        </w:rPr>
+        <w:t xml:space="preserve">, V. </w:t>
+      </w:r>
+      <w:r>
+        <w:rPr>
+          <w:rFonts w:ascii="Times New Roman" w:eastAsia="Times New Roman" w:hAnsi="Times New Roman" w:cs="Times New Roman"/>
+          <w:sz w:val="24"/>
+          <w:szCs w:val="24"/>
+          <w:shd w:val="clear" w:color="auto" w:fill="FFFFFF"/>
+        </w:rPr>
+        <w:t xml:space="preserve">(Under review). </w:t>
+      </w:r>
+      <w:r>
+        <w:rPr>
+          <w:rFonts w:ascii="Times New Roman" w:eastAsia="Times New Roman" w:hAnsi="Times New Roman" w:cs="Times New Roman"/>
+          <w:sz w:val="24"/>
+          <w:szCs w:val="24"/>
+          <w:shd w:val="clear" w:color="auto" w:fill="FFFFFF"/>
+        </w:rPr>
+        <w:t>A Systematic Review of Empirical Research on AI in K-12 STEM Education (2020-2025) through a Sociotechnical Lens</w:t>
+      </w:r>
+      <w:r>
+        <w:rPr>
+          <w:rFonts w:ascii="Times New Roman" w:eastAsia="Times New Roman" w:hAnsi="Times New Roman" w:cs="Times New Roman"/>
+          <w:sz w:val="24"/>
+          <w:szCs w:val="24"/>
+          <w:shd w:val="clear" w:color="auto" w:fill="FFFFFF"/>
+        </w:rPr>
+        <w:t xml:space="preserve"> (Manuscript Number: </w:t>
+      </w:r>
+      <w:r>
+        <w:rPr>
+          <w:rFonts w:ascii="Times New Roman" w:eastAsia="Times New Roman" w:hAnsi="Times New Roman" w:cs="Times New Roman"/>
+          <w:sz w:val="24"/>
+          <w:szCs w:val="24"/>
+          <w:shd w:val="clear" w:color="auto" w:fill="FFFFFF"/>
+        </w:rPr>
+        <w:t>ETRD-D-26-01416</w:t>
       </w:r>
       <w:r>
         <w:rPr>
@@ -10077,12 +10586,21 @@
         <w:autoSpaceDN/>
         <w:ind w:left="720" w:hanging="630"/>
         <w:rPr>
+          <w:rFonts w:ascii="Times New Roman" w:eastAsia="Times New Roman" w:hAnsi="Times New Roman" w:cs="Times New Roman"/>
+          <w:sz w:val="24"/>
+          <w:szCs w:val="24"/>
+          <w:shd w:val="clear" w:color="auto" w:fill="FFFFFF"/>
+        </w:rPr>
+      </w:pPr>
+      <w:r>
+        <w:rPr>
           <w:rFonts w:ascii="Times New Roman" w:eastAsia="Calibri" w:hAnsi="Times New Roman" w:cs="Times New Roman"/>
           <w:sz w:val="24"/>
           <w:szCs w:val="24"/>
           <w:shd w:val="clear" w:color="auto" w:fill="FFFFFF"/>
         </w:rPr>
-      </w:pPr>
+        <w:t>[1</w:t>
+      </w:r>
       <w:r>
         <w:rPr>
           <w:rFonts w:ascii="Times New Roman" w:eastAsia="Calibri" w:hAnsi="Times New Roman" w:cs="Times New Roman"/>
@@ -10090,7 +10608,7 @@
           <w:szCs w:val="24"/>
           <w:shd w:val="clear" w:color="auto" w:fill="FFFFFF"/>
         </w:rPr>
-        <w:t>[1</w:t>
+        <w:t>8</w:t>
       </w:r>
       <w:r>
         <w:rPr>
@@ -10099,25 +10617,7 @@
           <w:szCs w:val="24"/>
           <w:shd w:val="clear" w:color="auto" w:fill="FFFFFF"/>
         </w:rPr>
-        <w:t>6</w:t>
-      </w:r>
-      <w:r>
-        <w:rPr>
-          <w:rFonts w:ascii="Times New Roman" w:eastAsia="Calibri" w:hAnsi="Times New Roman" w:cs="Times New Roman"/>
-          <w:sz w:val="24"/>
-          <w:szCs w:val="24"/>
-          <w:shd w:val="clear" w:color="auto" w:fill="FFFFFF"/>
-        </w:rPr>
         <w:t xml:space="preserve">] </w:t>
-      </w:r>
-      <w:r>
-        <w:rPr>
-          <w:rFonts w:ascii="Times New Roman" w:eastAsia="Times New Roman" w:hAnsi="Times New Roman" w:cs="Times New Roman"/>
-          <w:sz w:val="24"/>
-          <w:szCs w:val="24"/>
-          <w:shd w:val="clear" w:color="auto" w:fill="FFFFFF"/>
-        </w:rPr>
-        <w:t xml:space="preserve">F Luo, J Amayou, F Nasrin, P Abedini, V Mousavi, </w:t>
       </w:r>
       <w:r>
         <w:rPr>
@@ -10128,6 +10628,229 @@
           <w:szCs w:val="24"/>
           <w:shd w:val="clear" w:color="auto" w:fill="FFFFFF"/>
         </w:rPr>
+        <w:t>Awoyemi, I. D.,</w:t>
+      </w:r>
+      <w:r>
+        <w:rPr>
+          <w:rFonts w:ascii="Times New Roman" w:eastAsia="Times New Roman" w:hAnsi="Times New Roman" w:cs="Times New Roman"/>
+          <w:sz w:val="24"/>
+          <w:szCs w:val="24"/>
+          <w:shd w:val="clear" w:color="auto" w:fill="FFFFFF"/>
+        </w:rPr>
+        <w:t xml:space="preserve"> Moon, J., Abu, S., &amp; Siyuan, S. (</w:t>
+      </w:r>
+      <w:r>
+        <w:rPr>
+          <w:rFonts w:ascii="Times New Roman" w:eastAsia="Times New Roman" w:hAnsi="Times New Roman" w:cs="Times New Roman"/>
+          <w:sz w:val="24"/>
+          <w:szCs w:val="24"/>
+          <w:shd w:val="clear" w:color="auto" w:fill="FFFFFF"/>
+        </w:rPr>
+        <w:t>Revi</w:t>
+      </w:r>
+      <w:r>
+        <w:rPr>
+          <w:rFonts w:ascii="Times New Roman" w:eastAsia="Times New Roman" w:hAnsi="Times New Roman" w:cs="Times New Roman"/>
+          <w:sz w:val="24"/>
+          <w:szCs w:val="24"/>
+          <w:shd w:val="clear" w:color="auto" w:fill="FFFFFF"/>
+        </w:rPr>
+        <w:t>sion</w:t>
+      </w:r>
+      <w:r>
+        <w:rPr>
+          <w:rFonts w:ascii="Times New Roman" w:eastAsia="Times New Roman" w:hAnsi="Times New Roman" w:cs="Times New Roman"/>
+          <w:sz w:val="24"/>
+          <w:szCs w:val="24"/>
+          <w:shd w:val="clear" w:color="auto" w:fill="FFFFFF"/>
+        </w:rPr>
+        <w:t xml:space="preserve">). </w:t>
+      </w:r>
+      <w:r>
+        <w:rPr>
+          <w:rFonts w:ascii="Times New Roman" w:eastAsia="Times New Roman" w:hAnsi="Times New Roman" w:cs="Times New Roman"/>
+          <w:sz w:val="24"/>
+          <w:szCs w:val="24"/>
+          <w:shd w:val="clear" w:color="auto" w:fill="FFFFFF"/>
+        </w:rPr>
+        <w:t>F</w:t>
+      </w:r>
+      <w:r>
+        <w:rPr>
+          <w:rFonts w:ascii="Times New Roman" w:eastAsia="Times New Roman" w:hAnsi="Times New Roman" w:cs="Times New Roman"/>
+          <w:sz w:val="24"/>
+          <w:szCs w:val="24"/>
+          <w:shd w:val="clear" w:color="auto" w:fill="FFFFFF"/>
+        </w:rPr>
+        <w:t>rom experience to action: sequential dynamics of experiential learning in</w:t>
+      </w:r>
+      <w:r>
+        <w:rPr>
+          <w:rFonts w:ascii="Times New Roman" w:eastAsia="Times New Roman" w:hAnsi="Times New Roman" w:cs="Times New Roman"/>
+          <w:sz w:val="24"/>
+          <w:szCs w:val="24"/>
+          <w:shd w:val="clear" w:color="auto" w:fill="FFFFFF"/>
+        </w:rPr>
+        <w:t xml:space="preserve"> </w:t>
+      </w:r>
+      <w:r>
+        <w:rPr>
+          <w:rFonts w:ascii="Times New Roman" w:eastAsia="Times New Roman" w:hAnsi="Times New Roman" w:cs="Times New Roman"/>
+          <w:sz w:val="24"/>
+          <w:szCs w:val="24"/>
+          <w:shd w:val="clear" w:color="auto" w:fill="FFFFFF"/>
+        </w:rPr>
+        <w:t>immersive virtual reality-supported safety training</w:t>
+      </w:r>
+      <w:r>
+        <w:rPr>
+          <w:rFonts w:ascii="Times New Roman" w:eastAsia="Times New Roman" w:hAnsi="Times New Roman" w:cs="Times New Roman"/>
+          <w:sz w:val="24"/>
+          <w:szCs w:val="24"/>
+          <w:shd w:val="clear" w:color="auto" w:fill="FFFFFF"/>
+        </w:rPr>
+        <w:t xml:space="preserve"> </w:t>
+      </w:r>
+      <w:r>
+        <w:rPr>
+          <w:rFonts w:ascii="Times New Roman" w:eastAsia="Times New Roman" w:hAnsi="Times New Roman" w:cs="Times New Roman"/>
+          <w:sz w:val="24"/>
+          <w:szCs w:val="24"/>
+          <w:shd w:val="clear" w:color="auto" w:fill="FFFFFF"/>
+        </w:rPr>
+        <w:t xml:space="preserve">(Manuscript Number: </w:t>
+      </w:r>
+      <w:r>
+        <w:rPr>
+          <w:rFonts w:ascii="Times New Roman" w:eastAsia="Times New Roman" w:hAnsi="Times New Roman" w:cs="Times New Roman"/>
+          <w:sz w:val="24"/>
+          <w:szCs w:val="24"/>
+          <w:shd w:val="clear" w:color="auto" w:fill="FFFFFF"/>
+        </w:rPr>
+        <w:t>264134817</w:t>
+      </w:r>
+      <w:r>
+        <w:rPr>
+          <w:rFonts w:ascii="Times New Roman" w:eastAsia="Times New Roman" w:hAnsi="Times New Roman" w:cs="Times New Roman"/>
+          <w:sz w:val="24"/>
+          <w:szCs w:val="24"/>
+          <w:shd w:val="clear" w:color="auto" w:fill="FFFFFF"/>
+        </w:rPr>
+        <w:t>)</w:t>
+      </w:r>
+    </w:p>
+    <w:p>
+      <w:pPr>
+        <w:widowControl/>
+        <w:shd w:val="clear" w:color="auto" w:fill="FFFFFF"/>
+        <w:autoSpaceDE/>
+        <w:autoSpaceDN/>
+        <w:ind w:left="720" w:hanging="630"/>
+        <w:rPr>
+          <w:rFonts w:ascii="Times New Roman" w:eastAsia="Times New Roman" w:hAnsi="Times New Roman" w:cs="Times New Roman"/>
+          <w:sz w:val="24"/>
+          <w:szCs w:val="24"/>
+          <w:shd w:val="clear" w:color="auto" w:fill="FFFFFF"/>
+        </w:rPr>
+      </w:pPr>
+      <w:r>
+        <w:rPr>
+          <w:rFonts w:ascii="Times New Roman" w:eastAsia="Times New Roman" w:hAnsi="Times New Roman" w:cs="Times New Roman"/>
+          <w:sz w:val="24"/>
+          <w:szCs w:val="24"/>
+          <w:shd w:val="clear" w:color="auto" w:fill="FFFFFF"/>
+        </w:rPr>
+        <w:t xml:space="preserve">[17] </w:t>
+      </w:r>
+      <w:r>
+        <w:rPr>
+          <w:rFonts w:ascii="Times New Roman" w:eastAsia="Times New Roman" w:hAnsi="Times New Roman" w:cs="Times New Roman"/>
+          <w:sz w:val="24"/>
+          <w:szCs w:val="24"/>
+          <w:shd w:val="clear" w:color="auto" w:fill="FFFFFF"/>
+        </w:rPr>
+        <w:t xml:space="preserve">McNeill, L., Uddin, M. M., Abu, S., Pei, M., </w:t>
+      </w:r>
+      <w:r>
+        <w:rPr>
+          <w:rFonts w:ascii="Times New Roman" w:eastAsia="Times New Roman" w:hAnsi="Times New Roman" w:cs="Times New Roman"/>
+          <w:b/>
+          <w:bCs/>
+          <w:sz w:val="24"/>
+          <w:szCs w:val="24"/>
+          <w:shd w:val="clear" w:color="auto" w:fill="FFFFFF"/>
+        </w:rPr>
+        <w:t>Awoyemi, I. D</w:t>
+      </w:r>
+      <w:r>
+        <w:rPr>
+          <w:rFonts w:ascii="Times New Roman" w:eastAsia="Times New Roman" w:hAnsi="Times New Roman" w:cs="Times New Roman"/>
+          <w:sz w:val="24"/>
+          <w:szCs w:val="24"/>
+          <w:shd w:val="clear" w:color="auto" w:fill="FFFFFF"/>
+        </w:rPr>
+        <w:t>., &amp; Regalado, L. (2025). Identifying the AI Literacy Gap: A Mixed-Methods Analysis of Industry Needs and Graduate Preparedness. Frontiers in Education. [Accepted]</w:t>
+      </w:r>
+    </w:p>
+    <w:p>
+      <w:pPr>
+        <w:widowControl/>
+        <w:shd w:val="clear" w:color="auto" w:fill="FFFFFF"/>
+        <w:autoSpaceDE/>
+        <w:autoSpaceDN/>
+        <w:ind w:left="720" w:hanging="630"/>
+        <w:rPr>
+          <w:rFonts w:ascii="Times New Roman" w:eastAsia="Calibri" w:hAnsi="Times New Roman" w:cs="Times New Roman"/>
+          <w:sz w:val="24"/>
+          <w:szCs w:val="24"/>
+          <w:shd w:val="clear" w:color="auto" w:fill="FFFFFF"/>
+        </w:rPr>
+      </w:pPr>
+      <w:r>
+        <w:rPr>
+          <w:rFonts w:ascii="Times New Roman" w:eastAsia="Calibri" w:hAnsi="Times New Roman" w:cs="Times New Roman"/>
+          <w:sz w:val="24"/>
+          <w:szCs w:val="24"/>
+          <w:shd w:val="clear" w:color="auto" w:fill="FFFFFF"/>
+        </w:rPr>
+        <w:t>[1</w:t>
+      </w:r>
+      <w:r>
+        <w:rPr>
+          <w:rFonts w:ascii="Times New Roman" w:eastAsia="Calibri" w:hAnsi="Times New Roman" w:cs="Times New Roman"/>
+          <w:sz w:val="24"/>
+          <w:szCs w:val="24"/>
+          <w:shd w:val="clear" w:color="auto" w:fill="FFFFFF"/>
+        </w:rPr>
+        <w:t>6</w:t>
+      </w:r>
+      <w:r>
+        <w:rPr>
+          <w:rFonts w:ascii="Times New Roman" w:eastAsia="Calibri" w:hAnsi="Times New Roman" w:cs="Times New Roman"/>
+          <w:sz w:val="24"/>
+          <w:szCs w:val="24"/>
+          <w:shd w:val="clear" w:color="auto" w:fill="FFFFFF"/>
+        </w:rPr>
+        <w:t xml:space="preserve">] </w:t>
+      </w:r>
+      <w:r>
+        <w:rPr>
+          <w:rFonts w:ascii="Times New Roman" w:eastAsia="Times New Roman" w:hAnsi="Times New Roman" w:cs="Times New Roman"/>
+          <w:sz w:val="24"/>
+          <w:szCs w:val="24"/>
+          <w:shd w:val="clear" w:color="auto" w:fill="FFFFFF"/>
+        </w:rPr>
+        <w:t xml:space="preserve">F Luo, J Amayou, F Nasrin, P Abedini, V Mousavi, </w:t>
+      </w:r>
+      <w:r>
+        <w:rPr>
+          <w:rFonts w:ascii="Times New Roman" w:eastAsia="Times New Roman" w:hAnsi="Times New Roman" w:cs="Times New Roman"/>
+          <w:b/>
+          <w:bCs/>
+          <w:sz w:val="24"/>
+          <w:szCs w:val="24"/>
+          <w:shd w:val="clear" w:color="auto" w:fill="FFFFFF"/>
+        </w:rPr>
         <w:t>ID Awoyemi</w:t>
       </w:r>
       <w:r>
@@ -10137,45 +10860,16 @@
           <w:szCs w:val="24"/>
           <w:shd w:val="clear" w:color="auto" w:fill="FFFFFF"/>
         </w:rPr>
-        <w:t>, A Hutchison, C Cao, C Crawford</w:t>
-      </w:r>
-      <w:r>
-        <w:rPr>
-          <w:rFonts w:ascii="Times New Roman" w:eastAsia="Times New Roman" w:hAnsi="Times New Roman" w:cs="Times New Roman"/>
-          <w:sz w:val="24"/>
-          <w:szCs w:val="24"/>
-          <w:shd w:val="clear" w:color="auto" w:fill="FFFFFF"/>
-        </w:rPr>
-        <w:t xml:space="preserve">. </w:t>
-      </w:r>
-      <w:proofErr w:type="gramStart"/>
-      <w:r>
-        <w:rPr>
-          <w:rFonts w:ascii="Times New Roman" w:eastAsia="Times New Roman" w:hAnsi="Times New Roman" w:cs="Times New Roman"/>
-          <w:sz w:val="24"/>
-          <w:szCs w:val="24"/>
-          <w:shd w:val="clear" w:color="auto" w:fill="FFFFFF"/>
-        </w:rPr>
-        <w:t>(</w:t>
-      </w:r>
-      <w:proofErr w:type="gramEnd"/>
-      <w:r>
-        <w:rPr>
-          <w:rFonts w:ascii="Times New Roman" w:eastAsia="Times New Roman" w:hAnsi="Times New Roman" w:cs="Times New Roman"/>
-          <w:sz w:val="24"/>
-          <w:szCs w:val="24"/>
-          <w:shd w:val="clear" w:color="auto" w:fill="FFFFFF"/>
-        </w:rPr>
-        <w:t>Accepted</w:t>
-      </w:r>
-      <w:r>
-        <w:rPr>
-          <w:rFonts w:ascii="Times New Roman" w:eastAsia="Times New Roman" w:hAnsi="Times New Roman" w:cs="Times New Roman"/>
-          <w:sz w:val="24"/>
-          <w:szCs w:val="24"/>
-          <w:shd w:val="clear" w:color="auto" w:fill="FFFFFF"/>
-        </w:rPr>
-        <w:t xml:space="preserve">). </w:t>
+        <w:t>, A Hutchison, C Cao, C Crawford.</w:t>
+      </w:r>
+      <w:r>
+        <w:rPr>
+          <w:rFonts w:ascii="Times New Roman" w:eastAsia="Times New Roman" w:hAnsi="Times New Roman" w:cs="Times New Roman"/>
+          <w:sz w:val="24"/>
+          <w:szCs w:val="24"/>
+          <w:shd w:val="clear" w:color="auto" w:fill="FFFFFF"/>
+        </w:rPr>
+        <w:t xml:space="preserve"> </w:t>
       </w:r>
       <w:r>
         <w:rPr>
@@ -14496,47 +15190,7 @@
           <w:sz w:val="24"/>
           <w:szCs w:val="24"/>
         </w:rPr>
-        <w:t>Lesley</w:t>
-      </w:r>
-      <w:r>
-        <w:rPr>
-          <w:rFonts w:ascii="Times New Roman" w:eastAsia="Calibri" w:hAnsi="Times New Roman" w:cs="Times New Roman"/>
-          <w:sz w:val="24"/>
-          <w:szCs w:val="24"/>
-        </w:rPr>
-        <w:t xml:space="preserve"> Regalado</w:t>
-      </w:r>
-      <w:r>
-        <w:rPr>
-          <w:rFonts w:ascii="Times New Roman" w:eastAsia="Calibri" w:hAnsi="Times New Roman" w:cs="Times New Roman"/>
-          <w:sz w:val="24"/>
-          <w:szCs w:val="24"/>
-        </w:rPr>
-        <w:t>, Mohi</w:t>
-      </w:r>
-      <w:r>
-        <w:rPr>
-          <w:rFonts w:ascii="Times New Roman" w:eastAsia="Calibri" w:hAnsi="Times New Roman" w:cs="Times New Roman"/>
-          <w:sz w:val="24"/>
-          <w:szCs w:val="24"/>
-        </w:rPr>
-        <w:t xml:space="preserve"> Uddin</w:t>
-      </w:r>
-      <w:r>
-        <w:rPr>
-          <w:rFonts w:ascii="Times New Roman" w:eastAsia="Calibri" w:hAnsi="Times New Roman" w:cs="Times New Roman"/>
-          <w:sz w:val="24"/>
-          <w:szCs w:val="24"/>
-        </w:rPr>
-        <w:t xml:space="preserve">, </w:t>
-      </w:r>
-      <w:r>
-        <w:rPr>
-          <w:rFonts w:ascii="Times New Roman" w:eastAsia="Calibri" w:hAnsi="Times New Roman" w:cs="Times New Roman"/>
-          <w:sz w:val="24"/>
-          <w:szCs w:val="24"/>
-        </w:rPr>
-        <w:t xml:space="preserve">&amp; </w:t>
+        <w:t xml:space="preserve">Regalado, L., Uddin, M. M., &amp; </w:t>
       </w:r>
       <w:r>
         <w:rPr>
@@ -14546,7 +15200,7 @@
           <w:sz w:val="24"/>
           <w:szCs w:val="24"/>
         </w:rPr>
-        <w:t>Awoyemi I. D</w:t>
+        <w:t>Awoyemi, I. D</w:t>
       </w:r>
       <w:r>
         <w:rPr>
@@ -14554,143 +15208,7 @@
           <w:sz w:val="24"/>
           <w:szCs w:val="24"/>
         </w:rPr>
-        <w:t>.</w:t>
-      </w:r>
-      <w:r>
-        <w:rPr>
-          <w:rFonts w:ascii="Times New Roman" w:eastAsia="Calibri" w:hAnsi="Times New Roman" w:cs="Times New Roman"/>
-          <w:sz w:val="24"/>
-          <w:szCs w:val="24"/>
-        </w:rPr>
-        <w:t xml:space="preserve"> </w:t>
-      </w:r>
-      <w:r>
-        <w:rPr>
-          <w:rFonts w:ascii="Times New Roman" w:eastAsia="Calibri" w:hAnsi="Times New Roman" w:cs="Times New Roman"/>
-          <w:sz w:val="24"/>
-          <w:szCs w:val="24"/>
-          <w:shd w:val="clear" w:color="auto" w:fill="FFFFFF"/>
-        </w:rPr>
-        <w:t>(</w:t>
-      </w:r>
-      <w:r>
-        <w:rPr>
-          <w:rFonts w:ascii="Times New Roman" w:eastAsia="Calibri" w:hAnsi="Times New Roman" w:cs="Times New Roman"/>
-          <w:sz w:val="24"/>
-          <w:szCs w:val="24"/>
-        </w:rPr>
-        <w:t>ITLC-Lilly</w:t>
-      </w:r>
-      <w:r>
-        <w:rPr>
-          <w:rFonts w:ascii="Times New Roman" w:eastAsia="Calibri" w:hAnsi="Times New Roman" w:cs="Times New Roman"/>
-          <w:sz w:val="24"/>
-          <w:szCs w:val="24"/>
-        </w:rPr>
-        <w:t xml:space="preserve"> </w:t>
-      </w:r>
-      <w:r>
-        <w:rPr>
-          <w:rFonts w:ascii="Times New Roman" w:eastAsia="Calibri" w:hAnsi="Times New Roman" w:cs="Times New Roman"/>
-          <w:sz w:val="24"/>
-          <w:szCs w:val="24"/>
-          <w:shd w:val="clear" w:color="auto" w:fill="FFFFFF"/>
-        </w:rPr>
-        <w:t>Accepted</w:t>
-      </w:r>
-      <w:r>
-        <w:rPr>
-          <w:rFonts w:ascii="Times New Roman" w:eastAsia="Calibri" w:hAnsi="Times New Roman" w:cs="Times New Roman"/>
-          <w:sz w:val="24"/>
-          <w:szCs w:val="24"/>
-        </w:rPr>
-        <w:t>,</w:t>
-      </w:r>
-      <w:r>
-        <w:rPr>
-          <w:rFonts w:ascii="Times New Roman" w:eastAsia="Calibri" w:hAnsi="Times New Roman" w:cs="Times New Roman"/>
-          <w:sz w:val="24"/>
-          <w:szCs w:val="24"/>
-          <w:shd w:val="clear" w:color="auto" w:fill="FFFFFF"/>
-        </w:rPr>
-        <w:t xml:space="preserve"> </w:t>
-      </w:r>
-      <w:r>
-        <w:rPr>
-          <w:rFonts w:ascii="Times New Roman" w:eastAsia="Calibri" w:hAnsi="Times New Roman" w:cs="Times New Roman"/>
-          <w:sz w:val="24"/>
-          <w:szCs w:val="24"/>
-          <w:shd w:val="clear" w:color="auto" w:fill="FFFFFF"/>
-        </w:rPr>
-        <w:t>May</w:t>
-      </w:r>
-      <w:r>
-        <w:rPr>
-          <w:rFonts w:ascii="Times New Roman" w:eastAsia="Calibri" w:hAnsi="Times New Roman" w:cs="Times New Roman"/>
-          <w:sz w:val="24"/>
-          <w:szCs w:val="24"/>
-          <w:shd w:val="clear" w:color="auto" w:fill="FFFFFF"/>
-        </w:rPr>
-        <w:t xml:space="preserve"> 202</w:t>
-      </w:r>
-      <w:r>
-        <w:rPr>
-          <w:rFonts w:ascii="Times New Roman" w:eastAsia="Calibri" w:hAnsi="Times New Roman" w:cs="Times New Roman"/>
-          <w:sz w:val="24"/>
-          <w:szCs w:val="24"/>
-          <w:shd w:val="clear" w:color="auto" w:fill="FFFFFF"/>
-        </w:rPr>
-        <w:t>6</w:t>
-      </w:r>
-      <w:r>
-        <w:rPr>
-          <w:rFonts w:ascii="Times New Roman" w:eastAsia="Calibri" w:hAnsi="Times New Roman" w:cs="Times New Roman"/>
-          <w:sz w:val="24"/>
-          <w:szCs w:val="24"/>
-          <w:shd w:val="clear" w:color="auto" w:fill="FFFFFF"/>
-        </w:rPr>
-        <w:t>)</w:t>
-      </w:r>
-      <w:r>
-        <w:rPr>
-          <w:rFonts w:ascii="Times New Roman" w:eastAsia="Calibri" w:hAnsi="Times New Roman" w:cs="Times New Roman"/>
-          <w:sz w:val="24"/>
-          <w:szCs w:val="24"/>
-          <w:shd w:val="clear" w:color="auto" w:fill="FFFFFF"/>
-        </w:rPr>
-        <w:t xml:space="preserve">. </w:t>
-      </w:r>
-      <w:r>
-        <w:rPr>
-          <w:rFonts w:ascii="Times New Roman" w:eastAsia="Calibri" w:hAnsi="Times New Roman" w:cs="Times New Roman"/>
-          <w:sz w:val="24"/>
-          <w:szCs w:val="24"/>
-        </w:rPr>
-        <w:t>Teaching Responsible AI Skills for Professional Success</w:t>
-      </w:r>
-      <w:r>
-        <w:rPr>
-          <w:rFonts w:ascii="Times New Roman" w:eastAsia="Calibri" w:hAnsi="Times New Roman" w:cs="Times New Roman"/>
-          <w:sz w:val="24"/>
-          <w:szCs w:val="24"/>
-        </w:rPr>
-        <w:t>.</w:t>
-      </w:r>
-      <w:r>
-        <w:rPr>
-          <w:rFonts w:ascii="Times New Roman" w:eastAsia="Calibri" w:hAnsi="Times New Roman" w:cs="Times New Roman"/>
-          <w:sz w:val="24"/>
-          <w:szCs w:val="24"/>
-        </w:rPr>
-        <w:t xml:space="preserve"> </w:t>
-      </w:r>
-      <w:r>
-        <w:rPr>
-          <w:rFonts w:ascii="Times New Roman" w:eastAsia="Calibri" w:hAnsi="Times New Roman" w:cs="Times New Roman"/>
-          <w:sz w:val="24"/>
-          <w:szCs w:val="24"/>
-        </w:rPr>
-        <w:t xml:space="preserve">AI and the Future of Evidence-Based Teaching in Higher Education in Austin, </w:t>
+        <w:t>. (2026, May 18–20). Teaching Responsible AI Skills for Professional Success. ITLC Lilly Conference, Austin, TX.</w:t>
       </w:r>
     </w:p>
     <w:p>
@@ -36181,7 +36699,6 @@
   <w:style w:type="character" w:default="1" w:styleId="DefaultParagraphFont">
     <w:name w:val="Default Paragraph Font"/>
     <w:uiPriority w:val="1"/>
-    <w:semiHidden/>
     <w:unhideWhenUsed/>
   </w:style>
   <w:style w:type="table" w:default="1" w:styleId="TableNormal">
@@ -36393,6 +36910,17 @@
     <w:rsid w:val="00D06E25"/>
     <w:rPr>
       <w:rFonts w:ascii="Lucida Sans Unicode" w:eastAsia="Lucida Sans Unicode" w:hAnsi="Lucida Sans Unicode" w:cs="Lucida Sans Unicode"/>
+    </w:rPr>
+  </w:style>
+  <w:style w:type="character" w:styleId="Emphasis">
+    <w:name w:val="Emphasis"/>
+    <w:basedOn w:val="DefaultParagraphFont"/>
+    <w:uiPriority w:val="20"/>
+    <w:qFormat/>
+    <w:rsid w:val="008B1324"/>
+    <w:rPr>
+      <w:i/>
+      <w:iCs/>
     </w:rPr>
   </w:style>
 </w:styles>

</xml_diff>

<commit_message>
Respect CV [Not Awarded] marker for Spencer fellowship; fix parser substring bug
Co-Authored-By: Claude Opus 4.8 <noreply@anthropic.com>
</commit_message>
<xml_diff>
--- a/CV_David.docx
+++ b/CV_David.docx
@@ -10406,16 +10406,7 @@
           <w:szCs w:val="24"/>
           <w:shd w:val="clear" w:color="auto" w:fill="FFFFFF"/>
         </w:rPr>
-        <w:t>[</w:t>
-      </w:r>
-      <w:r>
-        <w:rPr>
-          <w:rFonts w:ascii="Times New Roman" w:eastAsia="Calibri" w:hAnsi="Times New Roman" w:cs="Times New Roman"/>
-          <w:sz w:val="24"/>
-          <w:szCs w:val="24"/>
-          <w:shd w:val="clear" w:color="auto" w:fill="FFFFFF"/>
-        </w:rPr>
-        <w:t>2</w:t>
+        <w:t>[2</w:t>
       </w:r>
       <w:r>
         <w:rPr>
@@ -15311,7 +15302,15 @@
           <w:sz w:val="24"/>
           <w:szCs w:val="24"/>
         </w:rPr>
-        <w:t xml:space="preserve"> – Applicant, Spencer Foundation, 2025. Proposal submitted for dissertation research on development.</w:t>
+        <w:t>, Spencer Foundation, 2025. Proposal submitted for dissertation research on development</w:t>
+      </w:r>
+      <w:r>
+        <w:rPr>
+          <w:rFonts w:ascii="Times New Roman" w:eastAsia="Times New Roman" w:hAnsi="Times New Roman" w:cs="Times New Roman"/>
+          <w:sz w:val="24"/>
+          <w:szCs w:val="24"/>
+        </w:rPr>
+        <w:t xml:space="preserve"> [Not Awarded]</w:t>
       </w:r>
     </w:p>
     <w:p>

</xml_diff>

<commit_message>
Rebuild publications from updated CV
- 'From experience to action' (immersive VR experiential learning) moves
  from Revision to Accepted.
- Adds 'Human-centered generative AI in education: ethical challenges
  and equity' (2026).
- Bayesian Meta-Analysis now marked Submitted.
- Journal article count settles at 20 after CV renumbering.

Co-Authored-By: Claude Opus 4.8 <noreply@anthropic.com>
</commit_message>
<xml_diff>
--- a/CV_David.docx
+++ b/CV_David.docx
@@ -1,6 +1,6 @@
 
 <file path=word/document.xml><?xml version="1.0" encoding="utf-8"?>
-<w:document xmlns:wpc="http://schemas.microsoft.com/office/word/2010/wordprocessingCanvas" xmlns:cx="http://schemas.microsoft.com/office/drawing/2014/chartex" xmlns:cx1="http://schemas.microsoft.com/office/drawing/2015/9/8/chartex" xmlns:cx2="http://schemas.microsoft.com/office/drawing/2015/10/21/chartex" xmlns:cx3="http://schemas.microsoft.com/office/drawing/2016/5/9/chartex" xmlns:cx4="http://schemas.microsoft.com/office/drawing/2016/5/10/chartex" xmlns:cx5="http://schemas.microsoft.com/office/drawing/2016/5/11/chartex" xmlns:cx6="http://schemas.microsoft.com/office/drawing/2016/5/12/chartex" xmlns:cx7="http://schemas.microsoft.com/office/drawing/2016/5/13/chartex" xmlns:cx8="http://schemas.microsoft.com/office/drawing/2016/5/14/chartex" xmlns:mc="http://schemas.openxmlformats.org/markup-compatibility/2006" xmlns:aink="http://schemas.microsoft.com/office/drawing/2016/ink" xmlns:am3d="http://schemas.microsoft.com/office/drawing/2017/model3d" xmlns:o="urn:schemas-microsoft-com:office:office" xmlns:oel="http://schemas.microsoft.com/office/2019/extlst" xmlns:r="http://schemas.openxmlformats.org/officeDocument/2006/relationships" xmlns:m="http://schemas.openxmlformats.org/officeDocument/2006/math" xmlns:v="urn:schemas-microsoft-com:vml" xmlns:wp14="http://schemas.microsoft.com/office/word/2010/wordprocessingDrawing" xmlns:wp="http://schemas.openxmlformats.org/drawingml/2006/wordprocessingDrawing" xmlns:w10="urn:schemas-microsoft-com:office:word" xmlns:w="http://schemas.openxmlformats.org/wordprocessingml/2006/main" xmlns:w14="http://schemas.microsoft.com/office/word/2010/wordml" xmlns:w15="http://schemas.microsoft.com/office/word/2012/wordml" xmlns:w16cex="http://schemas.microsoft.com/office/word/2018/wordml/cex" xmlns:w16cid="http://schemas.microsoft.com/office/word/2016/wordml/cid" xmlns:w16="http://schemas.microsoft.com/office/word/2018/wordml" xmlns:w16du="http://schemas.microsoft.com/office/word/2023/wordml/word16du" xmlns:w16sdtdh="http://schemas.microsoft.com/office/word/2020/wordml/sdtdatahash" xmlns:w16sdtfl="http://schemas.microsoft.com/office/word/2024/wordml/sdtformatlock" xmlns:w16se="http://schemas.microsoft.com/office/word/2015/wordml/symex" xmlns:wpg="http://schemas.microsoft.com/office/word/2010/wordprocessingGroup" xmlns:wpi="http://schemas.microsoft.com/office/word/2010/wordprocessingInk" xmlns:wne="http://schemas.microsoft.com/office/word/2006/wordml" xmlns:wps="http://schemas.microsoft.com/office/word/2010/wordprocessingShape" mc:Ignorable="w14 w15 w16se w16cid w16 w16cex w16sdtdh w16sdtfl w16du wp14">
+<w:document xmlns:wpc="http://schemas.microsoft.com/office/word/2010/wordprocessingCanvas" xmlns:cx="http://schemas.microsoft.com/office/drawing/2014/chartex" xmlns:cx1="http://schemas.microsoft.com/office/drawing/2015/9/8/chartex" xmlns:cx2="http://schemas.microsoft.com/office/drawing/2015/10/21/chartex" xmlns:cx3="http://schemas.microsoft.com/office/drawing/2016/5/9/chartex" xmlns:cx4="http://schemas.microsoft.com/office/drawing/2016/5/10/chartex" xmlns:cx5="http://schemas.microsoft.com/office/drawing/2016/5/11/chartex" xmlns:cx6="http://schemas.microsoft.com/office/drawing/2016/5/12/chartex" xmlns:cx7="http://schemas.microsoft.com/office/drawing/2016/5/13/chartex" xmlns:cx8="http://schemas.microsoft.com/office/drawing/2016/5/14/chartex" xmlns:mc="http://schemas.openxmlformats.org/markup-compatibility/2006" xmlns:aink="http://schemas.microsoft.com/office/drawing/2016/ink" xmlns:am3d="http://schemas.microsoft.com/office/drawing/2017/model3d" xmlns:o="urn:schemas-microsoft-com:office:office" xmlns:oel="http://schemas.microsoft.com/office/2019/extlst" xmlns:r="http://schemas.openxmlformats.org/officeDocument/2006/relationships" xmlns:m="http://schemas.openxmlformats.org/officeDocument/2006/math" xmlns:v="urn:schemas-microsoft-com:vml" xmlns:wp14="http://schemas.microsoft.com/office/word/2010/wordprocessingDrawing" xmlns:wp="http://schemas.openxmlformats.org/drawingml/2006/wordprocessingDrawing" xmlns:w10="urn:schemas-microsoft-com:office:word" xmlns:w="http://schemas.openxmlformats.org/wordprocessingml/2006/main" xmlns:w14="http://schemas.microsoft.com/office/word/2010/wordml" xmlns:w15="http://schemas.microsoft.com/office/word/2012/wordml" xmlns:w16cei="http://schemas.microsoft.com/office/word/2026/wordml/cei" xmlns:w16cex="http://schemas.microsoft.com/office/word/2018/wordml/cex" xmlns:w16cid="http://schemas.microsoft.com/office/word/2016/wordml/cid" xmlns:w16="http://schemas.microsoft.com/office/word/2018/wordml" xmlns:w16du="http://schemas.microsoft.com/office/word/2023/wordml/word16du" xmlns:w16sdtdh="http://schemas.microsoft.com/office/word/2020/wordml/sdtdatahash" xmlns:w16sdtfl="http://schemas.microsoft.com/office/word/2024/wordml/sdtformatlock" xmlns:w16se="http://schemas.microsoft.com/office/word/2015/wordml/symex" xmlns:wpg="http://schemas.microsoft.com/office/word/2010/wordprocessingGroup" xmlns:wpi="http://schemas.microsoft.com/office/word/2010/wordprocessingInk" xmlns:wne="http://schemas.microsoft.com/office/word/2006/wordml" xmlns:wps="http://schemas.microsoft.com/office/word/2010/wordprocessingShape" mc:Ignorable="w14 w15 w16se w16cid w16 w16cex w16sdtdh w16sdtfl w16du wp14">
   <w:body>
     <w:p>
       <w:pPr>
@@ -123,6 +123,26 @@
           <w:t>idawoyemi@crimson.ua.edu</w:t>
         </w:r>
       </w:hyperlink>
+      <w:r>
+        <w:rPr>
+          <w:rFonts w:ascii="Times New Roman" w:hAnsi="Times New Roman" w:cs="Times New Roman"/>
+        </w:rPr>
+        <w:t>; Personal website:</w:t>
+      </w:r>
+      <w:r>
+        <w:t xml:space="preserve"> </w:t>
+      </w:r>
+      <w:hyperlink r:id="rId9" w:history="1">
+        <w:r>
+          <w:rPr>
+            <w:rStyle w:val="Hyperlink"/>
+          </w:rPr>
+          <w:t>www.davidawoyemi.net</w:t>
+        </w:r>
+      </w:hyperlink>
+      <w:r>
+        <w:t xml:space="preserve"> </w:t>
+      </w:r>
     </w:p>
     <w:p>
       <w:pPr>
@@ -524,6 +544,20 @@
                 <w:szCs w:val="24"/>
               </w:rPr>
             </w:pPr>
+          </w:p>
+          <w:p>
+            <w:pPr>
+              <w:pStyle w:val="BodyText"/>
+              <w:ind w:left="0" w:firstLine="0"/>
+              <w:rPr>
+                <w:rFonts w:ascii="Times New Roman" w:hAnsi="Times New Roman" w:cs="Times New Roman"/>
+                <w:b/>
+                <w:bCs/>
+                <w:w w:val="90"/>
+                <w:sz w:val="24"/>
+                <w:szCs w:val="24"/>
+              </w:rPr>
+            </w:pPr>
             <w:r>
               <w:rPr>
                 <w:rFonts w:ascii="Times New Roman" w:hAnsi="Times New Roman" w:cs="Times New Roman"/>
@@ -597,6 +631,20 @@
                 <w:rFonts w:ascii="Times New Roman" w:hAnsi="Times New Roman" w:cs="Times New Roman"/>
                 <w:b/>
                 <w:bCs/>
+                <w:w w:val="90"/>
+                <w:sz w:val="24"/>
+                <w:szCs w:val="24"/>
+              </w:rPr>
+            </w:pPr>
+          </w:p>
+          <w:p>
+            <w:pPr>
+              <w:pStyle w:val="BodyText"/>
+              <w:ind w:left="0" w:firstLine="0"/>
+              <w:rPr>
+                <w:rFonts w:ascii="Times New Roman" w:hAnsi="Times New Roman" w:cs="Times New Roman"/>
+                <w:b/>
+                <w:bCs/>
                 <w:spacing w:val="-2"/>
                 <w:w w:val="90"/>
                 <w:sz w:val="24"/>
@@ -848,6 +896,19 @@
           <w:tcPr>
             <w:tcW w:w="9115" w:type="dxa"/>
           </w:tcPr>
+          <w:p>
+            <w:pPr>
+              <w:spacing w:line="286" w:lineRule="exact"/>
+              <w:rPr>
+                <w:rFonts w:ascii="Times New Roman" w:hAnsi="Times New Roman" w:cs="Times New Roman"/>
+                <w:b/>
+                <w:bCs/>
+                <w:w w:val="90"/>
+                <w:sz w:val="24"/>
+                <w:szCs w:val="24"/>
+              </w:rPr>
+            </w:pPr>
+          </w:p>
           <w:p>
             <w:pPr>
               <w:spacing w:line="286" w:lineRule="exact"/>
@@ -2964,6 +3025,7 @@
                 <w:sz w:val="24"/>
                 <w:szCs w:val="24"/>
               </w:rPr>
+              <w:lastRenderedPageBreak/>
               <w:t>Research</w:t>
             </w:r>
             <w:r>
@@ -3301,7 +3363,6 @@
                 <w:sz w:val="24"/>
                 <w:szCs w:val="24"/>
               </w:rPr>
-              <w:lastRenderedPageBreak/>
               <w:t>Research</w:t>
             </w:r>
             <w:r>
@@ -10415,16 +10476,7 @@
           <w:szCs w:val="24"/>
           <w:shd w:val="clear" w:color="auto" w:fill="FFFFFF"/>
         </w:rPr>
-        <w:t>1</w:t>
-      </w:r>
-      <w:r>
-        <w:rPr>
-          <w:rFonts w:ascii="Times New Roman" w:eastAsia="Calibri" w:hAnsi="Times New Roman" w:cs="Times New Roman"/>
-          <w:sz w:val="24"/>
-          <w:szCs w:val="24"/>
-          <w:shd w:val="clear" w:color="auto" w:fill="FFFFFF"/>
-        </w:rPr>
-        <w:t>b</w:t>
+        <w:t>0</w:t>
       </w:r>
       <w:r>
         <w:rPr>
@@ -10453,47 +10505,7 @@
           <w:szCs w:val="24"/>
           <w:shd w:val="clear" w:color="auto" w:fill="FFFFFF"/>
         </w:rPr>
-        <w:t xml:space="preserve"> Moon, J., Aldemir, T., </w:t>
-      </w:r>
-      <w:proofErr w:type="spellStart"/>
-      <w:r>
-        <w:rPr>
-          <w:rFonts w:ascii="Times New Roman" w:eastAsia="Times New Roman" w:hAnsi="Times New Roman" w:cs="Times New Roman"/>
-          <w:sz w:val="24"/>
-          <w:szCs w:val="24"/>
-          <w:shd w:val="clear" w:color="auto" w:fill="FFFFFF"/>
-        </w:rPr>
-        <w:t>Ghooreian</w:t>
-      </w:r>
-      <w:proofErr w:type="spellEnd"/>
-      <w:r>
-        <w:rPr>
-          <w:rFonts w:ascii="Times New Roman" w:eastAsia="Times New Roman" w:hAnsi="Times New Roman" w:cs="Times New Roman"/>
-          <w:sz w:val="24"/>
-          <w:szCs w:val="24"/>
-          <w:shd w:val="clear" w:color="auto" w:fill="FFFFFF"/>
-        </w:rPr>
-        <w:t xml:space="preserve">, A., &amp; </w:t>
-      </w:r>
-      <w:proofErr w:type="spellStart"/>
-      <w:r>
-        <w:rPr>
-          <w:rFonts w:ascii="Times New Roman" w:eastAsia="Times New Roman" w:hAnsi="Times New Roman" w:cs="Times New Roman"/>
-          <w:sz w:val="24"/>
-          <w:szCs w:val="24"/>
-          <w:shd w:val="clear" w:color="auto" w:fill="FFFFFF"/>
-        </w:rPr>
-        <w:t>Sabanwar</w:t>
-      </w:r>
-      <w:proofErr w:type="spellEnd"/>
-      <w:r>
-        <w:rPr>
-          <w:rFonts w:ascii="Times New Roman" w:eastAsia="Times New Roman" w:hAnsi="Times New Roman" w:cs="Times New Roman"/>
-          <w:sz w:val="24"/>
-          <w:szCs w:val="24"/>
-          <w:shd w:val="clear" w:color="auto" w:fill="FFFFFF"/>
-        </w:rPr>
-        <w:t>, V. (Under review). A Systematic Review of Empirical Research on AI in K-12 STEM Education (2020-2025) through a Sociotechnical Lens (Manuscript Number: ETRD-D-26-01416)</w:t>
+        <w:t xml:space="preserve"> Moon, J., Aldemir, T., Ghooreian, A., &amp; Sabanwar, V. (Under review). A Systematic Review of Empirical Research on AI in K-12 STEM Education (2020-2025) through a Sociotechnical Lens (Manuscript Number: ETRD-D-26-01416)</w:t>
       </w:r>
     </w:p>
     <w:p>
@@ -10526,7 +10538,16 @@
           <w:szCs w:val="24"/>
           <w:shd w:val="clear" w:color="auto" w:fill="FFFFFF"/>
         </w:rPr>
-        <w:t>20</w:t>
+        <w:t>2</w:t>
+      </w:r>
+      <w:r>
+        <w:rPr>
+          <w:rFonts w:ascii="Times New Roman" w:eastAsia="Calibri" w:hAnsi="Times New Roman" w:cs="Times New Roman"/>
+          <w:sz w:val="24"/>
+          <w:szCs w:val="24"/>
+          <w:shd w:val="clear" w:color="auto" w:fill="FFFFFF"/>
+        </w:rPr>
+        <w:t>9</w:t>
       </w:r>
       <w:r>
         <w:rPr>
@@ -10555,7 +10576,25 @@
           <w:szCs w:val="24"/>
           <w:shd w:val="clear" w:color="auto" w:fill="FFFFFF"/>
         </w:rPr>
-        <w:t xml:space="preserve"> Moon, J., Abu, S., &amp; Siyuan, S. (Revision). From experience to action: sequential dynamics of experiential learning in immersive virtual reality-supported safety training (Manuscript Number: 264134817)</w:t>
+        <w:t xml:space="preserve"> Moon, J., Abu, S., &amp; Siyuan, S. (</w:t>
+      </w:r>
+      <w:r>
+        <w:rPr>
+          <w:rFonts w:ascii="Times New Roman" w:eastAsia="Times New Roman" w:hAnsi="Times New Roman" w:cs="Times New Roman"/>
+          <w:sz w:val="24"/>
+          <w:szCs w:val="24"/>
+          <w:shd w:val="clear" w:color="auto" w:fill="FFFFFF"/>
+        </w:rPr>
+        <w:t>Accepted</w:t>
+      </w:r>
+      <w:r>
+        <w:rPr>
+          <w:rFonts w:ascii="Times New Roman" w:eastAsia="Times New Roman" w:hAnsi="Times New Roman" w:cs="Times New Roman"/>
+          <w:sz w:val="24"/>
+          <w:szCs w:val="24"/>
+          <w:shd w:val="clear" w:color="auto" w:fill="FFFFFF"/>
+        </w:rPr>
+        <w:t>). From experience to action: sequential dynamics of experiential learning in immersive virtual reality-supported safety training (Manuscript Number: 264134817)</w:t>
       </w:r>
     </w:p>
     <w:p>
@@ -10579,7 +10618,25 @@
           <w:szCs w:val="24"/>
           <w:shd w:val="clear" w:color="auto" w:fill="FFFFFF"/>
         </w:rPr>
-        <w:t xml:space="preserve">[19] </w:t>
+        <w:t>[1</w:t>
+      </w:r>
+      <w:r>
+        <w:rPr>
+          <w:rFonts w:ascii="Times New Roman" w:eastAsia="Calibri" w:hAnsi="Times New Roman" w:cs="Times New Roman"/>
+          <w:sz w:val="24"/>
+          <w:szCs w:val="24"/>
+          <w:shd w:val="clear" w:color="auto" w:fill="FFFFFF"/>
+        </w:rPr>
+        <w:t>8</w:t>
+      </w:r>
+      <w:r>
+        <w:rPr>
+          <w:rFonts w:ascii="Times New Roman" w:eastAsia="Calibri" w:hAnsi="Times New Roman" w:cs="Times New Roman"/>
+          <w:sz w:val="24"/>
+          <w:szCs w:val="24"/>
+          <w:shd w:val="clear" w:color="auto" w:fill="FFFFFF"/>
+        </w:rPr>
+        <w:t xml:space="preserve">] </w:t>
       </w:r>
       <w:r>
         <w:rPr>
@@ -10637,7 +10694,6 @@
         </w:rPr>
         <w:t xml:space="preserve">, &amp; </w:t>
       </w:r>
-      <w:proofErr w:type="spellStart"/>
       <w:r>
         <w:rPr>
           <w:rFonts w:ascii="Times New Roman" w:eastAsia="Times New Roman" w:hAnsi="Times New Roman" w:cs="Times New Roman"/>
@@ -10645,17 +10701,7 @@
           <w:szCs w:val="24"/>
           <w:shd w:val="clear" w:color="auto" w:fill="FFFFFF"/>
         </w:rPr>
-        <w:t>Ghooreian</w:t>
-      </w:r>
-      <w:proofErr w:type="spellEnd"/>
-      <w:r>
-        <w:rPr>
-          <w:rFonts w:ascii="Times New Roman" w:eastAsia="Times New Roman" w:hAnsi="Times New Roman" w:cs="Times New Roman"/>
-          <w:sz w:val="24"/>
-          <w:szCs w:val="24"/>
-          <w:shd w:val="clear" w:color="auto" w:fill="FFFFFF"/>
-        </w:rPr>
-        <w:t>, A</w:t>
+        <w:t>Ghooreian, A</w:t>
       </w:r>
       <w:r>
         <w:rPr>
@@ -10739,35 +10785,25 @@
           <w:sz w:val="24"/>
           <w:szCs w:val="24"/>
         </w:rPr>
-        <w:t>-</w:t>
-      </w:r>
-      <w:proofErr w:type="gramStart"/>
+        <w:t>-003</w:t>
+      </w:r>
       <w:r>
         <w:rPr>
           <w:rFonts w:ascii="Times New Roman" w:eastAsia="Times New Roman" w:hAnsi="Times New Roman" w:cs="Times New Roman"/>
           <w:sz w:val="24"/>
           <w:szCs w:val="24"/>
         </w:rPr>
-        <w:t>003</w:t>
+        <w:t>61</w:t>
       </w:r>
       <w:r>
         <w:rPr>
           <w:rFonts w:ascii="Times New Roman" w:eastAsia="Times New Roman" w:hAnsi="Times New Roman" w:cs="Times New Roman"/>
           <w:sz w:val="24"/>
           <w:szCs w:val="24"/>
-        </w:rPr>
-        <w:t>61</w:t>
-      </w:r>
-      <w:r>
-        <w:rPr>
-          <w:rFonts w:ascii="Times New Roman" w:eastAsia="Times New Roman" w:hAnsi="Times New Roman" w:cs="Times New Roman"/>
-          <w:sz w:val="24"/>
-          <w:szCs w:val="24"/>
           <w:shd w:val="clear" w:color="auto" w:fill="FFFFFF"/>
         </w:rPr>
         <w:t xml:space="preserve"> )</w:t>
       </w:r>
-      <w:proofErr w:type="gramEnd"/>
     </w:p>
     <w:p>
       <w:pPr>
@@ -10808,7 +10844,7 @@
           <w:szCs w:val="24"/>
           <w:shd w:val="clear" w:color="auto" w:fill="FFFFFF"/>
         </w:rPr>
-        <w:t>8</w:t>
+        <w:t>7</w:t>
       </w:r>
       <w:r>
         <w:rPr>
@@ -10846,29 +10882,9 @@
           <w:szCs w:val="24"/>
           <w:shd w:val="clear" w:color="auto" w:fill="FFFFFF"/>
         </w:rPr>
-        <w:t xml:space="preserve">., Baah-Mintah, R., &amp; </w:t>
-      </w:r>
-      <w:proofErr w:type="spellStart"/>
-      <w:r>
-        <w:rPr>
-          <w:rFonts w:ascii="Times New Roman" w:eastAsia="Times New Roman" w:hAnsi="Times New Roman" w:cs="Times New Roman"/>
-          <w:sz w:val="24"/>
-          <w:szCs w:val="24"/>
-          <w:shd w:val="clear" w:color="auto" w:fill="FFFFFF"/>
-        </w:rPr>
-        <w:t>Ghooreian</w:t>
-      </w:r>
-      <w:proofErr w:type="spellEnd"/>
-      <w:r>
-        <w:rPr>
-          <w:rFonts w:ascii="Times New Roman" w:eastAsia="Times New Roman" w:hAnsi="Times New Roman" w:cs="Times New Roman"/>
-          <w:sz w:val="24"/>
-          <w:szCs w:val="24"/>
-          <w:shd w:val="clear" w:color="auto" w:fill="FFFFFF"/>
-        </w:rPr>
-        <w:t xml:space="preserve">, A. (2026). Human-centered generative AI in education: ethical challenges and equity-driven solutions. Ethics &amp; Behavior, 1–27. </w:t>
-      </w:r>
-      <w:hyperlink r:id="rId9" w:history="1">
+        <w:t xml:space="preserve">., Baah-Mintah, R., &amp; Ghooreian, A. (2026). Human-centered generative AI in education: ethical challenges and equity-driven solutions. Ethics &amp; Behavior, 1–27. </w:t>
+      </w:r>
+      <w:hyperlink r:id="rId10" w:history="1">
         <w:r>
           <w:rPr>
             <w:rStyle w:val="Hyperlink"/>
@@ -10911,7 +10927,25 @@
           <w:szCs w:val="24"/>
           <w:shd w:val="clear" w:color="auto" w:fill="FFFFFF"/>
         </w:rPr>
-        <w:t xml:space="preserve">[17] McNeill, L., Uddin, M. M., Abu, S., Pei, M., </w:t>
+        <w:t>[1</w:t>
+      </w:r>
+      <w:r>
+        <w:rPr>
+          <w:rFonts w:ascii="Times New Roman" w:eastAsia="Times New Roman" w:hAnsi="Times New Roman" w:cs="Times New Roman"/>
+          <w:sz w:val="24"/>
+          <w:szCs w:val="24"/>
+          <w:shd w:val="clear" w:color="auto" w:fill="FFFFFF"/>
+        </w:rPr>
+        <w:t>6</w:t>
+      </w:r>
+      <w:r>
+        <w:rPr>
+          <w:rFonts w:ascii="Times New Roman" w:eastAsia="Times New Roman" w:hAnsi="Times New Roman" w:cs="Times New Roman"/>
+          <w:sz w:val="24"/>
+          <w:szCs w:val="24"/>
+          <w:shd w:val="clear" w:color="auto" w:fill="FFFFFF"/>
+        </w:rPr>
+        <w:t xml:space="preserve">] McNeill, L., Uddin, M. M., Abu, S., Pei, M., </w:t>
       </w:r>
       <w:r>
         <w:rPr>
@@ -10955,7 +10989,25 @@
           <w:szCs w:val="24"/>
           <w:shd w:val="clear" w:color="auto" w:fill="FFFFFF"/>
         </w:rPr>
-        <w:t xml:space="preserve">[16] </w:t>
+        <w:t>[1</w:t>
+      </w:r>
+      <w:r>
+        <w:rPr>
+          <w:rFonts w:ascii="Times New Roman" w:eastAsia="Calibri" w:hAnsi="Times New Roman" w:cs="Times New Roman"/>
+          <w:sz w:val="24"/>
+          <w:szCs w:val="24"/>
+          <w:shd w:val="clear" w:color="auto" w:fill="FFFFFF"/>
+        </w:rPr>
+        <w:t>5</w:t>
+      </w:r>
+      <w:r>
+        <w:rPr>
+          <w:rFonts w:ascii="Times New Roman" w:eastAsia="Calibri" w:hAnsi="Times New Roman" w:cs="Times New Roman"/>
+          <w:sz w:val="24"/>
+          <w:szCs w:val="24"/>
+          <w:shd w:val="clear" w:color="auto" w:fill="FFFFFF"/>
+        </w:rPr>
+        <w:t>]</w:t>
       </w:r>
       <w:r>
         <w:rPr>
@@ -10964,35 +11016,66 @@
           <w:szCs w:val="24"/>
           <w:shd w:val="clear" w:color="auto" w:fill="FFFFFF"/>
         </w:rPr>
-        <w:t xml:space="preserve">F Luo, J Amayou, F Nasrin, P Abedini, V Mousavi, </w:t>
+        <w:t xml:space="preserve"> </w:t>
       </w:r>
       <w:r>
         <w:rPr>
           <w:rFonts w:ascii="Times New Roman" w:eastAsia="Times New Roman" w:hAnsi="Times New Roman" w:cs="Times New Roman"/>
-          <w:b/>
-          <w:bCs/>
           <w:sz w:val="24"/>
           <w:szCs w:val="24"/>
           <w:shd w:val="clear" w:color="auto" w:fill="FFFFFF"/>
         </w:rPr>
-        <w:t>ID Awoyemi</w:t>
+        <w:t xml:space="preserve">Luo, F., Amayou, J., Nasrin, F., Abedini, P., Mousavi, V., Awoyemi, I. D., ... &amp; Crawford, C. (2026). Promoting elementary students’ computer science conceptual knowledge and coding performance: a mixed methods case study. </w:t>
       </w:r>
       <w:r>
         <w:rPr>
           <w:rFonts w:ascii="Times New Roman" w:eastAsia="Times New Roman" w:hAnsi="Times New Roman" w:cs="Times New Roman"/>
+          <w:i/>
+          <w:iCs/>
           <w:sz w:val="24"/>
           <w:szCs w:val="24"/>
           <w:shd w:val="clear" w:color="auto" w:fill="FFFFFF"/>
         </w:rPr>
-        <w:t xml:space="preserve">, A Hutchison, C Cao, C Crawford. </w:t>
+        <w:t>Journal of Research on Technology in Education,</w:t>
       </w:r>
       <w:r>
         <w:rPr>
           <w:rFonts w:ascii="Times New Roman" w:eastAsia="Times New Roman" w:hAnsi="Times New Roman" w:cs="Times New Roman"/>
           <w:sz w:val="24"/>
           <w:szCs w:val="24"/>
-        </w:rPr>
-        <w:t>​​Promoting elementary students’ computer science conceptual knowledge and coding performance: A mixed methods case study (Manuscript Number: UJRT-2025-1006.R2)</w:t>
+          <w:shd w:val="clear" w:color="auto" w:fill="FFFFFF"/>
+        </w:rPr>
+        <w:t xml:space="preserve"> 1-21. </w:t>
+      </w:r>
+      <w:hyperlink r:id="rId11" w:history="1">
+        <w:r>
+          <w:rPr>
+            <w:rStyle w:val="Hyperlink"/>
+            <w:rFonts w:ascii="Times New Roman" w:eastAsia="Times New Roman" w:hAnsi="Times New Roman" w:cs="Times New Roman"/>
+            <w:sz w:val="24"/>
+            <w:szCs w:val="24"/>
+            <w:shd w:val="clear" w:color="auto" w:fill="FFFFFF"/>
+          </w:rPr>
+          <w:t>https://doi.org/10.1080/15391523.2026.2661645</w:t>
+        </w:r>
+      </w:hyperlink>
+      <w:r>
+        <w:rPr>
+          <w:rFonts w:ascii="Times New Roman" w:eastAsia="Times New Roman" w:hAnsi="Times New Roman" w:cs="Times New Roman"/>
+          <w:sz w:val="24"/>
+          <w:szCs w:val="24"/>
+          <w:shd w:val="clear" w:color="auto" w:fill="FFFFFF"/>
+        </w:rPr>
+        <w:t xml:space="preserve"> </w:t>
+      </w:r>
+      <w:r>
+        <w:rPr>
+          <w:rFonts w:ascii="Times New Roman" w:eastAsia="Times New Roman" w:hAnsi="Times New Roman" w:cs="Times New Roman"/>
+          <w:sz w:val="24"/>
+          <w:szCs w:val="24"/>
+          <w:shd w:val="clear" w:color="auto" w:fill="FFFFFF"/>
+        </w:rPr>
+        <w:t xml:space="preserve"> </w:t>
       </w:r>
     </w:p>
     <w:p>
@@ -11016,7 +11099,25 @@
           <w:szCs w:val="24"/>
           <w:shd w:val="clear" w:color="auto" w:fill="FFFFFF"/>
         </w:rPr>
-        <w:t xml:space="preserve">[15] Moon, J., </w:t>
+        <w:t>[1</w:t>
+      </w:r>
+      <w:r>
+        <w:rPr>
+          <w:rFonts w:ascii="Times New Roman" w:eastAsia="Calibri" w:hAnsi="Times New Roman" w:cs="Times New Roman"/>
+          <w:sz w:val="24"/>
+          <w:szCs w:val="24"/>
+          <w:shd w:val="clear" w:color="auto" w:fill="FFFFFF"/>
+        </w:rPr>
+        <w:t>4</w:t>
+      </w:r>
+      <w:r>
+        <w:rPr>
+          <w:rFonts w:ascii="Times New Roman" w:eastAsia="Calibri" w:hAnsi="Times New Roman" w:cs="Times New Roman"/>
+          <w:sz w:val="24"/>
+          <w:szCs w:val="24"/>
+          <w:shd w:val="clear" w:color="auto" w:fill="FFFFFF"/>
+        </w:rPr>
+        <w:t xml:space="preserve">] Moon, J., </w:t>
       </w:r>
       <w:r>
         <w:rPr>
@@ -11084,7 +11185,25 @@
           <w:szCs w:val="24"/>
           <w:shd w:val="clear" w:color="auto" w:fill="FFFFFF"/>
         </w:rPr>
-        <w:t xml:space="preserve">[14] </w:t>
+        <w:t>[1</w:t>
+      </w:r>
+      <w:r>
+        <w:rPr>
+          <w:rFonts w:ascii="Times New Roman" w:eastAsia="Calibri" w:hAnsi="Times New Roman" w:cs="Times New Roman"/>
+          <w:sz w:val="24"/>
+          <w:szCs w:val="24"/>
+          <w:shd w:val="clear" w:color="auto" w:fill="FFFFFF"/>
+        </w:rPr>
+        <w:t>3</w:t>
+      </w:r>
+      <w:r>
+        <w:rPr>
+          <w:rFonts w:ascii="Times New Roman" w:eastAsia="Calibri" w:hAnsi="Times New Roman" w:cs="Times New Roman"/>
+          <w:sz w:val="24"/>
+          <w:szCs w:val="24"/>
+          <w:shd w:val="clear" w:color="auto" w:fill="FFFFFF"/>
+        </w:rPr>
+        <w:t xml:space="preserve">] </w:t>
       </w:r>
       <w:r>
         <w:rPr>
@@ -11169,7 +11288,34 @@
           <w:szCs w:val="24"/>
           <w:shd w:val="clear" w:color="auto" w:fill="FFFFFF"/>
         </w:rPr>
-        <w:t xml:space="preserve">13] </w:t>
+        <w:t>[</w:t>
+      </w:r>
+      <w:r>
+        <w:rPr>
+          <w:rFonts w:ascii="Times New Roman" w:eastAsia="Calibri" w:hAnsi="Times New Roman" w:cs="Times New Roman"/>
+          <w:sz w:val="24"/>
+          <w:szCs w:val="24"/>
+          <w:shd w:val="clear" w:color="auto" w:fill="FFFFFF"/>
+        </w:rPr>
+        <w:t>1</w:t>
+      </w:r>
+      <w:r>
+        <w:rPr>
+          <w:rFonts w:ascii="Times New Roman" w:eastAsia="Calibri" w:hAnsi="Times New Roman" w:cs="Times New Roman"/>
+          <w:sz w:val="24"/>
+          <w:szCs w:val="24"/>
+          <w:shd w:val="clear" w:color="auto" w:fill="FFFFFF"/>
+        </w:rPr>
+        <w:t>2</w:t>
+      </w:r>
+      <w:r>
+        <w:rPr>
+          <w:rFonts w:ascii="Times New Roman" w:eastAsia="Calibri" w:hAnsi="Times New Roman" w:cs="Times New Roman"/>
+          <w:sz w:val="24"/>
+          <w:szCs w:val="24"/>
+          <w:shd w:val="clear" w:color="auto" w:fill="FFFFFF"/>
+        </w:rPr>
+        <w:t xml:space="preserve">] </w:t>
       </w:r>
       <w:r>
         <w:rPr>
@@ -11273,7 +11419,25 @@
           <w:szCs w:val="24"/>
           <w:shd w:val="clear" w:color="auto" w:fill="FFFFFF"/>
         </w:rPr>
-        <w:t xml:space="preserve">[12] </w:t>
+        <w:t>[1</w:t>
+      </w:r>
+      <w:r>
+        <w:rPr>
+          <w:rFonts w:ascii="Times New Roman" w:eastAsia="Calibri" w:hAnsi="Times New Roman" w:cs="Times New Roman"/>
+          <w:sz w:val="24"/>
+          <w:szCs w:val="24"/>
+          <w:shd w:val="clear" w:color="auto" w:fill="FFFFFF"/>
+        </w:rPr>
+        <w:t>1</w:t>
+      </w:r>
+      <w:r>
+        <w:rPr>
+          <w:rFonts w:ascii="Times New Roman" w:eastAsia="Calibri" w:hAnsi="Times New Roman" w:cs="Times New Roman"/>
+          <w:sz w:val="24"/>
+          <w:szCs w:val="24"/>
+          <w:shd w:val="clear" w:color="auto" w:fill="FFFFFF"/>
+        </w:rPr>
+        <w:t xml:space="preserve">] </w:t>
       </w:r>
       <w:r>
         <w:rPr>
@@ -11324,7 +11488,7 @@
         </w:rPr>
         <w:t xml:space="preserve"> 1-30.  </w:t>
       </w:r>
-      <w:hyperlink r:id="rId10" w:history="1">
+      <w:hyperlink r:id="rId12" w:history="1">
         <w:r>
           <w:rPr>
             <w:rStyle w:val="Hyperlink"/>
@@ -11367,7 +11531,25 @@
           <w:szCs w:val="24"/>
           <w:shd w:val="clear" w:color="auto" w:fill="FFFFFF"/>
         </w:rPr>
-        <w:t xml:space="preserve">[11] </w:t>
+        <w:t>[1</w:t>
+      </w:r>
+      <w:r>
+        <w:rPr>
+          <w:rFonts w:ascii="Times New Roman" w:eastAsia="Calibri" w:hAnsi="Times New Roman" w:cs="Times New Roman"/>
+          <w:sz w:val="24"/>
+          <w:szCs w:val="24"/>
+          <w:shd w:val="clear" w:color="auto" w:fill="FFFFFF"/>
+        </w:rPr>
+        <w:t>0</w:t>
+      </w:r>
+      <w:r>
+        <w:rPr>
+          <w:rFonts w:ascii="Times New Roman" w:eastAsia="Calibri" w:hAnsi="Times New Roman" w:cs="Times New Roman"/>
+          <w:sz w:val="24"/>
+          <w:szCs w:val="24"/>
+          <w:shd w:val="clear" w:color="auto" w:fill="FFFFFF"/>
+        </w:rPr>
+        <w:t xml:space="preserve">] </w:t>
       </w:r>
       <w:r>
         <w:rPr>
@@ -11462,7 +11644,7 @@
         </w:rPr>
         <w:t xml:space="preserve">), 295-318. </w:t>
       </w:r>
-      <w:hyperlink r:id="rId11" w:history="1">
+      <w:hyperlink r:id="rId13" w:history="1">
         <w:r>
           <w:rPr>
             <w:rFonts w:ascii="Times New Roman" w:eastAsia="Times New Roman" w:hAnsi="Times New Roman" w:cs="Times New Roman"/>
@@ -11513,7 +11695,25 @@
           <w:szCs w:val="24"/>
           <w:shd w:val="clear" w:color="auto" w:fill="FFFFFF"/>
         </w:rPr>
-        <w:t xml:space="preserve">[10] </w:t>
+        <w:t>[</w:t>
+      </w:r>
+      <w:r>
+        <w:rPr>
+          <w:rFonts w:ascii="Times New Roman" w:eastAsia="Calibri" w:hAnsi="Times New Roman" w:cs="Times New Roman"/>
+          <w:sz w:val="24"/>
+          <w:szCs w:val="24"/>
+          <w:shd w:val="clear" w:color="auto" w:fill="FFFFFF"/>
+        </w:rPr>
+        <w:t>9</w:t>
+      </w:r>
+      <w:r>
+        <w:rPr>
+          <w:rFonts w:ascii="Times New Roman" w:eastAsia="Calibri" w:hAnsi="Times New Roman" w:cs="Times New Roman"/>
+          <w:sz w:val="24"/>
+          <w:szCs w:val="24"/>
+          <w:shd w:val="clear" w:color="auto" w:fill="FFFFFF"/>
+        </w:rPr>
+        <w:t xml:space="preserve">] </w:t>
       </w:r>
       <w:r>
         <w:rPr>
@@ -11584,7 +11784,7 @@
         </w:rPr>
         <w:t xml:space="preserve">(8), 997. </w:t>
       </w:r>
-      <w:hyperlink r:id="rId12" w:history="1">
+      <w:hyperlink r:id="rId14" w:history="1">
         <w:r>
           <w:rPr>
             <w:rFonts w:ascii="Times New Roman" w:eastAsia="Times New Roman" w:hAnsi="Times New Roman" w:cs="Times New Roman"/>
@@ -11628,7 +11828,25 @@
           <w:szCs w:val="24"/>
           <w:shd w:val="clear" w:color="auto" w:fill="FFFFFF"/>
         </w:rPr>
-        <w:t xml:space="preserve">[9] </w:t>
+        <w:t>[</w:t>
+      </w:r>
+      <w:r>
+        <w:rPr>
+          <w:rFonts w:ascii="Times New Roman" w:eastAsia="Calibri" w:hAnsi="Times New Roman" w:cs="Times New Roman"/>
+          <w:sz w:val="24"/>
+          <w:szCs w:val="24"/>
+          <w:shd w:val="clear" w:color="auto" w:fill="FFFFFF"/>
+        </w:rPr>
+        <w:t>8</w:t>
+      </w:r>
+      <w:r>
+        <w:rPr>
+          <w:rFonts w:ascii="Times New Roman" w:eastAsia="Calibri" w:hAnsi="Times New Roman" w:cs="Times New Roman"/>
+          <w:sz w:val="24"/>
+          <w:szCs w:val="24"/>
+          <w:shd w:val="clear" w:color="auto" w:fill="FFFFFF"/>
+        </w:rPr>
+        <w:t xml:space="preserve">] </w:t>
       </w:r>
       <w:r>
         <w:rPr>
@@ -11699,7 +11917,7 @@
         </w:rPr>
         <w:t xml:space="preserve">(5), e70074. </w:t>
       </w:r>
-      <w:hyperlink r:id="rId13" w:history="1">
+      <w:hyperlink r:id="rId15" w:history="1">
         <w:r>
           <w:rPr>
             <w:rFonts w:ascii="Times New Roman" w:eastAsia="Times New Roman" w:hAnsi="Times New Roman" w:cs="Times New Roman"/>
@@ -11743,7 +11961,25 @@
           <w:szCs w:val="24"/>
           <w:shd w:val="clear" w:color="auto" w:fill="FFFFFF"/>
         </w:rPr>
-        <w:t xml:space="preserve">[8] </w:t>
+        <w:t>[</w:t>
+      </w:r>
+      <w:r>
+        <w:rPr>
+          <w:rFonts w:ascii="Times New Roman" w:eastAsia="Calibri" w:hAnsi="Times New Roman" w:cs="Times New Roman"/>
+          <w:sz w:val="24"/>
+          <w:szCs w:val="24"/>
+          <w:shd w:val="clear" w:color="auto" w:fill="FFFFFF"/>
+        </w:rPr>
+        <w:t>7</w:t>
+      </w:r>
+      <w:r>
+        <w:rPr>
+          <w:rFonts w:ascii="Times New Roman" w:eastAsia="Calibri" w:hAnsi="Times New Roman" w:cs="Times New Roman"/>
+          <w:sz w:val="24"/>
+          <w:szCs w:val="24"/>
+          <w:shd w:val="clear" w:color="auto" w:fill="FFFFFF"/>
+        </w:rPr>
+        <w:t xml:space="preserve">] </w:t>
       </w:r>
       <w:r>
         <w:rPr>
@@ -11814,7 +12050,7 @@
         </w:rPr>
         <w:t xml:space="preserve">(7), 848. </w:t>
       </w:r>
-      <w:hyperlink r:id="rId14" w:history="1">
+      <w:hyperlink r:id="rId16" w:history="1">
         <w:r>
           <w:rPr>
             <w:rFonts w:ascii="Times New Roman" w:eastAsia="Times New Roman" w:hAnsi="Times New Roman" w:cs="Times New Roman"/>
@@ -11858,7 +12094,25 @@
           <w:szCs w:val="24"/>
           <w:shd w:val="clear" w:color="auto" w:fill="FFFFFF"/>
         </w:rPr>
-        <w:t xml:space="preserve">[7] </w:t>
+        <w:t>[</w:t>
+      </w:r>
+      <w:r>
+        <w:rPr>
+          <w:rFonts w:ascii="Times New Roman" w:eastAsia="Calibri" w:hAnsi="Times New Roman" w:cs="Times New Roman"/>
+          <w:sz w:val="24"/>
+          <w:szCs w:val="24"/>
+          <w:shd w:val="clear" w:color="auto" w:fill="FFFFFF"/>
+        </w:rPr>
+        <w:t>6</w:t>
+      </w:r>
+      <w:r>
+        <w:rPr>
+          <w:rFonts w:ascii="Times New Roman" w:eastAsia="Calibri" w:hAnsi="Times New Roman" w:cs="Times New Roman"/>
+          <w:sz w:val="24"/>
+          <w:szCs w:val="24"/>
+          <w:shd w:val="clear" w:color="auto" w:fill="FFFFFF"/>
+        </w:rPr>
+        <w:t xml:space="preserve">] </w:t>
       </w:r>
       <w:r>
         <w:rPr>
@@ -11889,7 +12143,7 @@
         </w:rPr>
         <w:t xml:space="preserve">., .... &amp; Feyijimi, T. (2025). Artificial intelligence in higher education: a systematic review of contributions to SDG 4 (quality education) and SDG 10 (reduced inequality). International Journal of Educational Management, 1-18. </w:t>
       </w:r>
-      <w:hyperlink r:id="rId15" w:history="1">
+      <w:hyperlink r:id="rId17" w:history="1">
         <w:r>
           <w:rPr>
             <w:rFonts w:ascii="Times New Roman" w:eastAsia="Times New Roman" w:hAnsi="Times New Roman" w:cs="Times New Roman"/>
@@ -11910,79 +12164,6 @@
           <w:shd w:val="clear" w:color="auto" w:fill="FFFFFF"/>
         </w:rPr>
         <w:t xml:space="preserve"> </w:t>
-      </w:r>
-    </w:p>
-    <w:p>
-      <w:pPr>
-        <w:widowControl/>
-        <w:shd w:val="clear" w:color="auto" w:fill="FFFFFF"/>
-        <w:autoSpaceDE/>
-        <w:autoSpaceDN/>
-        <w:ind w:left="720" w:hanging="630"/>
-        <w:rPr>
-          <w:rFonts w:ascii="Times New Roman" w:eastAsia="Times New Roman" w:hAnsi="Times New Roman" w:cs="Times New Roman"/>
-          <w:sz w:val="24"/>
-          <w:szCs w:val="24"/>
-          <w:shd w:val="clear" w:color="auto" w:fill="FFFFFF"/>
-        </w:rPr>
-      </w:pPr>
-      <w:r>
-        <w:rPr>
-          <w:rFonts w:ascii="Times New Roman" w:eastAsia="Calibri" w:hAnsi="Times New Roman" w:cs="Times New Roman"/>
-          <w:sz w:val="24"/>
-          <w:szCs w:val="24"/>
-          <w:shd w:val="clear" w:color="auto" w:fill="FFFFFF"/>
-        </w:rPr>
-        <w:t xml:space="preserve">[6] </w:t>
-      </w:r>
-      <w:r>
-        <w:rPr>
-          <w:rFonts w:ascii="Times New Roman" w:eastAsia="Times New Roman" w:hAnsi="Times New Roman" w:cs="Times New Roman"/>
-          <w:sz w:val="24"/>
-          <w:szCs w:val="24"/>
-          <w:shd w:val="clear" w:color="auto" w:fill="FFFFFF"/>
-        </w:rPr>
-        <w:t xml:space="preserve">Luo, F., Amayou, J., Nasrin, F., Abedini, P., </w:t>
-      </w:r>
-      <w:r>
-        <w:rPr>
-          <w:rFonts w:ascii="Times New Roman" w:eastAsia="Times New Roman" w:hAnsi="Times New Roman" w:cs="Times New Roman"/>
-          <w:b/>
-          <w:bCs/>
-          <w:sz w:val="24"/>
-          <w:szCs w:val="24"/>
-          <w:shd w:val="clear" w:color="auto" w:fill="FFFFFF"/>
-        </w:rPr>
-        <w:t>Awoyemi, I. D.</w:t>
-      </w:r>
-      <w:r>
-        <w:rPr>
-          <w:rFonts w:ascii="Times New Roman" w:eastAsia="Times New Roman" w:hAnsi="Times New Roman" w:cs="Times New Roman"/>
-          <w:sz w:val="24"/>
-          <w:szCs w:val="24"/>
-          <w:shd w:val="clear" w:color="auto" w:fill="FFFFFF"/>
-        </w:rPr>
-        <w:t xml:space="preserve"> (Revision</w:t>
-      </w:r>
-      <w:r>
-        <w:rPr>
-          <w:rFonts w:ascii="Times New Roman" w:eastAsia="Times New Roman" w:hAnsi="Times New Roman" w:cs="Times New Roman"/>
-          <w:b/>
-          <w:bCs/>
-          <w:sz w:val="24"/>
-          <w:szCs w:val="24"/>
-          <w:shd w:val="clear" w:color="auto" w:fill="FFFFFF"/>
-        </w:rPr>
-        <w:t xml:space="preserve">). </w:t>
-      </w:r>
-      <w:r>
-        <w:rPr>
-          <w:rFonts w:ascii="Times New Roman" w:eastAsia="Times New Roman" w:hAnsi="Times New Roman" w:cs="Times New Roman"/>
-          <w:sz w:val="24"/>
-          <w:szCs w:val="24"/>
-          <w:shd w:val="clear" w:color="auto" w:fill="FFFFFF"/>
-        </w:rPr>
-        <w:t>Promoting elementary students’ computer science conceptual knowledge and coding performance: A mixed methods case study (Manuscript ID is UJRT-2025-1006.R1).</w:t>
       </w:r>
     </w:p>
     <w:p>
@@ -17833,6 +18014,7 @@
               </w:tabs>
               <w:spacing w:before="240" w:line="314" w:lineRule="exact"/>
               <w:ind w:left="140"/>
+              <w:jc w:val="right"/>
               <w:rPr>
                 <w:rFonts w:ascii="Times New Roman" w:hAnsi="Times New Roman" w:cs="Times New Roman"/>
                 <w:spacing w:val="-2"/>
@@ -17842,6 +18024,16 @@
                 <w:szCs w:val="24"/>
               </w:rPr>
             </w:pPr>
+            <w:r>
+              <w:rPr>
+                <w:rFonts w:ascii="Times New Roman" w:hAnsi="Times New Roman" w:cs="Times New Roman"/>
+                <w:w w:val="85"/>
+                <w:position w:val="1"/>
+                <w:sz w:val="24"/>
+                <w:szCs w:val="24"/>
+              </w:rPr>
+              <w:t xml:space="preserve">       </w:t>
+            </w:r>
             <w:r>
               <w:rPr>
                 <w:rFonts w:ascii="Times New Roman" w:hAnsi="Times New Roman" w:cs="Times New Roman"/>
@@ -19206,7 +19398,7 @@
       </w:tr>
       <w:tr>
         <w:trPr>
-          <w:trHeight w:val="1845"/>
+          <w:trHeight w:val="810"/>
         </w:trPr>
         <w:tc>
           <w:tcPr>
@@ -19353,7 +19545,13 @@
               <w:ind w:left="360" w:hanging="270"/>
             </w:pPr>
             <w:r>
-              <w:t>Ensured smooth communication and collaboration among departmental units and the general membership.</w:t>
+              <w:t>Ensured smooth communication and collaboration among departmental units and the</w:t>
+            </w:r>
+            <w:r>
+              <w:t xml:space="preserve"> </w:t>
+            </w:r>
+            <w:r>
+              <w:t>general membership.</w:t>
             </w:r>
           </w:p>
         </w:tc>
@@ -19404,7 +19602,7 @@
                 <w:tab w:val="left" w:pos="10672"/>
               </w:tabs>
               <w:spacing w:line="230" w:lineRule="auto"/>
-              <w:ind w:left="140" w:right="-90"/>
+              <w:ind w:right="-90"/>
               <w:rPr>
                 <w:rFonts w:ascii="Times New Roman" w:hAnsi="Times New Roman" w:cs="Times New Roman"/>
                 <w:w w:val="75"/>
@@ -23533,32 +23731,6 @@
         </w:rPr>
       </w:pPr>
     </w:p>
-    <w:p>
-      <w:pPr>
-        <w:widowControl/>
-        <w:adjustRightInd w:val="0"/>
-        <w:ind w:right="-270"/>
-        <w:rPr>
-          <w:rFonts w:ascii="Times New Roman" w:eastAsia="Calibri" w:hAnsi="Times New Roman" w:cs="Times New Roman"/>
-          <w:bCs/>
-          <w:sz w:val="24"/>
-          <w:szCs w:val="24"/>
-        </w:rPr>
-      </w:pPr>
-    </w:p>
-    <w:p>
-      <w:pPr>
-        <w:widowControl/>
-        <w:adjustRightInd w:val="0"/>
-        <w:ind w:right="-270"/>
-        <w:rPr>
-          <w:rFonts w:ascii="Times New Roman" w:eastAsia="Calibri" w:hAnsi="Times New Roman" w:cs="Times New Roman"/>
-          <w:bCs/>
-          <w:sz w:val="24"/>
-          <w:szCs w:val="24"/>
-        </w:rPr>
-      </w:pPr>
-    </w:p>
     <w:tbl>
       <w:tblPr>
         <w:tblW w:w="10890" w:type="dxa"/>
@@ -27903,7 +28075,7 @@
       </w:r>
     </w:p>
     <w:sectPr>
-      <w:footerReference w:type="default" r:id="rId16"/>
+      <w:footerReference w:type="default" r:id="rId18"/>
       <w:pgSz w:w="12240" w:h="15840"/>
       <w:pgMar w:top="720" w:right="720" w:bottom="720" w:left="720" w:header="720" w:footer="0" w:gutter="0"/>
       <w:cols w:space="720"/>
@@ -27914,7 +28086,7 @@
 </file>
 
 <file path=word/endnotes.xml><?xml version="1.0" encoding="utf-8"?>
-<w:endnotes xmlns:wpc="http://schemas.microsoft.com/office/word/2010/wordprocessingCanvas" xmlns:cx="http://schemas.microsoft.com/office/drawing/2014/chartex" xmlns:cx1="http://schemas.microsoft.com/office/drawing/2015/9/8/chartex" xmlns:cx2="http://schemas.microsoft.com/office/drawing/2015/10/21/chartex" xmlns:cx3="http://schemas.microsoft.com/office/drawing/2016/5/9/chartex" xmlns:cx4="http://schemas.microsoft.com/office/drawing/2016/5/10/chartex" xmlns:cx5="http://schemas.microsoft.com/office/drawing/2016/5/11/chartex" xmlns:cx6="http://schemas.microsoft.com/office/drawing/2016/5/12/chartex" xmlns:cx7="http://schemas.microsoft.com/office/drawing/2016/5/13/chartex" xmlns:cx8="http://schemas.microsoft.com/office/drawing/2016/5/14/chartex" xmlns:mc="http://schemas.openxmlformats.org/markup-compatibility/2006" xmlns:aink="http://schemas.microsoft.com/office/drawing/2016/ink" xmlns:am3d="http://schemas.microsoft.com/office/drawing/2017/model3d" xmlns:o="urn:schemas-microsoft-com:office:office" xmlns:oel="http://schemas.microsoft.com/office/2019/extlst" xmlns:r="http://schemas.openxmlformats.org/officeDocument/2006/relationships" xmlns:m="http://schemas.openxmlformats.org/officeDocument/2006/math" xmlns:v="urn:schemas-microsoft-com:vml" xmlns:wp14="http://schemas.microsoft.com/office/word/2010/wordprocessingDrawing" xmlns:wp="http://schemas.openxmlformats.org/drawingml/2006/wordprocessingDrawing" xmlns:w10="urn:schemas-microsoft-com:office:word" xmlns:w="http://schemas.openxmlformats.org/wordprocessingml/2006/main" xmlns:w14="http://schemas.microsoft.com/office/word/2010/wordml" xmlns:w15="http://schemas.microsoft.com/office/word/2012/wordml" xmlns:w16cex="http://schemas.microsoft.com/office/word/2018/wordml/cex" xmlns:w16cid="http://schemas.microsoft.com/office/word/2016/wordml/cid" xmlns:w16="http://schemas.microsoft.com/office/word/2018/wordml" xmlns:w16du="http://schemas.microsoft.com/office/word/2023/wordml/word16du" xmlns:w16sdtdh="http://schemas.microsoft.com/office/word/2020/wordml/sdtdatahash" xmlns:w16sdtfl="http://schemas.microsoft.com/office/word/2024/wordml/sdtformatlock" xmlns:w16se="http://schemas.microsoft.com/office/word/2015/wordml/symex" xmlns:wpg="http://schemas.microsoft.com/office/word/2010/wordprocessingGroup" xmlns:wpi="http://schemas.microsoft.com/office/word/2010/wordprocessingInk" xmlns:wne="http://schemas.microsoft.com/office/word/2006/wordml" xmlns:wps="http://schemas.microsoft.com/office/word/2010/wordprocessingShape" mc:Ignorable="w14 w15 w16se w16cid w16 w16cex w16sdtdh w16sdtfl w16du wp14">
+<w:endnotes xmlns:wpc="http://schemas.microsoft.com/office/word/2010/wordprocessingCanvas" xmlns:cx="http://schemas.microsoft.com/office/drawing/2014/chartex" xmlns:cx1="http://schemas.microsoft.com/office/drawing/2015/9/8/chartex" xmlns:cx2="http://schemas.microsoft.com/office/drawing/2015/10/21/chartex" xmlns:cx3="http://schemas.microsoft.com/office/drawing/2016/5/9/chartex" xmlns:cx4="http://schemas.microsoft.com/office/drawing/2016/5/10/chartex" xmlns:cx5="http://schemas.microsoft.com/office/drawing/2016/5/11/chartex" xmlns:cx6="http://schemas.microsoft.com/office/drawing/2016/5/12/chartex" xmlns:cx7="http://schemas.microsoft.com/office/drawing/2016/5/13/chartex" xmlns:cx8="http://schemas.microsoft.com/office/drawing/2016/5/14/chartex" xmlns:mc="http://schemas.openxmlformats.org/markup-compatibility/2006" xmlns:aink="http://schemas.microsoft.com/office/drawing/2016/ink" xmlns:am3d="http://schemas.microsoft.com/office/drawing/2017/model3d" xmlns:o="urn:schemas-microsoft-com:office:office" xmlns:oel="http://schemas.microsoft.com/office/2019/extlst" xmlns:r="http://schemas.openxmlformats.org/officeDocument/2006/relationships" xmlns:m="http://schemas.openxmlformats.org/officeDocument/2006/math" xmlns:v="urn:schemas-microsoft-com:vml" xmlns:wp14="http://schemas.microsoft.com/office/word/2010/wordprocessingDrawing" xmlns:wp="http://schemas.openxmlformats.org/drawingml/2006/wordprocessingDrawing" xmlns:w10="urn:schemas-microsoft-com:office:word" xmlns:w="http://schemas.openxmlformats.org/wordprocessingml/2006/main" xmlns:w14="http://schemas.microsoft.com/office/word/2010/wordml" xmlns:w15="http://schemas.microsoft.com/office/word/2012/wordml" xmlns:w16cei="http://schemas.microsoft.com/office/word/2026/wordml/cei" xmlns:w16cex="http://schemas.microsoft.com/office/word/2018/wordml/cex" xmlns:w16cid="http://schemas.microsoft.com/office/word/2016/wordml/cid" xmlns:w16="http://schemas.microsoft.com/office/word/2018/wordml" xmlns:w16du="http://schemas.microsoft.com/office/word/2023/wordml/word16du" xmlns:w16sdtdh="http://schemas.microsoft.com/office/word/2020/wordml/sdtdatahash" xmlns:w16sdtfl="http://schemas.microsoft.com/office/word/2024/wordml/sdtformatlock" xmlns:w16se="http://schemas.microsoft.com/office/word/2015/wordml/symex" xmlns:wpg="http://schemas.microsoft.com/office/word/2010/wordprocessingGroup" xmlns:wpi="http://schemas.microsoft.com/office/word/2010/wordprocessingInk" xmlns:wne="http://schemas.microsoft.com/office/word/2006/wordml" xmlns:wps="http://schemas.microsoft.com/office/word/2010/wordprocessingShape" mc:Ignorable="w14 w15 w16se w16cid w16 w16cex w16sdtdh w16sdtfl w16du wp14">
   <w:endnote w:type="separator" w:id="-1">
     <w:p>
       <w:r>
@@ -27933,7 +28105,7 @@
 </file>
 
 <file path=word/footer1.xml><?xml version="1.0" encoding="utf-8"?>
-<w:ftr xmlns:wpc="http://schemas.microsoft.com/office/word/2010/wordprocessingCanvas" xmlns:cx="http://schemas.microsoft.com/office/drawing/2014/chartex" xmlns:cx1="http://schemas.microsoft.com/office/drawing/2015/9/8/chartex" xmlns:cx2="http://schemas.microsoft.com/office/drawing/2015/10/21/chartex" xmlns:cx3="http://schemas.microsoft.com/office/drawing/2016/5/9/chartex" xmlns:cx4="http://schemas.microsoft.com/office/drawing/2016/5/10/chartex" xmlns:cx5="http://schemas.microsoft.com/office/drawing/2016/5/11/chartex" xmlns:cx6="http://schemas.microsoft.com/office/drawing/2016/5/12/chartex" xmlns:cx7="http://schemas.microsoft.com/office/drawing/2016/5/13/chartex" xmlns:cx8="http://schemas.microsoft.com/office/drawing/2016/5/14/chartex" xmlns:mc="http://schemas.openxmlformats.org/markup-compatibility/2006" xmlns:aink="http://schemas.microsoft.com/office/drawing/2016/ink" xmlns:am3d="http://schemas.microsoft.com/office/drawing/2017/model3d" xmlns:o="urn:schemas-microsoft-com:office:office" xmlns:oel="http://schemas.microsoft.com/office/2019/extlst" xmlns:r="http://schemas.openxmlformats.org/officeDocument/2006/relationships" xmlns:m="http://schemas.openxmlformats.org/officeDocument/2006/math" xmlns:v="urn:schemas-microsoft-com:vml" xmlns:wp14="http://schemas.microsoft.com/office/word/2010/wordprocessingDrawing" xmlns:wp="http://schemas.openxmlformats.org/drawingml/2006/wordprocessingDrawing" xmlns:w10="urn:schemas-microsoft-com:office:word" xmlns:w="http://schemas.openxmlformats.org/wordprocessingml/2006/main" xmlns:w14="http://schemas.microsoft.com/office/word/2010/wordml" xmlns:w15="http://schemas.microsoft.com/office/word/2012/wordml" xmlns:w16cex="http://schemas.microsoft.com/office/word/2018/wordml/cex" xmlns:w16cid="http://schemas.microsoft.com/office/word/2016/wordml/cid" xmlns:w16="http://schemas.microsoft.com/office/word/2018/wordml" xmlns:w16du="http://schemas.microsoft.com/office/word/2023/wordml/word16du" xmlns:w16sdtdh="http://schemas.microsoft.com/office/word/2020/wordml/sdtdatahash" xmlns:w16sdtfl="http://schemas.microsoft.com/office/word/2024/wordml/sdtformatlock" xmlns:w16se="http://schemas.microsoft.com/office/word/2015/wordml/symex" xmlns:wpg="http://schemas.microsoft.com/office/word/2010/wordprocessingGroup" xmlns:wpi="http://schemas.microsoft.com/office/word/2010/wordprocessingInk" xmlns:wne="http://schemas.microsoft.com/office/word/2006/wordml" xmlns:wps="http://schemas.microsoft.com/office/word/2010/wordprocessingShape" mc:Ignorable="w14 w15 w16se w16cid w16 w16cex w16sdtdh w16sdtfl w16du wp14">
+<w:ftr xmlns:wpc="http://schemas.microsoft.com/office/word/2010/wordprocessingCanvas" xmlns:cx="http://schemas.microsoft.com/office/drawing/2014/chartex" xmlns:cx1="http://schemas.microsoft.com/office/drawing/2015/9/8/chartex" xmlns:cx2="http://schemas.microsoft.com/office/drawing/2015/10/21/chartex" xmlns:cx3="http://schemas.microsoft.com/office/drawing/2016/5/9/chartex" xmlns:cx4="http://schemas.microsoft.com/office/drawing/2016/5/10/chartex" xmlns:cx5="http://schemas.microsoft.com/office/drawing/2016/5/11/chartex" xmlns:cx6="http://schemas.microsoft.com/office/drawing/2016/5/12/chartex" xmlns:cx7="http://schemas.microsoft.com/office/drawing/2016/5/13/chartex" xmlns:cx8="http://schemas.microsoft.com/office/drawing/2016/5/14/chartex" xmlns:mc="http://schemas.openxmlformats.org/markup-compatibility/2006" xmlns:aink="http://schemas.microsoft.com/office/drawing/2016/ink" xmlns:am3d="http://schemas.microsoft.com/office/drawing/2017/model3d" xmlns:o="urn:schemas-microsoft-com:office:office" xmlns:oel="http://schemas.microsoft.com/office/2019/extlst" xmlns:r="http://schemas.openxmlformats.org/officeDocument/2006/relationships" xmlns:m="http://schemas.openxmlformats.org/officeDocument/2006/math" xmlns:v="urn:schemas-microsoft-com:vml" xmlns:wp14="http://schemas.microsoft.com/office/word/2010/wordprocessingDrawing" xmlns:wp="http://schemas.openxmlformats.org/drawingml/2006/wordprocessingDrawing" xmlns:w10="urn:schemas-microsoft-com:office:word" xmlns:w="http://schemas.openxmlformats.org/wordprocessingml/2006/main" xmlns:w14="http://schemas.microsoft.com/office/word/2010/wordml" xmlns:w15="http://schemas.microsoft.com/office/word/2012/wordml" xmlns:w16cei="http://schemas.microsoft.com/office/word/2026/wordml/cei" xmlns:w16cex="http://schemas.microsoft.com/office/word/2018/wordml/cex" xmlns:w16cid="http://schemas.microsoft.com/office/word/2016/wordml/cid" xmlns:w16="http://schemas.microsoft.com/office/word/2018/wordml" xmlns:w16du="http://schemas.microsoft.com/office/word/2023/wordml/word16du" xmlns:w16sdtdh="http://schemas.microsoft.com/office/word/2020/wordml/sdtdatahash" xmlns:w16sdtfl="http://schemas.microsoft.com/office/word/2024/wordml/sdtformatlock" xmlns:w16se="http://schemas.microsoft.com/office/word/2015/wordml/symex" xmlns:wpg="http://schemas.microsoft.com/office/word/2010/wordprocessingGroup" xmlns:wpi="http://schemas.microsoft.com/office/word/2010/wordprocessingInk" xmlns:wne="http://schemas.microsoft.com/office/word/2006/wordml" xmlns:wps="http://schemas.microsoft.com/office/word/2010/wordprocessingShape" mc:Ignorable="w14 w15 w16se w16cid w16 w16cex w16sdtdh w16sdtfl w16du wp14">
   <w:sdt>
     <w:sdtPr>
       <w:id w:val="387538800"/>
@@ -28072,7 +28244,7 @@
 </file>
 
 <file path=word/footnotes.xml><?xml version="1.0" encoding="utf-8"?>
-<w:footnotes xmlns:wpc="http://schemas.microsoft.com/office/word/2010/wordprocessingCanvas" xmlns:cx="http://schemas.microsoft.com/office/drawing/2014/chartex" xmlns:cx1="http://schemas.microsoft.com/office/drawing/2015/9/8/chartex" xmlns:cx2="http://schemas.microsoft.com/office/drawing/2015/10/21/chartex" xmlns:cx3="http://schemas.microsoft.com/office/drawing/2016/5/9/chartex" xmlns:cx4="http://schemas.microsoft.com/office/drawing/2016/5/10/chartex" xmlns:cx5="http://schemas.microsoft.com/office/drawing/2016/5/11/chartex" xmlns:cx6="http://schemas.microsoft.com/office/drawing/2016/5/12/chartex" xmlns:cx7="http://schemas.microsoft.com/office/drawing/2016/5/13/chartex" xmlns:cx8="http://schemas.microsoft.com/office/drawing/2016/5/14/chartex" xmlns:mc="http://schemas.openxmlformats.org/markup-compatibility/2006" xmlns:aink="http://schemas.microsoft.com/office/drawing/2016/ink" xmlns:am3d="http://schemas.microsoft.com/office/drawing/2017/model3d" xmlns:o="urn:schemas-microsoft-com:office:office" xmlns:oel="http://schemas.microsoft.com/office/2019/extlst" xmlns:r="http://schemas.openxmlformats.org/officeDocument/2006/relationships" xmlns:m="http://schemas.openxmlformats.org/officeDocument/2006/math" xmlns:v="urn:schemas-microsoft-com:vml" xmlns:wp14="http://schemas.microsoft.com/office/word/2010/wordprocessingDrawing" xmlns:wp="http://schemas.openxmlformats.org/drawingml/2006/wordprocessingDrawing" xmlns:w10="urn:schemas-microsoft-com:office:word" xmlns:w="http://schemas.openxmlformats.org/wordprocessingml/2006/main" xmlns:w14="http://schemas.microsoft.com/office/word/2010/wordml" xmlns:w15="http://schemas.microsoft.com/office/word/2012/wordml" xmlns:w16cex="http://schemas.microsoft.com/office/word/2018/wordml/cex" xmlns:w16cid="http://schemas.microsoft.com/office/word/2016/wordml/cid" xmlns:w16="http://schemas.microsoft.com/office/word/2018/wordml" xmlns:w16du="http://schemas.microsoft.com/office/word/2023/wordml/word16du" xmlns:w16sdtdh="http://schemas.microsoft.com/office/word/2020/wordml/sdtdatahash" xmlns:w16sdtfl="http://schemas.microsoft.com/office/word/2024/wordml/sdtformatlock" xmlns:w16se="http://schemas.microsoft.com/office/word/2015/wordml/symex" xmlns:wpg="http://schemas.microsoft.com/office/word/2010/wordprocessingGroup" xmlns:wpi="http://schemas.microsoft.com/office/word/2010/wordprocessingInk" xmlns:wne="http://schemas.microsoft.com/office/word/2006/wordml" xmlns:wps="http://schemas.microsoft.com/office/word/2010/wordprocessingShape" mc:Ignorable="w14 w15 w16se w16cid w16 w16cex w16sdtdh w16sdtfl w16du wp14">
+<w:footnotes xmlns:wpc="http://schemas.microsoft.com/office/word/2010/wordprocessingCanvas" xmlns:cx="http://schemas.microsoft.com/office/drawing/2014/chartex" xmlns:cx1="http://schemas.microsoft.com/office/drawing/2015/9/8/chartex" xmlns:cx2="http://schemas.microsoft.com/office/drawing/2015/10/21/chartex" xmlns:cx3="http://schemas.microsoft.com/office/drawing/2016/5/9/chartex" xmlns:cx4="http://schemas.microsoft.com/office/drawing/2016/5/10/chartex" xmlns:cx5="http://schemas.microsoft.com/office/drawing/2016/5/11/chartex" xmlns:cx6="http://schemas.microsoft.com/office/drawing/2016/5/12/chartex" xmlns:cx7="http://schemas.microsoft.com/office/drawing/2016/5/13/chartex" xmlns:cx8="http://schemas.microsoft.com/office/drawing/2016/5/14/chartex" xmlns:mc="http://schemas.openxmlformats.org/markup-compatibility/2006" xmlns:aink="http://schemas.microsoft.com/office/drawing/2016/ink" xmlns:am3d="http://schemas.microsoft.com/office/drawing/2017/model3d" xmlns:o="urn:schemas-microsoft-com:office:office" xmlns:oel="http://schemas.microsoft.com/office/2019/extlst" xmlns:r="http://schemas.openxmlformats.org/officeDocument/2006/relationships" xmlns:m="http://schemas.openxmlformats.org/officeDocument/2006/math" xmlns:v="urn:schemas-microsoft-com:vml" xmlns:wp14="http://schemas.microsoft.com/office/word/2010/wordprocessingDrawing" xmlns:wp="http://schemas.openxmlformats.org/drawingml/2006/wordprocessingDrawing" xmlns:w10="urn:schemas-microsoft-com:office:word" xmlns:w="http://schemas.openxmlformats.org/wordprocessingml/2006/main" xmlns:w14="http://schemas.microsoft.com/office/word/2010/wordml" xmlns:w15="http://schemas.microsoft.com/office/word/2012/wordml" xmlns:w16cei="http://schemas.microsoft.com/office/word/2026/wordml/cei" xmlns:w16cex="http://schemas.microsoft.com/office/word/2018/wordml/cex" xmlns:w16cid="http://schemas.microsoft.com/office/word/2016/wordml/cid" xmlns:w16="http://schemas.microsoft.com/office/word/2018/wordml" xmlns:w16du="http://schemas.microsoft.com/office/word/2023/wordml/word16du" xmlns:w16sdtdh="http://schemas.microsoft.com/office/word/2020/wordml/sdtdatahash" xmlns:w16sdtfl="http://schemas.microsoft.com/office/word/2024/wordml/sdtformatlock" xmlns:w16se="http://schemas.microsoft.com/office/word/2015/wordml/symex" xmlns:wpg="http://schemas.microsoft.com/office/word/2010/wordprocessingGroup" xmlns:wpi="http://schemas.microsoft.com/office/word/2010/wordprocessingInk" xmlns:wne="http://schemas.microsoft.com/office/word/2006/wordml" xmlns:wps="http://schemas.microsoft.com/office/word/2010/wordprocessingShape" mc:Ignorable="w14 w15 w16se w16cid w16 w16cex w16sdtdh w16sdtfl w16du wp14">
   <w:footnote w:type="separator" w:id="-1">
     <w:p>
       <w:r>
@@ -28091,7 +28263,7 @@
 </file>
 
 <file path=word/numbering.xml><?xml version="1.0" encoding="utf-8"?>
-<w:numbering xmlns:wpc="http://schemas.microsoft.com/office/word/2010/wordprocessingCanvas" xmlns:cx="http://schemas.microsoft.com/office/drawing/2014/chartex" xmlns:cx1="http://schemas.microsoft.com/office/drawing/2015/9/8/chartex" xmlns:cx2="http://schemas.microsoft.com/office/drawing/2015/10/21/chartex" xmlns:cx3="http://schemas.microsoft.com/office/drawing/2016/5/9/chartex" xmlns:cx4="http://schemas.microsoft.com/office/drawing/2016/5/10/chartex" xmlns:cx5="http://schemas.microsoft.com/office/drawing/2016/5/11/chartex" xmlns:cx6="http://schemas.microsoft.com/office/drawing/2016/5/12/chartex" xmlns:cx7="http://schemas.microsoft.com/office/drawing/2016/5/13/chartex" xmlns:cx8="http://schemas.microsoft.com/office/drawing/2016/5/14/chartex" xmlns:mc="http://schemas.openxmlformats.org/markup-compatibility/2006" xmlns:aink="http://schemas.microsoft.com/office/drawing/2016/ink" xmlns:am3d="http://schemas.microsoft.com/office/drawing/2017/model3d" xmlns:o="urn:schemas-microsoft-com:office:office" xmlns:oel="http://schemas.microsoft.com/office/2019/extlst" xmlns:r="http://schemas.openxmlformats.org/officeDocument/2006/relationships" xmlns:m="http://schemas.openxmlformats.org/officeDocument/2006/math" xmlns:v="urn:schemas-microsoft-com:vml" xmlns:wp14="http://schemas.microsoft.com/office/word/2010/wordprocessingDrawing" xmlns:wp="http://schemas.openxmlformats.org/drawingml/2006/wordprocessingDrawing" xmlns:w10="urn:schemas-microsoft-com:office:word" xmlns:w="http://schemas.openxmlformats.org/wordprocessingml/2006/main" xmlns:w14="http://schemas.microsoft.com/office/word/2010/wordml" xmlns:w15="http://schemas.microsoft.com/office/word/2012/wordml" xmlns:w16cex="http://schemas.microsoft.com/office/word/2018/wordml/cex" xmlns:w16cid="http://schemas.microsoft.com/office/word/2016/wordml/cid" xmlns:w16="http://schemas.microsoft.com/office/word/2018/wordml" xmlns:w16du="http://schemas.microsoft.com/office/word/2023/wordml/word16du" xmlns:w16sdtdh="http://schemas.microsoft.com/office/word/2020/wordml/sdtdatahash" xmlns:w16sdtfl="http://schemas.microsoft.com/office/word/2024/wordml/sdtformatlock" xmlns:w16se="http://schemas.microsoft.com/office/word/2015/wordml/symex" xmlns:wpg="http://schemas.microsoft.com/office/word/2010/wordprocessingGroup" xmlns:wpi="http://schemas.microsoft.com/office/word/2010/wordprocessingInk" xmlns:wne="http://schemas.microsoft.com/office/word/2006/wordml" xmlns:wps="http://schemas.microsoft.com/office/word/2010/wordprocessingShape" mc:Ignorable="w14 w15 w16se w16cid w16 w16cex w16sdtdh w16sdtfl w16du wp14">
+<w:numbering xmlns:wpc="http://schemas.microsoft.com/office/word/2010/wordprocessingCanvas" xmlns:cx="http://schemas.microsoft.com/office/drawing/2014/chartex" xmlns:cx1="http://schemas.microsoft.com/office/drawing/2015/9/8/chartex" xmlns:cx2="http://schemas.microsoft.com/office/drawing/2015/10/21/chartex" xmlns:cx3="http://schemas.microsoft.com/office/drawing/2016/5/9/chartex" xmlns:cx4="http://schemas.microsoft.com/office/drawing/2016/5/10/chartex" xmlns:cx5="http://schemas.microsoft.com/office/drawing/2016/5/11/chartex" xmlns:cx6="http://schemas.microsoft.com/office/drawing/2016/5/12/chartex" xmlns:cx7="http://schemas.microsoft.com/office/drawing/2016/5/13/chartex" xmlns:cx8="http://schemas.microsoft.com/office/drawing/2016/5/14/chartex" xmlns:mc="http://schemas.openxmlformats.org/markup-compatibility/2006" xmlns:aink="http://schemas.microsoft.com/office/drawing/2016/ink" xmlns:am3d="http://schemas.microsoft.com/office/drawing/2017/model3d" xmlns:o="urn:schemas-microsoft-com:office:office" xmlns:oel="http://schemas.microsoft.com/office/2019/extlst" xmlns:r="http://schemas.openxmlformats.org/officeDocument/2006/relationships" xmlns:m="http://schemas.openxmlformats.org/officeDocument/2006/math" xmlns:v="urn:schemas-microsoft-com:vml" xmlns:wp14="http://schemas.microsoft.com/office/word/2010/wordprocessingDrawing" xmlns:wp="http://schemas.openxmlformats.org/drawingml/2006/wordprocessingDrawing" xmlns:w10="urn:schemas-microsoft-com:office:word" xmlns:w="http://schemas.openxmlformats.org/wordprocessingml/2006/main" xmlns:w14="http://schemas.microsoft.com/office/word/2010/wordml" xmlns:w15="http://schemas.microsoft.com/office/word/2012/wordml" xmlns:w16cei="http://schemas.microsoft.com/office/word/2026/wordml/cei" xmlns:w16cex="http://schemas.microsoft.com/office/word/2018/wordml/cex" xmlns:w16cid="http://schemas.microsoft.com/office/word/2016/wordml/cid" xmlns:w16="http://schemas.microsoft.com/office/word/2018/wordml" xmlns:w16du="http://schemas.microsoft.com/office/word/2023/wordml/word16du" xmlns:w16sdtdh="http://schemas.microsoft.com/office/word/2020/wordml/sdtdatahash" xmlns:w16sdtfl="http://schemas.microsoft.com/office/word/2024/wordml/sdtformatlock" xmlns:w16se="http://schemas.microsoft.com/office/word/2015/wordml/symex" xmlns:wpg="http://schemas.microsoft.com/office/word/2010/wordprocessingGroup" xmlns:wpi="http://schemas.microsoft.com/office/word/2010/wordprocessingInk" xmlns:wne="http://schemas.microsoft.com/office/word/2006/wordml" xmlns:wps="http://schemas.microsoft.com/office/word/2010/wordprocessingShape" mc:Ignorable="w14 w15 w16se w16cid w16 w16cex w16sdtdh w16sdtfl w16du wp14">
   <w:abstractNum w:abstractNumId="0" w15:restartNumberingAfterBreak="0">
     <w:nsid w:val="0397741F"/>
     <w:multiLevelType w:val="hybridMultilevel"/>

</xml_diff>

<commit_message>
Fix 'Al-Enhanced' -> 'AI-Enhanced' typo in CV and rebuild
The AECT 2025 poster entry read 'Al-Enhanced VR Spring Dynamics
Simulations' (capital A + lowercase L) instead of 'AI-Enhanced'.
Corrected in CV_David.docx via a single-run replacement so all
document formatting is preserved; verified only that one paragraph
changed (99 paragraphs and 10 tables otherwise identical).

Left 'Al-Himah Journal of Education' untouched - that is a genuine
journal name using the Arabic 'Al-' prefix.

Co-Authored-By: Claude Opus 4.8 <noreply@anthropic.com>
</commit_message>
<xml_diff>
--- a/CV_David.docx
+++ b/CV_David.docx
@@ -6908,7 +6908,25 @@
                 <w:sz w:val="24"/>
                 <w:szCs w:val="24"/>
               </w:rPr>
-              <w:t xml:space="preserve"> Introduction to Immersive Virtual Reality (IVR) in Facilitating Multimedia Learning. Invited to present an overview of IVR applications in educational contexts, emphasizing cognitive and experiential learning principles. Behavioral and Microgenetic Analysis. Designed and led an interactive workshop exploring methods for analyzing learning processes over time, with a focus on applied research.        </w:t>
+              <w:t xml:space="preserve"> Introduction to Immersive Virtual Reality (IVR) in Facilitating Multimedia Learning. Invited to present an overview of IVR applications in educational contexts, emphasizing cognitive and experiential learning principles. Behavioral and </w:t>
+            </w:r>
+            <w:proofErr w:type="spellStart"/>
+            <w:r>
+              <w:rPr>
+                <w:rFonts w:ascii="Times New Roman" w:eastAsia="Times New Roman" w:hAnsi="Times New Roman" w:cs="Times New Roman"/>
+                <w:sz w:val="24"/>
+                <w:szCs w:val="24"/>
+              </w:rPr>
+              <w:t>Microgenetic</w:t>
+            </w:r>
+            <w:proofErr w:type="spellEnd"/>
+            <w:r>
+              <w:rPr>
+                <w:rFonts w:ascii="Times New Roman" w:eastAsia="Times New Roman" w:hAnsi="Times New Roman" w:cs="Times New Roman"/>
+                <w:sz w:val="24"/>
+                <w:szCs w:val="24"/>
+              </w:rPr>
+              <w:t xml:space="preserve"> Analysis. Designed and led an interactive workshop exploring methods for analyzing learning processes over time, with a focus on applied research.        </w:t>
             </w:r>
           </w:p>
         </w:tc>
@@ -7203,7 +7221,25 @@
                 <w:szCs w:val="24"/>
               </w:rPr>
               <w:tab/>
-              <w:t xml:space="preserve">                                                                 Introduction to Immersive Virtual Reality (IVR) in Facilitating Multimedia Learning. Invited to present an overview of IVR applications in educational contexts, emphasizing cognitive and experiential learning principles. Behavioral and Microgenetic Analysis. Designed and led an interactive workshop exploring methods for analyzing learning processes over time, with a focus on applied research techniques.    </w:t>
+              <w:t xml:space="preserve">                                                                 Introduction to Immersive Virtual Reality (IVR) in Facilitating Multimedia Learning. Invited to present an overview of IVR applications in educational contexts, emphasizing cognitive and experiential learning principles. Behavioral and </w:t>
+            </w:r>
+            <w:proofErr w:type="spellStart"/>
+            <w:r>
+              <w:rPr>
+                <w:rFonts w:ascii="Times New Roman" w:eastAsia="Times New Roman" w:hAnsi="Times New Roman" w:cs="Times New Roman"/>
+                <w:sz w:val="24"/>
+                <w:szCs w:val="24"/>
+              </w:rPr>
+              <w:t>Microgenetic</w:t>
+            </w:r>
+            <w:proofErr w:type="spellEnd"/>
+            <w:r>
+              <w:rPr>
+                <w:rFonts w:ascii="Times New Roman" w:eastAsia="Times New Roman" w:hAnsi="Times New Roman" w:cs="Times New Roman"/>
+                <w:sz w:val="24"/>
+                <w:szCs w:val="24"/>
+              </w:rPr>
+              <w:t xml:space="preserve"> Analysis. Designed and led an interactive workshop exploring methods for analyzing learning processes over time, with a focus on applied research techniques.    </w:t>
             </w:r>
           </w:p>
         </w:tc>
@@ -8438,6 +8474,7 @@
               </w:rPr>
               <w:t xml:space="preserve"> </w:t>
             </w:r>
+            <w:proofErr w:type="gramStart"/>
             <w:r>
               <w:rPr>
                 <w:rFonts w:ascii="Times New Roman" w:hAnsi="Times New Roman" w:cs="Times New Roman"/>
@@ -8466,6 +8503,7 @@
               </w:rPr>
               <w:t>of</w:t>
             </w:r>
+            <w:proofErr w:type="gramEnd"/>
             <w:r>
               <w:rPr>
                 <w:rFonts w:ascii="Times New Roman" w:hAnsi="Times New Roman" w:cs="Times New Roman"/>
@@ -9379,6 +9417,7 @@
                 <w:szCs w:val="24"/>
               </w:rPr>
             </w:pPr>
+            <w:proofErr w:type="spellStart"/>
             <w:r>
               <w:rPr>
                 <w:rFonts w:ascii="Times New Roman" w:hAnsi="Times New Roman" w:cs="Times New Roman"/>
@@ -9388,6 +9427,7 @@
               </w:rPr>
               <w:t>Abarikpo</w:t>
             </w:r>
+            <w:proofErr w:type="spellEnd"/>
             <w:r>
               <w:rPr>
                 <w:rFonts w:ascii="Times New Roman" w:hAnsi="Times New Roman" w:cs="Times New Roman"/>
@@ -9454,6 +9494,7 @@
               </w:rPr>
               <w:t xml:space="preserve">, </w:t>
             </w:r>
+            <w:proofErr w:type="spellStart"/>
             <w:r>
               <w:rPr>
                 <w:rFonts w:ascii="Times New Roman" w:hAnsi="Times New Roman" w:cs="Times New Roman"/>
@@ -9462,7 +9503,18 @@
                 <w:sz w:val="24"/>
                 <w:szCs w:val="24"/>
               </w:rPr>
-              <w:t xml:space="preserve">Ahoada, </w:t>
+              <w:t>Ahoada</w:t>
+            </w:r>
+            <w:proofErr w:type="spellEnd"/>
+            <w:r>
+              <w:rPr>
+                <w:rFonts w:ascii="Times New Roman" w:hAnsi="Times New Roman" w:cs="Times New Roman"/>
+                <w:spacing w:val="-7"/>
+                <w:position w:val="1"/>
+                <w:sz w:val="24"/>
+                <w:szCs w:val="24"/>
+              </w:rPr>
+              <w:t xml:space="preserve">, </w:t>
             </w:r>
             <w:r>
               <w:rPr>
@@ -10505,7 +10557,47 @@
           <w:szCs w:val="24"/>
           <w:shd w:val="clear" w:color="auto" w:fill="FFFFFF"/>
         </w:rPr>
-        <w:t xml:space="preserve"> Moon, J., Aldemir, T., Ghooreian, A., &amp; Sabanwar, V. (Under review). A Systematic Review of Empirical Research on AI in K-12 STEM Education (2020-2025) through a Sociotechnical Lens (Manuscript Number: ETRD-D-26-01416)</w:t>
+        <w:t xml:space="preserve"> Moon, J., Aldemir, T., </w:t>
+      </w:r>
+      <w:proofErr w:type="spellStart"/>
+      <w:r>
+        <w:rPr>
+          <w:rFonts w:ascii="Times New Roman" w:eastAsia="Times New Roman" w:hAnsi="Times New Roman" w:cs="Times New Roman"/>
+          <w:sz w:val="24"/>
+          <w:szCs w:val="24"/>
+          <w:shd w:val="clear" w:color="auto" w:fill="FFFFFF"/>
+        </w:rPr>
+        <w:t>Ghooreian</w:t>
+      </w:r>
+      <w:proofErr w:type="spellEnd"/>
+      <w:r>
+        <w:rPr>
+          <w:rFonts w:ascii="Times New Roman" w:eastAsia="Times New Roman" w:hAnsi="Times New Roman" w:cs="Times New Roman"/>
+          <w:sz w:val="24"/>
+          <w:szCs w:val="24"/>
+          <w:shd w:val="clear" w:color="auto" w:fill="FFFFFF"/>
+        </w:rPr>
+        <w:t xml:space="preserve">, A., &amp; </w:t>
+      </w:r>
+      <w:proofErr w:type="spellStart"/>
+      <w:r>
+        <w:rPr>
+          <w:rFonts w:ascii="Times New Roman" w:eastAsia="Times New Roman" w:hAnsi="Times New Roman" w:cs="Times New Roman"/>
+          <w:sz w:val="24"/>
+          <w:szCs w:val="24"/>
+          <w:shd w:val="clear" w:color="auto" w:fill="FFFFFF"/>
+        </w:rPr>
+        <w:t>Sabanwar</w:t>
+      </w:r>
+      <w:proofErr w:type="spellEnd"/>
+      <w:r>
+        <w:rPr>
+          <w:rFonts w:ascii="Times New Roman" w:eastAsia="Times New Roman" w:hAnsi="Times New Roman" w:cs="Times New Roman"/>
+          <w:sz w:val="24"/>
+          <w:szCs w:val="24"/>
+          <w:shd w:val="clear" w:color="auto" w:fill="FFFFFF"/>
+        </w:rPr>
+        <w:t>, V. (Under review). A Systematic Review of Empirical Research on AI in K-12 STEM Education (2020-2025) through a Sociotechnical Lens (Manuscript Number: ETRD-D-26-01416)</w:t>
       </w:r>
     </w:p>
     <w:p>
@@ -10694,6 +10786,7 @@
         </w:rPr>
         <w:t xml:space="preserve">, &amp; </w:t>
       </w:r>
+      <w:proofErr w:type="spellStart"/>
       <w:r>
         <w:rPr>
           <w:rFonts w:ascii="Times New Roman" w:eastAsia="Times New Roman" w:hAnsi="Times New Roman" w:cs="Times New Roman"/>
@@ -10701,8 +10794,9 @@
           <w:szCs w:val="24"/>
           <w:shd w:val="clear" w:color="auto" w:fill="FFFFFF"/>
         </w:rPr>
-        <w:t>Ghooreian, A</w:t>
-      </w:r>
+        <w:t>Ghooreian</w:t>
+      </w:r>
+      <w:proofErr w:type="spellEnd"/>
       <w:r>
         <w:rPr>
           <w:rFonts w:ascii="Times New Roman" w:eastAsia="Times New Roman" w:hAnsi="Times New Roman" w:cs="Times New Roman"/>
@@ -10710,6 +10804,15 @@
           <w:szCs w:val="24"/>
           <w:shd w:val="clear" w:color="auto" w:fill="FFFFFF"/>
         </w:rPr>
+        <w:t>, A</w:t>
+      </w:r>
+      <w:r>
+        <w:rPr>
+          <w:rFonts w:ascii="Times New Roman" w:eastAsia="Times New Roman" w:hAnsi="Times New Roman" w:cs="Times New Roman"/>
+          <w:sz w:val="24"/>
+          <w:szCs w:val="24"/>
+          <w:shd w:val="clear" w:color="auto" w:fill="FFFFFF"/>
+        </w:rPr>
         <w:t xml:space="preserve">. (Under review). </w:t>
       </w:r>
       <w:r>
@@ -10719,7 +10822,25 @@
           <w:szCs w:val="24"/>
           <w:shd w:val="clear" w:color="auto" w:fill="FFFFFF"/>
         </w:rPr>
-        <w:t>Embodied Arts-Integrated Al Literacy: A Nested Mixed-Methods Study</w:t>
+        <w:t>Embodied Arts-Integrated A</w:t>
+      </w:r>
+      <w:r>
+        <w:rPr>
+          <w:rFonts w:ascii="Times New Roman" w:eastAsia="Times New Roman" w:hAnsi="Times New Roman" w:cs="Times New Roman"/>
+          <w:sz w:val="24"/>
+          <w:szCs w:val="24"/>
+          <w:shd w:val="clear" w:color="auto" w:fill="FFFFFF"/>
+        </w:rPr>
+        <w:t>I</w:t>
+      </w:r>
+      <w:r>
+        <w:rPr>
+          <w:rFonts w:ascii="Times New Roman" w:eastAsia="Times New Roman" w:hAnsi="Times New Roman" w:cs="Times New Roman"/>
+          <w:sz w:val="24"/>
+          <w:szCs w:val="24"/>
+          <w:shd w:val="clear" w:color="auto" w:fill="FFFFFF"/>
+        </w:rPr>
+        <w:t xml:space="preserve"> Literacy: A Nested Mixed-Methods Study</w:t>
       </w:r>
     </w:p>
     <w:p>
@@ -10785,14 +10906,23 @@
           <w:sz w:val="24"/>
           <w:szCs w:val="24"/>
         </w:rPr>
-        <w:t>-003</w:t>
-      </w:r>
+        <w:t>-</w:t>
+      </w:r>
+      <w:proofErr w:type="gramStart"/>
       <w:r>
         <w:rPr>
           <w:rFonts w:ascii="Times New Roman" w:eastAsia="Times New Roman" w:hAnsi="Times New Roman" w:cs="Times New Roman"/>
           <w:sz w:val="24"/>
           <w:szCs w:val="24"/>
         </w:rPr>
+        <w:t>003</w:t>
+      </w:r>
+      <w:r>
+        <w:rPr>
+          <w:rFonts w:ascii="Times New Roman" w:eastAsia="Times New Roman" w:hAnsi="Times New Roman" w:cs="Times New Roman"/>
+          <w:sz w:val="24"/>
+          <w:szCs w:val="24"/>
+        </w:rPr>
         <w:t>61</w:t>
       </w:r>
       <w:r>
@@ -10804,6 +10934,7 @@
         </w:rPr>
         <w:t xml:space="preserve"> )</w:t>
       </w:r>
+      <w:proofErr w:type="gramEnd"/>
     </w:p>
     <w:p>
       <w:pPr>
@@ -10882,7 +11013,27 @@
           <w:szCs w:val="24"/>
           <w:shd w:val="clear" w:color="auto" w:fill="FFFFFF"/>
         </w:rPr>
-        <w:t xml:space="preserve">., Baah-Mintah, R., &amp; Ghooreian, A. (2026). Human-centered generative AI in education: ethical challenges and equity-driven solutions. Ethics &amp; Behavior, 1–27. </w:t>
+        <w:t xml:space="preserve">., Baah-Mintah, R., &amp; </w:t>
+      </w:r>
+      <w:proofErr w:type="spellStart"/>
+      <w:r>
+        <w:rPr>
+          <w:rFonts w:ascii="Times New Roman" w:eastAsia="Times New Roman" w:hAnsi="Times New Roman" w:cs="Times New Roman"/>
+          <w:sz w:val="24"/>
+          <w:szCs w:val="24"/>
+          <w:shd w:val="clear" w:color="auto" w:fill="FFFFFF"/>
+        </w:rPr>
+        <w:t>Ghooreian</w:t>
+      </w:r>
+      <w:proofErr w:type="spellEnd"/>
+      <w:r>
+        <w:rPr>
+          <w:rFonts w:ascii="Times New Roman" w:eastAsia="Times New Roman" w:hAnsi="Times New Roman" w:cs="Times New Roman"/>
+          <w:sz w:val="24"/>
+          <w:szCs w:val="24"/>
+          <w:shd w:val="clear" w:color="auto" w:fill="FFFFFF"/>
+        </w:rPr>
+        <w:t xml:space="preserve">, A. (2026). Human-centered generative AI in education: ethical challenges and equity-driven solutions. Ethics &amp; Behavior, 1–27. </w:t>
       </w:r>
       <w:hyperlink r:id="rId10" w:history="1">
         <w:r>
@@ -11025,7 +11176,27 @@
           <w:szCs w:val="24"/>
           <w:shd w:val="clear" w:color="auto" w:fill="FFFFFF"/>
         </w:rPr>
-        <w:t xml:space="preserve">Luo, F., Amayou, J., Nasrin, F., Abedini, P., Mousavi, V., Awoyemi, I. D., ... &amp; Crawford, C. (2026). Promoting elementary students’ computer science conceptual knowledge and coding performance: a mixed methods case study. </w:t>
+        <w:t xml:space="preserve">Luo, F., </w:t>
+      </w:r>
+      <w:proofErr w:type="spellStart"/>
+      <w:r>
+        <w:rPr>
+          <w:rFonts w:ascii="Times New Roman" w:eastAsia="Times New Roman" w:hAnsi="Times New Roman" w:cs="Times New Roman"/>
+          <w:sz w:val="24"/>
+          <w:szCs w:val="24"/>
+          <w:shd w:val="clear" w:color="auto" w:fill="FFFFFF"/>
+        </w:rPr>
+        <w:t>Amayou</w:t>
+      </w:r>
+      <w:proofErr w:type="spellEnd"/>
+      <w:r>
+        <w:rPr>
+          <w:rFonts w:ascii="Times New Roman" w:eastAsia="Times New Roman" w:hAnsi="Times New Roman" w:cs="Times New Roman"/>
+          <w:sz w:val="24"/>
+          <w:szCs w:val="24"/>
+          <w:shd w:val="clear" w:color="auto" w:fill="FFFFFF"/>
+        </w:rPr>
+        <w:t xml:space="preserve">, J., Nasrin, F., Abedini, P., Mousavi, V., Awoyemi, I. D., ... &amp; Crawford, C. (2026). Promoting elementary students’ computer science conceptual knowledge and coding performance: a mixed methods case study. </w:t>
       </w:r>
       <w:r>
         <w:rPr>
@@ -11343,13 +11514,31 @@
           <w:sz w:val="24"/>
           <w:szCs w:val="24"/>
         </w:rPr>
-        <w:t xml:space="preserve">Abu S., Yuvaraja H. K., Patiballa S. K., </w:t>
-      </w:r>
+        <w:t xml:space="preserve">Abu S., Yuvaraja H. K., </w:t>
+      </w:r>
+      <w:proofErr w:type="spellStart"/>
       <w:r>
         <w:rPr>
           <w:rFonts w:ascii="Times New Roman" w:eastAsia="Times New Roman" w:hAnsi="Times New Roman" w:cs="Times New Roman"/>
           <w:sz w:val="24"/>
           <w:szCs w:val="24"/>
+        </w:rPr>
+        <w:t>Patiballa</w:t>
+      </w:r>
+      <w:proofErr w:type="spellEnd"/>
+      <w:r>
+        <w:rPr>
+          <w:rFonts w:ascii="Times New Roman" w:eastAsia="Times New Roman" w:hAnsi="Times New Roman" w:cs="Times New Roman"/>
+          <w:sz w:val="24"/>
+          <w:szCs w:val="24"/>
+        </w:rPr>
+        <w:t xml:space="preserve"> S. K., </w:t>
+      </w:r>
+      <w:r>
+        <w:rPr>
+          <w:rFonts w:ascii="Times New Roman" w:eastAsia="Times New Roman" w:hAnsi="Times New Roman" w:cs="Times New Roman"/>
+          <w:sz w:val="24"/>
+          <w:szCs w:val="24"/>
           <w:shd w:val="clear" w:color="auto" w:fill="FFFFFF"/>
         </w:rPr>
         <w:t xml:space="preserve">&amp; Moon, J. (Under review). </w:t>
@@ -11371,6 +11560,7 @@
         </w:rPr>
         <w:t xml:space="preserve">. </w:t>
       </w:r>
+      <w:proofErr w:type="spellStart"/>
       <w:r>
         <w:rPr>
           <w:rFonts w:ascii="Times New Roman" w:eastAsia="Times New Roman" w:hAnsi="Times New Roman" w:cs="Times New Roman"/>
@@ -11379,6 +11569,7 @@
         </w:rPr>
         <w:t>TechTrends</w:t>
       </w:r>
+      <w:proofErr w:type="spellEnd"/>
       <w:r>
         <w:rPr>
           <w:rFonts w:ascii="Times New Roman" w:eastAsia="Times New Roman" w:hAnsi="Times New Roman" w:cs="Times New Roman"/>
@@ -11466,8 +11657,69 @@
           <w:szCs w:val="24"/>
           <w:shd w:val="clear" w:color="auto" w:fill="FFFFFF"/>
         </w:rPr>
-        <w:t xml:space="preserve">., &amp; Abu S. (2026). Decoding learning states in vr safety training: a bayesian cognitive diagnostic approach to microgenetic behavioral analytics. </w:t>
-      </w:r>
+        <w:t xml:space="preserve">., &amp; Abu S. (2026). Decoding learning states in </w:t>
+      </w:r>
+      <w:proofErr w:type="spellStart"/>
+      <w:r>
+        <w:rPr>
+          <w:rFonts w:ascii="Times New Roman" w:eastAsia="Times New Roman" w:hAnsi="Times New Roman" w:cs="Times New Roman"/>
+          <w:sz w:val="24"/>
+          <w:szCs w:val="24"/>
+          <w:shd w:val="clear" w:color="auto" w:fill="FFFFFF"/>
+        </w:rPr>
+        <w:t>vr</w:t>
+      </w:r>
+      <w:proofErr w:type="spellEnd"/>
+      <w:r>
+        <w:rPr>
+          <w:rFonts w:ascii="Times New Roman" w:eastAsia="Times New Roman" w:hAnsi="Times New Roman" w:cs="Times New Roman"/>
+          <w:sz w:val="24"/>
+          <w:szCs w:val="24"/>
+          <w:shd w:val="clear" w:color="auto" w:fill="FFFFFF"/>
+        </w:rPr>
+        <w:t xml:space="preserve"> safety training: a </w:t>
+      </w:r>
+      <w:proofErr w:type="spellStart"/>
+      <w:r>
+        <w:rPr>
+          <w:rFonts w:ascii="Times New Roman" w:eastAsia="Times New Roman" w:hAnsi="Times New Roman" w:cs="Times New Roman"/>
+          <w:sz w:val="24"/>
+          <w:szCs w:val="24"/>
+          <w:shd w:val="clear" w:color="auto" w:fill="FFFFFF"/>
+        </w:rPr>
+        <w:t>bayesian</w:t>
+      </w:r>
+      <w:proofErr w:type="spellEnd"/>
+      <w:r>
+        <w:rPr>
+          <w:rFonts w:ascii="Times New Roman" w:eastAsia="Times New Roman" w:hAnsi="Times New Roman" w:cs="Times New Roman"/>
+          <w:sz w:val="24"/>
+          <w:szCs w:val="24"/>
+          <w:shd w:val="clear" w:color="auto" w:fill="FFFFFF"/>
+        </w:rPr>
+        <w:t xml:space="preserve"> cognitive diagnostic approach to </w:t>
+      </w:r>
+      <w:proofErr w:type="spellStart"/>
+      <w:r>
+        <w:rPr>
+          <w:rFonts w:ascii="Times New Roman" w:eastAsia="Times New Roman" w:hAnsi="Times New Roman" w:cs="Times New Roman"/>
+          <w:sz w:val="24"/>
+          <w:szCs w:val="24"/>
+          <w:shd w:val="clear" w:color="auto" w:fill="FFFFFF"/>
+        </w:rPr>
+        <w:t>microgenetic</w:t>
+      </w:r>
+      <w:proofErr w:type="spellEnd"/>
+      <w:r>
+        <w:rPr>
+          <w:rFonts w:ascii="Times New Roman" w:eastAsia="Times New Roman" w:hAnsi="Times New Roman" w:cs="Times New Roman"/>
+          <w:sz w:val="24"/>
+          <w:szCs w:val="24"/>
+          <w:shd w:val="clear" w:color="auto" w:fill="FFFFFF"/>
+        </w:rPr>
+        <w:t xml:space="preserve"> behavioral analytics. </w:t>
+      </w:r>
+      <w:proofErr w:type="spellStart"/>
       <w:r>
         <w:rPr>
           <w:rFonts w:ascii="Times New Roman" w:eastAsia="Times New Roman" w:hAnsi="Times New Roman" w:cs="Times New Roman"/>
@@ -11477,7 +11729,19 @@
           <w:szCs w:val="24"/>
           <w:shd w:val="clear" w:color="auto" w:fill="FFFFFF"/>
         </w:rPr>
-        <w:t>Behaviourmetrika.</w:t>
+        <w:t>Behaviourmetrika</w:t>
+      </w:r>
+      <w:proofErr w:type="spellEnd"/>
+      <w:r>
+        <w:rPr>
+          <w:rFonts w:ascii="Times New Roman" w:eastAsia="Times New Roman" w:hAnsi="Times New Roman" w:cs="Times New Roman"/>
+          <w:i/>
+          <w:iCs/>
+          <w:sz w:val="24"/>
+          <w:szCs w:val="24"/>
+          <w:shd w:val="clear" w:color="auto" w:fill="FFFFFF"/>
+        </w:rPr>
+        <w:t>.</w:t>
       </w:r>
       <w:r>
         <w:rPr>
@@ -11875,7 +12139,47 @@
           <w:szCs w:val="24"/>
           <w:shd w:val="clear" w:color="auto" w:fill="FFFFFF"/>
         </w:rPr>
-        <w:t>., Ghooreian, A., &amp; Ramenzapour, E. (2025). A Systematic Review of Technology‐Enhanced Learning Approaches to Foster Construction Engineering and Management Competencies. </w:t>
+        <w:t xml:space="preserve">., </w:t>
+      </w:r>
+      <w:proofErr w:type="spellStart"/>
+      <w:r>
+        <w:rPr>
+          <w:rFonts w:ascii="Times New Roman" w:eastAsia="Times New Roman" w:hAnsi="Times New Roman" w:cs="Times New Roman"/>
+          <w:sz w:val="24"/>
+          <w:szCs w:val="24"/>
+          <w:shd w:val="clear" w:color="auto" w:fill="FFFFFF"/>
+        </w:rPr>
+        <w:t>Ghooreian</w:t>
+      </w:r>
+      <w:proofErr w:type="spellEnd"/>
+      <w:r>
+        <w:rPr>
+          <w:rFonts w:ascii="Times New Roman" w:eastAsia="Times New Roman" w:hAnsi="Times New Roman" w:cs="Times New Roman"/>
+          <w:sz w:val="24"/>
+          <w:szCs w:val="24"/>
+          <w:shd w:val="clear" w:color="auto" w:fill="FFFFFF"/>
+        </w:rPr>
+        <w:t xml:space="preserve">, A., &amp; </w:t>
+      </w:r>
+      <w:proofErr w:type="spellStart"/>
+      <w:r>
+        <w:rPr>
+          <w:rFonts w:ascii="Times New Roman" w:eastAsia="Times New Roman" w:hAnsi="Times New Roman" w:cs="Times New Roman"/>
+          <w:sz w:val="24"/>
+          <w:szCs w:val="24"/>
+          <w:shd w:val="clear" w:color="auto" w:fill="FFFFFF"/>
+        </w:rPr>
+        <w:t>Ramenzapour</w:t>
+      </w:r>
+      <w:proofErr w:type="spellEnd"/>
+      <w:r>
+        <w:rPr>
+          <w:rFonts w:ascii="Times New Roman" w:eastAsia="Times New Roman" w:hAnsi="Times New Roman" w:cs="Times New Roman"/>
+          <w:sz w:val="24"/>
+          <w:szCs w:val="24"/>
+          <w:shd w:val="clear" w:color="auto" w:fill="FFFFFF"/>
+        </w:rPr>
+        <w:t>, E. (2025). A Systematic Review of Technology‐Enhanced Learning Approaches to Foster Construction Engineering and Management Competencies. </w:t>
       </w:r>
       <w:r>
         <w:rPr>
@@ -12206,7 +12510,47 @@
           <w:szCs w:val="24"/>
           <w:shd w:val="clear" w:color="auto" w:fill="FFFFFF"/>
         </w:rPr>
-        <w:t>., Gwandu, Z. L., Isah, S., &amp; Murtala, A. (2024). Effect of parental socio-economic background on secondary school students career choice in kebbi state, nigeria.</w:t>
+        <w:t xml:space="preserve">., Gwandu, Z. L., Isah, S., &amp; Murtala, A. (2024). Effect of parental socio-economic background on secondary school students career choice in </w:t>
+      </w:r>
+      <w:proofErr w:type="spellStart"/>
+      <w:r>
+        <w:rPr>
+          <w:rFonts w:ascii="Times New Roman" w:eastAsia="Calibri" w:hAnsi="Times New Roman" w:cs="Times New Roman"/>
+          <w:sz w:val="24"/>
+          <w:szCs w:val="24"/>
+          <w:shd w:val="clear" w:color="auto" w:fill="FFFFFF"/>
+        </w:rPr>
+        <w:t>kebbi</w:t>
+      </w:r>
+      <w:proofErr w:type="spellEnd"/>
+      <w:r>
+        <w:rPr>
+          <w:rFonts w:ascii="Times New Roman" w:eastAsia="Calibri" w:hAnsi="Times New Roman" w:cs="Times New Roman"/>
+          <w:sz w:val="24"/>
+          <w:szCs w:val="24"/>
+          <w:shd w:val="clear" w:color="auto" w:fill="FFFFFF"/>
+        </w:rPr>
+        <w:t xml:space="preserve"> state, </w:t>
+      </w:r>
+      <w:proofErr w:type="spellStart"/>
+      <w:r>
+        <w:rPr>
+          <w:rFonts w:ascii="Times New Roman" w:eastAsia="Calibri" w:hAnsi="Times New Roman" w:cs="Times New Roman"/>
+          <w:sz w:val="24"/>
+          <w:szCs w:val="24"/>
+          <w:shd w:val="clear" w:color="auto" w:fill="FFFFFF"/>
+        </w:rPr>
+        <w:t>nigeria</w:t>
+      </w:r>
+      <w:proofErr w:type="spellEnd"/>
+      <w:r>
+        <w:rPr>
+          <w:rFonts w:ascii="Times New Roman" w:eastAsia="Calibri" w:hAnsi="Times New Roman" w:cs="Times New Roman"/>
+          <w:sz w:val="24"/>
+          <w:szCs w:val="24"/>
+          <w:shd w:val="clear" w:color="auto" w:fill="FFFFFF"/>
+        </w:rPr>
+        <w:t>.</w:t>
       </w:r>
       <w:r>
         <w:rPr>
@@ -12250,6 +12594,7 @@
         </w:rPr>
         <w:t xml:space="preserve">[4] </w:t>
       </w:r>
+      <w:proofErr w:type="spellStart"/>
       <w:r>
         <w:rPr>
           <w:rFonts w:ascii="Times New Roman" w:eastAsia="Calibri" w:hAnsi="Times New Roman" w:cs="Times New Roman"/>
@@ -12257,7 +12602,37 @@
           <w:sz w:val="24"/>
           <w:szCs w:val="24"/>
         </w:rPr>
-        <w:t xml:space="preserve">Falode, O.C.; Ilufoye, T. O.; </w:t>
+        <w:t>Falode</w:t>
+      </w:r>
+      <w:proofErr w:type="spellEnd"/>
+      <w:r>
+        <w:rPr>
+          <w:rFonts w:ascii="Times New Roman" w:eastAsia="Calibri" w:hAnsi="Times New Roman" w:cs="Times New Roman"/>
+          <w:bCs/>
+          <w:sz w:val="24"/>
+          <w:szCs w:val="24"/>
+        </w:rPr>
+        <w:t xml:space="preserve">, O.C.; </w:t>
+      </w:r>
+      <w:proofErr w:type="spellStart"/>
+      <w:r>
+        <w:rPr>
+          <w:rFonts w:ascii="Times New Roman" w:eastAsia="Calibri" w:hAnsi="Times New Roman" w:cs="Times New Roman"/>
+          <w:bCs/>
+          <w:sz w:val="24"/>
+          <w:szCs w:val="24"/>
+        </w:rPr>
+        <w:t>Ilufoye</w:t>
+      </w:r>
+      <w:proofErr w:type="spellEnd"/>
+      <w:r>
+        <w:rPr>
+          <w:rFonts w:ascii="Times New Roman" w:eastAsia="Calibri" w:hAnsi="Times New Roman" w:cs="Times New Roman"/>
+          <w:bCs/>
+          <w:sz w:val="24"/>
+          <w:szCs w:val="24"/>
+        </w:rPr>
+        <w:t xml:space="preserve">, T. O.; </w:t>
       </w:r>
       <w:r>
         <w:rPr>
@@ -12320,6 +12695,7 @@
         </w:rPr>
         <w:t xml:space="preserve">[3] </w:t>
       </w:r>
+      <w:proofErr w:type="spellStart"/>
       <w:r>
         <w:rPr>
           <w:rFonts w:ascii="Times New Roman" w:eastAsia="Calibri" w:hAnsi="Times New Roman" w:cs="Times New Roman"/>
@@ -12327,7 +12703,17 @@
           <w:sz w:val="24"/>
           <w:szCs w:val="24"/>
         </w:rPr>
-        <w:t xml:space="preserve">Falode, O.C.; </w:t>
+        <w:t>Falode</w:t>
+      </w:r>
+      <w:proofErr w:type="spellEnd"/>
+      <w:r>
+        <w:rPr>
+          <w:rFonts w:ascii="Times New Roman" w:eastAsia="Calibri" w:hAnsi="Times New Roman" w:cs="Times New Roman"/>
+          <w:bCs/>
+          <w:sz w:val="24"/>
+          <w:szCs w:val="24"/>
+        </w:rPr>
+        <w:t xml:space="preserve">, O.C.; </w:t>
       </w:r>
       <w:r>
         <w:rPr>
@@ -12339,6 +12725,7 @@
         </w:rPr>
         <w:t xml:space="preserve">Awoyemi, I. D.; </w:t>
       </w:r>
+      <w:proofErr w:type="spellStart"/>
       <w:r>
         <w:rPr>
           <w:rFonts w:ascii="Times New Roman" w:eastAsia="Calibri" w:hAnsi="Times New Roman" w:cs="Times New Roman"/>
@@ -12346,7 +12733,17 @@
           <w:sz w:val="24"/>
           <w:szCs w:val="24"/>
         </w:rPr>
-        <w:t>Ilufoye, T. O.</w:t>
+        <w:t>Ilufoye</w:t>
+      </w:r>
+      <w:proofErr w:type="spellEnd"/>
+      <w:r>
+        <w:rPr>
+          <w:rFonts w:ascii="Times New Roman" w:eastAsia="Calibri" w:hAnsi="Times New Roman" w:cs="Times New Roman"/>
+          <w:bCs/>
+          <w:sz w:val="24"/>
+          <w:szCs w:val="24"/>
+        </w:rPr>
+        <w:t>, T. O.</w:t>
       </w:r>
       <w:r>
         <w:rPr>
@@ -12376,7 +12773,31 @@
           <w:sz w:val="24"/>
           <w:szCs w:val="24"/>
         </w:rPr>
-        <w:t>Al-Himah Journal of Education, 2(</w:t>
+        <w:t>Al-</w:t>
+      </w:r>
+      <w:proofErr w:type="spellStart"/>
+      <w:r>
+        <w:rPr>
+          <w:rFonts w:ascii="Times New Roman" w:eastAsia="Calibri" w:hAnsi="Times New Roman" w:cs="Times New Roman"/>
+          <w:bCs/>
+          <w:i/>
+          <w:iCs/>
+          <w:sz w:val="24"/>
+          <w:szCs w:val="24"/>
+        </w:rPr>
+        <w:t>Himah</w:t>
+      </w:r>
+      <w:proofErr w:type="spellEnd"/>
+      <w:r>
+        <w:rPr>
+          <w:rFonts w:ascii="Times New Roman" w:eastAsia="Calibri" w:hAnsi="Times New Roman" w:cs="Times New Roman"/>
+          <w:bCs/>
+          <w:i/>
+          <w:iCs/>
+          <w:sz w:val="24"/>
+          <w:szCs w:val="24"/>
+        </w:rPr>
+        <w:t xml:space="preserve"> Journal of Education, 2(</w:t>
       </w:r>
       <w:r>
         <w:rPr>
@@ -12410,6 +12831,7 @@
         </w:rPr>
         <w:t xml:space="preserve">[2] </w:t>
       </w:r>
+      <w:proofErr w:type="spellStart"/>
       <w:r>
         <w:rPr>
           <w:rFonts w:ascii="Times New Roman" w:eastAsia="Calibri" w:hAnsi="Times New Roman" w:cs="Times New Roman"/>
@@ -12417,7 +12839,37 @@
           <w:sz w:val="24"/>
           <w:szCs w:val="24"/>
         </w:rPr>
-        <w:t xml:space="preserve">Falode, O.C.; Gambari, A.I.; Shittu, T.; Gimba, R.W.; Falode, M.E. &amp; </w:t>
+        <w:t>Falode</w:t>
+      </w:r>
+      <w:proofErr w:type="spellEnd"/>
+      <w:r>
+        <w:rPr>
+          <w:rFonts w:ascii="Times New Roman" w:eastAsia="Calibri" w:hAnsi="Times New Roman" w:cs="Times New Roman"/>
+          <w:bCs/>
+          <w:sz w:val="24"/>
+          <w:szCs w:val="24"/>
+        </w:rPr>
+        <w:t xml:space="preserve">, O.C.; Gambari, A.I.; Shittu, T.; Gimba, R.W.; </w:t>
+      </w:r>
+      <w:proofErr w:type="spellStart"/>
+      <w:r>
+        <w:rPr>
+          <w:rFonts w:ascii="Times New Roman" w:eastAsia="Calibri" w:hAnsi="Times New Roman" w:cs="Times New Roman"/>
+          <w:bCs/>
+          <w:sz w:val="24"/>
+          <w:szCs w:val="24"/>
+        </w:rPr>
+        <w:t>Falode</w:t>
+      </w:r>
+      <w:proofErr w:type="spellEnd"/>
+      <w:r>
+        <w:rPr>
+          <w:rFonts w:ascii="Times New Roman" w:eastAsia="Calibri" w:hAnsi="Times New Roman" w:cs="Times New Roman"/>
+          <w:bCs/>
+          <w:sz w:val="24"/>
+          <w:szCs w:val="24"/>
+        </w:rPr>
+        <w:t xml:space="preserve">, M.E. &amp; </w:t>
       </w:r>
       <w:r>
         <w:rPr>
@@ -12436,7 +12888,27 @@
           <w:sz w:val="24"/>
           <w:szCs w:val="24"/>
         </w:rPr>
-        <w:t xml:space="preserve">  (2015). Effectiveness of virtual classroom in teaching and learning of senior secondary school mathematics concepts in minna. </w:t>
+        <w:t xml:space="preserve">  (2015). Effectiveness of virtual classroom in teaching and learning of senior secondary school mathematics concepts in </w:t>
+      </w:r>
+      <w:proofErr w:type="spellStart"/>
+      <w:r>
+        <w:rPr>
+          <w:rFonts w:ascii="Times New Roman" w:eastAsia="Calibri" w:hAnsi="Times New Roman" w:cs="Times New Roman"/>
+          <w:bCs/>
+          <w:sz w:val="24"/>
+          <w:szCs w:val="24"/>
+        </w:rPr>
+        <w:t>minna</w:t>
+      </w:r>
+      <w:proofErr w:type="spellEnd"/>
+      <w:r>
+        <w:rPr>
+          <w:rFonts w:ascii="Times New Roman" w:eastAsia="Calibri" w:hAnsi="Times New Roman" w:cs="Times New Roman"/>
+          <w:bCs/>
+          <w:sz w:val="24"/>
+          <w:szCs w:val="24"/>
+        </w:rPr>
+        <w:t xml:space="preserve">. </w:t>
       </w:r>
       <w:r>
         <w:rPr>
@@ -12478,6 +12950,7 @@
         </w:rPr>
         <w:t xml:space="preserve">[1] </w:t>
       </w:r>
+      <w:proofErr w:type="spellStart"/>
       <w:r>
         <w:rPr>
           <w:rFonts w:ascii="Times New Roman" w:eastAsia="Calibri" w:hAnsi="Times New Roman" w:cs="Times New Roman"/>
@@ -12485,7 +12958,37 @@
           <w:sz w:val="24"/>
           <w:szCs w:val="24"/>
         </w:rPr>
-        <w:t xml:space="preserve">Falode, O.C.; Usman, Z.N.; Ilufoye, T. O.  &amp; </w:t>
+        <w:t>Falode</w:t>
+      </w:r>
+      <w:proofErr w:type="spellEnd"/>
+      <w:r>
+        <w:rPr>
+          <w:rFonts w:ascii="Times New Roman" w:eastAsia="Calibri" w:hAnsi="Times New Roman" w:cs="Times New Roman"/>
+          <w:bCs/>
+          <w:sz w:val="24"/>
+          <w:szCs w:val="24"/>
+        </w:rPr>
+        <w:t xml:space="preserve">, O.C.; Usman, Z.N.; </w:t>
+      </w:r>
+      <w:proofErr w:type="spellStart"/>
+      <w:r>
+        <w:rPr>
+          <w:rFonts w:ascii="Times New Roman" w:eastAsia="Calibri" w:hAnsi="Times New Roman" w:cs="Times New Roman"/>
+          <w:bCs/>
+          <w:sz w:val="24"/>
+          <w:szCs w:val="24"/>
+        </w:rPr>
+        <w:t>Ilufoye</w:t>
+      </w:r>
+      <w:proofErr w:type="spellEnd"/>
+      <w:r>
+        <w:rPr>
+          <w:rFonts w:ascii="Times New Roman" w:eastAsia="Calibri" w:hAnsi="Times New Roman" w:cs="Times New Roman"/>
+          <w:bCs/>
+          <w:sz w:val="24"/>
+          <w:szCs w:val="24"/>
+        </w:rPr>
+        <w:t xml:space="preserve">, T. O.  &amp; </w:t>
       </w:r>
       <w:r>
         <w:rPr>
@@ -12916,7 +13419,47 @@
           <w:szCs w:val="24"/>
           <w:shd w:val="clear" w:color="auto" w:fill="FFFFFF"/>
         </w:rPr>
-        <w:t xml:space="preserve">Abu, S., Ghooreian, A., Ogunniran, M., </w:t>
+        <w:t xml:space="preserve">Abu, S., </w:t>
+      </w:r>
+      <w:proofErr w:type="spellStart"/>
+      <w:r>
+        <w:rPr>
+          <w:rFonts w:ascii="Times New Roman" w:eastAsia="Times New Roman" w:hAnsi="Times New Roman" w:cs="Times New Roman"/>
+          <w:sz w:val="24"/>
+          <w:szCs w:val="24"/>
+          <w:shd w:val="clear" w:color="auto" w:fill="FFFFFF"/>
+        </w:rPr>
+        <w:t>Ghooreian</w:t>
+      </w:r>
+      <w:proofErr w:type="spellEnd"/>
+      <w:r>
+        <w:rPr>
+          <w:rFonts w:ascii="Times New Roman" w:eastAsia="Times New Roman" w:hAnsi="Times New Roman" w:cs="Times New Roman"/>
+          <w:sz w:val="24"/>
+          <w:szCs w:val="24"/>
+          <w:shd w:val="clear" w:color="auto" w:fill="FFFFFF"/>
+        </w:rPr>
+        <w:t xml:space="preserve">, A., </w:t>
+      </w:r>
+      <w:proofErr w:type="spellStart"/>
+      <w:r>
+        <w:rPr>
+          <w:rFonts w:ascii="Times New Roman" w:eastAsia="Times New Roman" w:hAnsi="Times New Roman" w:cs="Times New Roman"/>
+          <w:sz w:val="24"/>
+          <w:szCs w:val="24"/>
+          <w:shd w:val="clear" w:color="auto" w:fill="FFFFFF"/>
+        </w:rPr>
+        <w:t>Ogunniran</w:t>
+      </w:r>
+      <w:proofErr w:type="spellEnd"/>
+      <w:r>
+        <w:rPr>
+          <w:rFonts w:ascii="Times New Roman" w:eastAsia="Times New Roman" w:hAnsi="Times New Roman" w:cs="Times New Roman"/>
+          <w:sz w:val="24"/>
+          <w:szCs w:val="24"/>
+          <w:shd w:val="clear" w:color="auto" w:fill="FFFFFF"/>
+        </w:rPr>
+        <w:t xml:space="preserve">, M., </w:t>
       </w:r>
       <w:r>
         <w:rPr>
@@ -12980,7 +13523,67 @@
           <w:szCs w:val="24"/>
           <w:shd w:val="clear" w:color="auto" w:fill="FFFFFF"/>
         </w:rPr>
-        <w:t xml:space="preserve">., &amp; Ilufoye, T. O. (2020). Maximizing virtual classroom for effective teaching. In O. C. Falode (Ed.), Novel practices in education (pp. 96 -115). Novel Education Research Group. </w:t>
+        <w:t xml:space="preserve">., &amp; </w:t>
+      </w:r>
+      <w:proofErr w:type="spellStart"/>
+      <w:r>
+        <w:rPr>
+          <w:rFonts w:ascii="Times New Roman" w:eastAsia="Times New Roman" w:hAnsi="Times New Roman" w:cs="Times New Roman"/>
+          <w:sz w:val="24"/>
+          <w:szCs w:val="24"/>
+          <w:shd w:val="clear" w:color="auto" w:fill="FFFFFF"/>
+        </w:rPr>
+        <w:t>Ilufoye</w:t>
+      </w:r>
+      <w:proofErr w:type="spellEnd"/>
+      <w:r>
+        <w:rPr>
+          <w:rFonts w:ascii="Times New Roman" w:eastAsia="Times New Roman" w:hAnsi="Times New Roman" w:cs="Times New Roman"/>
+          <w:sz w:val="24"/>
+          <w:szCs w:val="24"/>
+          <w:shd w:val="clear" w:color="auto" w:fill="FFFFFF"/>
+        </w:rPr>
+        <w:t xml:space="preserve">, T. O. (2020). Maximizing virtual </w:t>
+      </w:r>
+      <w:proofErr w:type="gramStart"/>
+      <w:r>
+        <w:rPr>
+          <w:rFonts w:ascii="Times New Roman" w:eastAsia="Times New Roman" w:hAnsi="Times New Roman" w:cs="Times New Roman"/>
+          <w:sz w:val="24"/>
+          <w:szCs w:val="24"/>
+          <w:shd w:val="clear" w:color="auto" w:fill="FFFFFF"/>
+        </w:rPr>
+        <w:t>classroom</w:t>
+      </w:r>
+      <w:proofErr w:type="gramEnd"/>
+      <w:r>
+        <w:rPr>
+          <w:rFonts w:ascii="Times New Roman" w:eastAsia="Times New Roman" w:hAnsi="Times New Roman" w:cs="Times New Roman"/>
+          <w:sz w:val="24"/>
+          <w:szCs w:val="24"/>
+          <w:shd w:val="clear" w:color="auto" w:fill="FFFFFF"/>
+        </w:rPr>
+        <w:t xml:space="preserve"> for effective teaching. In O. C. </w:t>
+      </w:r>
+      <w:proofErr w:type="spellStart"/>
+      <w:r>
+        <w:rPr>
+          <w:rFonts w:ascii="Times New Roman" w:eastAsia="Times New Roman" w:hAnsi="Times New Roman" w:cs="Times New Roman"/>
+          <w:sz w:val="24"/>
+          <w:szCs w:val="24"/>
+          <w:shd w:val="clear" w:color="auto" w:fill="FFFFFF"/>
+        </w:rPr>
+        <w:t>Falode</w:t>
+      </w:r>
+      <w:proofErr w:type="spellEnd"/>
+      <w:r>
+        <w:rPr>
+          <w:rFonts w:ascii="Times New Roman" w:eastAsia="Times New Roman" w:hAnsi="Times New Roman" w:cs="Times New Roman"/>
+          <w:sz w:val="24"/>
+          <w:szCs w:val="24"/>
+          <w:shd w:val="clear" w:color="auto" w:fill="FFFFFF"/>
+        </w:rPr>
+        <w:t xml:space="preserve"> (Ed.), Novel practices in education (pp. 96 -115). Novel Education Research Group. </w:t>
       </w:r>
     </w:p>
     <w:p>
@@ -13089,7 +13692,29 @@
           <w:sz w:val="24"/>
           <w:szCs w:val="24"/>
         </w:rPr>
-        <w:t>Unpacking in-VR learning dynamics for heat stress training: A microgenetic and sequential behavior analysis</w:t>
+        <w:t xml:space="preserve">Unpacking in-VR learning dynamics for heat stress training: A </w:t>
+      </w:r>
+      <w:proofErr w:type="spellStart"/>
+      <w:r>
+        <w:rPr>
+          <w:rFonts w:ascii="Times New Roman" w:eastAsia="Times New Roman" w:hAnsi="Times New Roman" w:cs="Times New Roman"/>
+          <w:i/>
+          <w:iCs/>
+          <w:sz w:val="24"/>
+          <w:szCs w:val="24"/>
+        </w:rPr>
+        <w:t>microgenetic</w:t>
+      </w:r>
+      <w:proofErr w:type="spellEnd"/>
+      <w:r>
+        <w:rPr>
+          <w:rFonts w:ascii="Times New Roman" w:eastAsia="Times New Roman" w:hAnsi="Times New Roman" w:cs="Times New Roman"/>
+          <w:i/>
+          <w:iCs/>
+          <w:sz w:val="24"/>
+          <w:szCs w:val="24"/>
+        </w:rPr>
+        <w:t xml:space="preserve"> and sequential behavior analysis</w:t>
       </w:r>
       <w:r>
         <w:rPr>
@@ -13365,7 +13990,25 @@
           <w:sz w:val="24"/>
           <w:szCs w:val="24"/>
         </w:rPr>
-        <w:t xml:space="preserve">Nasrin, F., Amayou, J., </w:t>
+        <w:t xml:space="preserve">Nasrin, F., </w:t>
+      </w:r>
+      <w:proofErr w:type="spellStart"/>
+      <w:r>
+        <w:rPr>
+          <w:rFonts w:ascii="Times New Roman" w:eastAsia="Times New Roman" w:hAnsi="Times New Roman" w:cs="Times New Roman"/>
+          <w:sz w:val="24"/>
+          <w:szCs w:val="24"/>
+        </w:rPr>
+        <w:t>Amayou</w:t>
+      </w:r>
+      <w:proofErr w:type="spellEnd"/>
+      <w:r>
+        <w:rPr>
+          <w:rFonts w:ascii="Times New Roman" w:eastAsia="Times New Roman" w:hAnsi="Times New Roman" w:cs="Times New Roman"/>
+          <w:sz w:val="24"/>
+          <w:szCs w:val="24"/>
+        </w:rPr>
+        <w:t xml:space="preserve">, J., </w:t>
       </w:r>
       <w:r>
         <w:rPr>
@@ -13443,7 +14086,25 @@
           <w:sz w:val="24"/>
           <w:szCs w:val="24"/>
         </w:rPr>
-        <w:t xml:space="preserve">Abu, S., Ghooreian, A., </w:t>
+        <w:t xml:space="preserve">Abu, S., </w:t>
+      </w:r>
+      <w:proofErr w:type="spellStart"/>
+      <w:r>
+        <w:rPr>
+          <w:rFonts w:ascii="Times New Roman" w:eastAsia="Times New Roman" w:hAnsi="Times New Roman" w:cs="Times New Roman"/>
+          <w:sz w:val="24"/>
+          <w:szCs w:val="24"/>
+        </w:rPr>
+        <w:t>Ghooreian</w:t>
+      </w:r>
+      <w:proofErr w:type="spellEnd"/>
+      <w:r>
+        <w:rPr>
+          <w:rFonts w:ascii="Times New Roman" w:eastAsia="Times New Roman" w:hAnsi="Times New Roman" w:cs="Times New Roman"/>
+          <w:sz w:val="24"/>
+          <w:szCs w:val="24"/>
+        </w:rPr>
+        <w:t xml:space="preserve">, A., </w:t>
       </w:r>
       <w:r>
         <w:rPr>
@@ -13819,7 +14480,7 @@
           <w:sz w:val="24"/>
           <w:szCs w:val="24"/>
         </w:rPr>
-        <w:t>. D, &amp; Moon, J. (AECT, 2025 October). Preliminary Design and Development of Al-Enhanced VR Spring Dynamics Simulations to Foster Metacognitive Regulation in Engineering Education. Poster Presentation.</w:t>
+        <w:t>. D, &amp; Moon, J. (AECT, 2025 October). Preliminary Design and Development of AI-Enhanced VR Spring Dynamics Simulations to Foster Metacognitive Regulation in Engineering Education. Poster Presentation.</w:t>
       </w:r>
     </w:p>
     <w:p>
@@ -13870,7 +14531,25 @@
           <w:sz w:val="24"/>
           <w:szCs w:val="24"/>
         </w:rPr>
-        <w:t>. D, Abu, S., Yuvaraja, H., Moon, J., Patiballa, S. (AECT, 2025 October). Exploring fidelity dimensions in extended reality technologies for mechanical engineering education: A systematic review, Concurrent Session, (Paper Presentation).</w:t>
+        <w:t xml:space="preserve">. D, Abu, S., Yuvaraja, H., Moon, J., </w:t>
+      </w:r>
+      <w:proofErr w:type="spellStart"/>
+      <w:r>
+        <w:rPr>
+          <w:rFonts w:ascii="Times New Roman" w:eastAsia="Calibri" w:hAnsi="Times New Roman" w:cs="Times New Roman"/>
+          <w:sz w:val="24"/>
+          <w:szCs w:val="24"/>
+        </w:rPr>
+        <w:t>Patiballa</w:t>
+      </w:r>
+      <w:proofErr w:type="spellEnd"/>
+      <w:r>
+        <w:rPr>
+          <w:rFonts w:ascii="Times New Roman" w:eastAsia="Calibri" w:hAnsi="Times New Roman" w:cs="Times New Roman"/>
+          <w:sz w:val="24"/>
+          <w:szCs w:val="24"/>
+        </w:rPr>
+        <w:t>, S. (AECT, 2025 October). Exploring fidelity dimensions in extended reality technologies for mechanical engineering education: A systematic review, Concurrent Session, (Paper Presentation).</w:t>
       </w:r>
     </w:p>
     <w:p>
@@ -13945,7 +14624,31 @@
           <w:szCs w:val="24"/>
           <w:shd w:val="clear" w:color="auto" w:fill="FFFFFF"/>
         </w:rPr>
-        <w:t>Teaching and Learning with AI: A Sharing Conference Between Educational Practitioners</w:t>
+        <w:t xml:space="preserve">Teaching and </w:t>
+      </w:r>
+      <w:proofErr w:type="gramStart"/>
+      <w:r>
+        <w:rPr>
+          <w:rFonts w:ascii="Times New Roman" w:eastAsia="Times New Roman" w:hAnsi="Times New Roman" w:cs="Times New Roman"/>
+          <w:i/>
+          <w:iCs/>
+          <w:sz w:val="24"/>
+          <w:szCs w:val="24"/>
+          <w:shd w:val="clear" w:color="auto" w:fill="FFFFFF"/>
+        </w:rPr>
+        <w:t>Learning</w:t>
+      </w:r>
+      <w:proofErr w:type="gramEnd"/>
+      <w:r>
+        <w:rPr>
+          <w:rFonts w:ascii="Times New Roman" w:eastAsia="Times New Roman" w:hAnsi="Times New Roman" w:cs="Times New Roman"/>
+          <w:i/>
+          <w:iCs/>
+          <w:sz w:val="24"/>
+          <w:szCs w:val="24"/>
+          <w:shd w:val="clear" w:color="auto" w:fill="FFFFFF"/>
+        </w:rPr>
+        <w:t xml:space="preserve"> with AI: A Sharing Conference Between Educational Practitioners</w:t>
       </w:r>
       <w:r>
         <w:rPr>
@@ -14217,6 +14920,7 @@
         </w:rPr>
         <w:t xml:space="preserve">., </w:t>
       </w:r>
+      <w:proofErr w:type="spellStart"/>
       <w:r>
         <w:rPr>
           <w:rFonts w:ascii="Times New Roman" w:eastAsia="Calibri" w:hAnsi="Times New Roman" w:cs="Times New Roman"/>
@@ -14226,7 +14930,19 @@
           <w:u w:val="single"/>
           <w:shd w:val="clear" w:color="auto" w:fill="FFFFFF"/>
         </w:rPr>
-        <w:t>Unggi Lee., &amp;</w:t>
+        <w:t>Unggi</w:t>
+      </w:r>
+      <w:proofErr w:type="spellEnd"/>
+      <w:r>
+        <w:rPr>
+          <w:rFonts w:ascii="Times New Roman" w:eastAsia="Calibri" w:hAnsi="Times New Roman" w:cs="Times New Roman"/>
+          <w:spacing w:val="7"/>
+          <w:sz w:val="24"/>
+          <w:szCs w:val="24"/>
+          <w:u w:val="single"/>
+          <w:shd w:val="clear" w:color="auto" w:fill="FFFFFF"/>
+        </w:rPr>
+        <w:t xml:space="preserve"> Lee., &amp;</w:t>
       </w:r>
       <w:r>
         <w:rPr>
@@ -14617,6 +15333,7 @@
         </w:rPr>
         <w:t xml:space="preserve"> </w:t>
       </w:r>
+      <w:proofErr w:type="spellStart"/>
       <w:r>
         <w:rPr>
           <w:rFonts w:ascii="Times New Roman" w:eastAsia="Calibri" w:hAnsi="Times New Roman" w:cs="Times New Roman"/>
@@ -14625,7 +15342,18 @@
           <w:bdr w:val="none" w:sz="0" w:space="0" w:color="auto" w:frame="1"/>
           <w:shd w:val="clear" w:color="auto" w:fill="FFFFFF"/>
         </w:rPr>
-        <w:t>Ijeluola, S.</w:t>
+        <w:t>Ijeluola</w:t>
+      </w:r>
+      <w:proofErr w:type="spellEnd"/>
+      <w:r>
+        <w:rPr>
+          <w:rFonts w:ascii="Times New Roman" w:eastAsia="Calibri" w:hAnsi="Times New Roman" w:cs="Times New Roman"/>
+          <w:sz w:val="24"/>
+          <w:szCs w:val="24"/>
+          <w:bdr w:val="none" w:sz="0" w:space="0" w:color="auto" w:frame="1"/>
+          <w:shd w:val="clear" w:color="auto" w:fill="FFFFFF"/>
+        </w:rPr>
+        <w:t>, S.</w:t>
       </w:r>
       <w:r>
         <w:rPr>
@@ -14654,13 +15382,33 @@
           <w:szCs w:val="24"/>
           <w:shd w:val="clear" w:color="auto" w:fill="FFFFFF"/>
         </w:rPr>
-        <w:t>, &amp; Adefisayo, A. (October 2024</w:t>
-      </w:r>
+        <w:t xml:space="preserve">, &amp; </w:t>
+      </w:r>
+      <w:proofErr w:type="spellStart"/>
       <w:r>
         <w:rPr>
           <w:rFonts w:ascii="Times New Roman" w:eastAsia="Calibri" w:hAnsi="Times New Roman" w:cs="Times New Roman"/>
           <w:sz w:val="24"/>
           <w:szCs w:val="24"/>
+          <w:shd w:val="clear" w:color="auto" w:fill="FFFFFF"/>
+        </w:rPr>
+        <w:t>Adefisayo</w:t>
+      </w:r>
+      <w:proofErr w:type="spellEnd"/>
+      <w:r>
+        <w:rPr>
+          <w:rFonts w:ascii="Times New Roman" w:eastAsia="Calibri" w:hAnsi="Times New Roman" w:cs="Times New Roman"/>
+          <w:sz w:val="24"/>
+          <w:szCs w:val="24"/>
+          <w:shd w:val="clear" w:color="auto" w:fill="FFFFFF"/>
+        </w:rPr>
+        <w:t>, A. (October 2024</w:t>
+      </w:r>
+      <w:r>
+        <w:rPr>
+          <w:rFonts w:ascii="Times New Roman" w:eastAsia="Calibri" w:hAnsi="Times New Roman" w:cs="Times New Roman"/>
+          <w:sz w:val="24"/>
+          <w:szCs w:val="24"/>
         </w:rPr>
         <w:t>)</w:t>
       </w:r>
@@ -14671,7 +15419,27 @@
           <w:szCs w:val="24"/>
           <w:shd w:val="clear" w:color="auto" w:fill="FFFFFF"/>
         </w:rPr>
-        <w:t xml:space="preserve">. Leveraging Generative Artificial Intelligence (gAI) in Learning Design: A Mixed-Methods Examination of Instructional Designers’ Experience. </w:t>
+        <w:t>. Leveraging Generative Artificial Intelligence (</w:t>
+      </w:r>
+      <w:proofErr w:type="spellStart"/>
+      <w:r>
+        <w:rPr>
+          <w:rFonts w:ascii="Times New Roman" w:eastAsia="Calibri" w:hAnsi="Times New Roman" w:cs="Times New Roman"/>
+          <w:sz w:val="24"/>
+          <w:szCs w:val="24"/>
+          <w:shd w:val="clear" w:color="auto" w:fill="FFFFFF"/>
+        </w:rPr>
+        <w:t>gAI</w:t>
+      </w:r>
+      <w:proofErr w:type="spellEnd"/>
+      <w:r>
+        <w:rPr>
+          <w:rFonts w:ascii="Times New Roman" w:eastAsia="Calibri" w:hAnsi="Times New Roman" w:cs="Times New Roman"/>
+          <w:sz w:val="24"/>
+          <w:szCs w:val="24"/>
+          <w:shd w:val="clear" w:color="auto" w:fill="FFFFFF"/>
+        </w:rPr>
+        <w:t xml:space="preserve">) in Learning Design: A Mixed-Methods Examination of Instructional Designers’ Experience. </w:t>
       </w:r>
       <w:r>
         <w:rPr>
@@ -14718,6 +15486,7 @@
         </w:rPr>
         <w:t xml:space="preserve"> </w:t>
       </w:r>
+      <w:proofErr w:type="spellStart"/>
       <w:r>
         <w:rPr>
           <w:rFonts w:ascii="Times New Roman" w:eastAsia="Calibri" w:hAnsi="Times New Roman" w:cs="Times New Roman"/>
@@ -14726,16 +15495,47 @@
           <w:bdr w:val="none" w:sz="0" w:space="0" w:color="auto" w:frame="1"/>
           <w:shd w:val="clear" w:color="auto" w:fill="FFFFFF"/>
         </w:rPr>
-        <w:t>Ijeluola, S.</w:t>
-      </w:r>
+        <w:t>Ijeluola</w:t>
+      </w:r>
+      <w:proofErr w:type="spellEnd"/>
       <w:r>
         <w:rPr>
           <w:rFonts w:ascii="Times New Roman" w:eastAsia="Calibri" w:hAnsi="Times New Roman" w:cs="Times New Roman"/>
           <w:sz w:val="24"/>
           <w:szCs w:val="24"/>
-          <w:shd w:val="clear" w:color="auto" w:fill="FFFFFF"/>
-        </w:rPr>
-        <w:t xml:space="preserve">, Adefisayo, A., &amp; </w:t>
+          <w:bdr w:val="none" w:sz="0" w:space="0" w:color="auto" w:frame="1"/>
+          <w:shd w:val="clear" w:color="auto" w:fill="FFFFFF"/>
+        </w:rPr>
+        <w:t>, S.</w:t>
+      </w:r>
+      <w:r>
+        <w:rPr>
+          <w:rFonts w:ascii="Times New Roman" w:eastAsia="Calibri" w:hAnsi="Times New Roman" w:cs="Times New Roman"/>
+          <w:sz w:val="24"/>
+          <w:szCs w:val="24"/>
+          <w:shd w:val="clear" w:color="auto" w:fill="FFFFFF"/>
+        </w:rPr>
+        <w:t xml:space="preserve">, </w:t>
+      </w:r>
+      <w:proofErr w:type="spellStart"/>
+      <w:r>
+        <w:rPr>
+          <w:rFonts w:ascii="Times New Roman" w:eastAsia="Calibri" w:hAnsi="Times New Roman" w:cs="Times New Roman"/>
+          <w:sz w:val="24"/>
+          <w:szCs w:val="24"/>
+          <w:shd w:val="clear" w:color="auto" w:fill="FFFFFF"/>
+        </w:rPr>
+        <w:t>Adefisayo</w:t>
+      </w:r>
+      <w:proofErr w:type="spellEnd"/>
+      <w:r>
+        <w:rPr>
+          <w:rFonts w:ascii="Times New Roman" w:eastAsia="Calibri" w:hAnsi="Times New Roman" w:cs="Times New Roman"/>
+          <w:sz w:val="24"/>
+          <w:szCs w:val="24"/>
+          <w:shd w:val="clear" w:color="auto" w:fill="FFFFFF"/>
+        </w:rPr>
+        <w:t xml:space="preserve">, A., &amp; </w:t>
       </w:r>
       <w:r>
         <w:rPr>
@@ -14846,7 +15646,27 @@
           <w:szCs w:val="24"/>
           <w:shd w:val="clear" w:color="auto" w:fill="FFFFFF"/>
         </w:rPr>
-        <w:t>., &amp; Baah-Mintah, R. (October, 2024)</w:t>
+        <w:t>., &amp; Baah-Mintah, R. (</w:t>
+      </w:r>
+      <w:proofErr w:type="gramStart"/>
+      <w:r>
+        <w:rPr>
+          <w:rFonts w:ascii="Times New Roman" w:eastAsia="Calibri" w:hAnsi="Times New Roman" w:cs="Times New Roman"/>
+          <w:sz w:val="24"/>
+          <w:szCs w:val="24"/>
+          <w:shd w:val="clear" w:color="auto" w:fill="FFFFFF"/>
+        </w:rPr>
+        <w:t>October,</w:t>
+      </w:r>
+      <w:proofErr w:type="gramEnd"/>
+      <w:r>
+        <w:rPr>
+          <w:rFonts w:ascii="Times New Roman" w:eastAsia="Calibri" w:hAnsi="Times New Roman" w:cs="Times New Roman"/>
+          <w:sz w:val="24"/>
+          <w:szCs w:val="24"/>
+          <w:shd w:val="clear" w:color="auto" w:fill="FFFFFF"/>
+        </w:rPr>
+        <w:t xml:space="preserve"> 2024)</w:t>
       </w:r>
       <w:r>
         <w:rPr>
@@ -14909,13 +15729,23 @@
         </w:rPr>
         <w:t xml:space="preserve"> </w:t>
       </w:r>
+      <w:proofErr w:type="spellStart"/>
       <w:r>
         <w:rPr>
           <w:rFonts w:ascii="Times New Roman" w:eastAsia="Calibri" w:hAnsi="Times New Roman" w:cs="Times New Roman"/>
           <w:sz w:val="24"/>
           <w:szCs w:val="24"/>
         </w:rPr>
-        <w:t>Barielnen, V</w:t>
+        <w:t>Barielnen</w:t>
+      </w:r>
+      <w:proofErr w:type="spellEnd"/>
+      <w:r>
+        <w:rPr>
+          <w:rFonts w:ascii="Times New Roman" w:eastAsia="Calibri" w:hAnsi="Times New Roman" w:cs="Times New Roman"/>
+          <w:sz w:val="24"/>
+          <w:szCs w:val="24"/>
+        </w:rPr>
+        <w:t>, V</w:t>
       </w:r>
       <w:r>
         <w:rPr>
@@ -15068,7 +15898,27 @@
           <w:szCs w:val="24"/>
           <w:shd w:val="clear" w:color="auto" w:fill="FFFFFF"/>
         </w:rPr>
-        <w:t>. (April, 2024). Elementary students’ problem-solving and visual</w:t>
+        <w:t>. (</w:t>
+      </w:r>
+      <w:proofErr w:type="gramStart"/>
+      <w:r>
+        <w:rPr>
+          <w:rFonts w:ascii="Times New Roman" w:eastAsia="Calibri" w:hAnsi="Times New Roman" w:cs="Times New Roman"/>
+          <w:sz w:val="24"/>
+          <w:szCs w:val="24"/>
+          <w:shd w:val="clear" w:color="auto" w:fill="FFFFFF"/>
+        </w:rPr>
+        <w:t>April,</w:t>
+      </w:r>
+      <w:proofErr w:type="gramEnd"/>
+      <w:r>
+        <w:rPr>
+          <w:rFonts w:ascii="Times New Roman" w:eastAsia="Calibri" w:hAnsi="Times New Roman" w:cs="Times New Roman"/>
+          <w:sz w:val="24"/>
+          <w:szCs w:val="24"/>
+          <w:shd w:val="clear" w:color="auto" w:fill="FFFFFF"/>
+        </w:rPr>
+        <w:t xml:space="preserve"> 2024). Elementary students’ problem-solving and visual</w:t>
       </w:r>
       <w:r>
         <w:rPr>
@@ -15409,7 +16259,25 @@
           <w:sz w:val="24"/>
           <w:szCs w:val="24"/>
         </w:rPr>
-        <w:t xml:space="preserve">Innovative Technology Experiences for Students and Teachers (ITEST). Lead PI: Dr. Feiya Luo (Resubmission; $ 1,125,666) [Awarded]. </w:t>
+        <w:t xml:space="preserve">Innovative Technology Experiences for Students and Teachers (ITEST). Lead PI: Dr. </w:t>
+      </w:r>
+      <w:proofErr w:type="spellStart"/>
+      <w:r>
+        <w:rPr>
+          <w:rFonts w:ascii="Times New Roman" w:eastAsia="Times New Roman" w:hAnsi="Times New Roman" w:cs="Times New Roman"/>
+          <w:sz w:val="24"/>
+          <w:szCs w:val="24"/>
+        </w:rPr>
+        <w:t>Feiya</w:t>
+      </w:r>
+      <w:proofErr w:type="spellEnd"/>
+      <w:r>
+        <w:rPr>
+          <w:rFonts w:ascii="Times New Roman" w:eastAsia="Times New Roman" w:hAnsi="Times New Roman" w:cs="Times New Roman"/>
+          <w:sz w:val="24"/>
+          <w:szCs w:val="24"/>
+        </w:rPr>
+        <w:t xml:space="preserve"> Luo (Resubmission; $ 1,125,666) [Awarded]. </w:t>
       </w:r>
     </w:p>
     <w:p>
@@ -19725,6 +20593,7 @@
               </w:rPr>
               <w:t xml:space="preserve"> </w:t>
             </w:r>
+            <w:proofErr w:type="gramStart"/>
             <w:r>
               <w:rPr>
                 <w:rFonts w:ascii="Times New Roman" w:hAnsi="Times New Roman" w:cs="Times New Roman"/>
@@ -19753,6 +20622,7 @@
               </w:rPr>
               <w:t>and</w:t>
             </w:r>
+            <w:proofErr w:type="gramEnd"/>
             <w:r>
               <w:rPr>
                 <w:rFonts w:ascii="Times New Roman" w:hAnsi="Times New Roman" w:cs="Times New Roman"/>
@@ -21678,6 +22548,7 @@
                 <w:lang w:eastAsia="zh-CN"/>
               </w:rPr>
             </w:pPr>
+            <w:proofErr w:type="spellStart"/>
             <w:r>
               <w:rPr>
                 <w:rFonts w:ascii="Times New Roman" w:eastAsia="SimSun" w:hAnsi="Times New Roman" w:cs="Times New Roman"/>
@@ -21686,7 +22557,18 @@
                 <w:shd w:val="clear" w:color="auto" w:fill="FFFFFF"/>
                 <w:lang w:eastAsia="zh-CN"/>
               </w:rPr>
-              <w:t>Behaviour &amp; Information Technology</w:t>
+              <w:t>Behaviour</w:t>
+            </w:r>
+            <w:proofErr w:type="spellEnd"/>
+            <w:r>
+              <w:rPr>
+                <w:rFonts w:ascii="Times New Roman" w:eastAsia="SimSun" w:hAnsi="Times New Roman" w:cs="Times New Roman"/>
+                <w:sz w:val="24"/>
+                <w:szCs w:val="24"/>
+                <w:shd w:val="clear" w:color="auto" w:fill="FFFFFF"/>
+                <w:lang w:eastAsia="zh-CN"/>
+              </w:rPr>
+              <w:t xml:space="preserve"> &amp; Information Technology</w:t>
             </w:r>
           </w:p>
         </w:tc>
@@ -22227,7 +23109,17 @@
                 <w:szCs w:val="24"/>
                 <w:lang w:eastAsia="zh-CN"/>
               </w:rPr>
-              <w:t>Association of Educational and Communication Technology (AECT)</w:t>
+              <w:t>Association of Educational and Communication Technology (</w:t>
+            </w:r>
+            <w:proofErr w:type="gramStart"/>
+            <w:r>
+              <w:rPr>
+                <w:rFonts w:ascii="Times New Roman" w:eastAsia="SimSun" w:hAnsi="Times New Roman" w:cs="Times New Roman"/>
+                <w:sz w:val="24"/>
+                <w:szCs w:val="24"/>
+                <w:lang w:eastAsia="zh-CN"/>
+              </w:rPr>
+              <w:t>AECT)</w:t>
             </w:r>
             <w:r>
               <w:rPr>
@@ -22237,7 +23129,18 @@
                 <w:bdr w:val="none" w:sz="0" w:space="0" w:color="auto" w:frame="1"/>
                 <w:lang w:eastAsia="zh-CN"/>
               </w:rPr>
-              <w:t xml:space="preserve">         </w:t>
+              <w:t xml:space="preserve">   </w:t>
+            </w:r>
+            <w:proofErr w:type="gramEnd"/>
+            <w:r>
+              <w:rPr>
+                <w:rFonts w:ascii="Times New Roman" w:eastAsia="Times New Roman" w:hAnsi="Times New Roman" w:cs="Times New Roman"/>
+                <w:sz w:val="24"/>
+                <w:szCs w:val="24"/>
+                <w:bdr w:val="none" w:sz="0" w:space="0" w:color="auto" w:frame="1"/>
+                <w:lang w:eastAsia="zh-CN"/>
+              </w:rPr>
+              <w:t xml:space="preserve">      </w:t>
             </w:r>
           </w:p>
         </w:tc>
@@ -22502,7 +23405,27 @@
                 <w:szCs w:val="24"/>
                 <w:lang w:eastAsia="zh-CN"/>
               </w:rPr>
-              <w:t xml:space="preserve">Special Interest Group on Computer Science Education (SIGCSE)                          </w:t>
+              <w:t>Special Interest Group on Computer Science Education (</w:t>
+            </w:r>
+            <w:proofErr w:type="gramStart"/>
+            <w:r>
+              <w:rPr>
+                <w:rFonts w:ascii="Times New Roman" w:eastAsia="SimSun" w:hAnsi="Times New Roman" w:cs="Times New Roman"/>
+                <w:sz w:val="24"/>
+                <w:szCs w:val="24"/>
+                <w:lang w:eastAsia="zh-CN"/>
+              </w:rPr>
+              <w:t xml:space="preserve">SIGCSE)   </w:t>
+            </w:r>
+            <w:proofErr w:type="gramEnd"/>
+            <w:r>
+              <w:rPr>
+                <w:rFonts w:ascii="Times New Roman" w:eastAsia="SimSun" w:hAnsi="Times New Roman" w:cs="Times New Roman"/>
+                <w:sz w:val="24"/>
+                <w:szCs w:val="24"/>
+                <w:lang w:eastAsia="zh-CN"/>
+              </w:rPr>
+              <w:t xml:space="preserve">                       </w:t>
             </w:r>
           </w:p>
         </w:tc>
@@ -22565,7 +23488,17 @@
                 <w:szCs w:val="24"/>
                 <w:lang w:eastAsia="zh-CN"/>
               </w:rPr>
-              <w:t>Association of Educational and Communication Technology (AECT)</w:t>
+              <w:t>Association of Educational and Communication Technology (</w:t>
+            </w:r>
+            <w:proofErr w:type="gramStart"/>
+            <w:r>
+              <w:rPr>
+                <w:rFonts w:ascii="Times New Roman" w:eastAsia="SimSun" w:hAnsi="Times New Roman" w:cs="Times New Roman"/>
+                <w:sz w:val="24"/>
+                <w:szCs w:val="24"/>
+                <w:lang w:eastAsia="zh-CN"/>
+              </w:rPr>
+              <w:t>AECT)</w:t>
             </w:r>
             <w:r>
               <w:rPr>
@@ -22575,7 +23508,18 @@
                 <w:bdr w:val="none" w:sz="0" w:space="0" w:color="auto" w:frame="1"/>
                 <w:lang w:eastAsia="zh-CN"/>
               </w:rPr>
-              <w:t xml:space="preserve">         </w:t>
+              <w:t xml:space="preserve">   </w:t>
+            </w:r>
+            <w:proofErr w:type="gramEnd"/>
+            <w:r>
+              <w:rPr>
+                <w:rFonts w:ascii="Times New Roman" w:eastAsia="Times New Roman" w:hAnsi="Times New Roman" w:cs="Times New Roman"/>
+                <w:sz w:val="24"/>
+                <w:szCs w:val="24"/>
+                <w:bdr w:val="none" w:sz="0" w:space="0" w:color="auto" w:frame="1"/>
+                <w:lang w:eastAsia="zh-CN"/>
+              </w:rPr>
+              <w:t xml:space="preserve">      </w:t>
             </w:r>
           </w:p>
         </w:tc>
@@ -24282,6 +25226,7 @@
                 <w:szCs w:val="24"/>
               </w:rPr>
             </w:pPr>
+            <w:proofErr w:type="spellStart"/>
             <w:r>
               <w:rPr>
                 <w:rFonts w:ascii="Times New Roman" w:hAnsi="Times New Roman" w:cs="Times New Roman"/>
@@ -24289,7 +25234,17 @@
                 <w:sz w:val="24"/>
                 <w:szCs w:val="24"/>
               </w:rPr>
-              <w:t>McJulien Graduate Student Scholarship Award ($500)</w:t>
+              <w:t>McJulien</w:t>
+            </w:r>
+            <w:proofErr w:type="spellEnd"/>
+            <w:r>
+              <w:rPr>
+                <w:rFonts w:ascii="Times New Roman" w:hAnsi="Times New Roman" w:cs="Times New Roman"/>
+                <w:w w:val="90"/>
+                <w:sz w:val="24"/>
+                <w:szCs w:val="24"/>
+              </w:rPr>
+              <w:t xml:space="preserve"> Graduate Student Scholarship Award ($500)</w:t>
             </w:r>
           </w:p>
         </w:tc>
@@ -24917,6 +25872,7 @@
                 <w:szCs w:val="24"/>
               </w:rPr>
             </w:pPr>
+            <w:proofErr w:type="gramStart"/>
             <w:r>
               <w:rPr>
                 <w:rFonts w:ascii="Times New Roman" w:hAnsi="Times New Roman" w:cs="Times New Roman"/>
@@ -24944,6 +25900,7 @@
               </w:rPr>
               <w:t>Together</w:t>
             </w:r>
+            <w:proofErr w:type="gramEnd"/>
             <w:r>
               <w:rPr>
                 <w:rFonts w:ascii="Times New Roman" w:hAnsi="Times New Roman" w:cs="Times New Roman"/>
@@ -25880,7 +26837,27 @@
                 <w:sz w:val="24"/>
                 <w:szCs w:val="24"/>
               </w:rPr>
-              <w:t>(iLRN)</w:t>
+              <w:t>(</w:t>
+            </w:r>
+            <w:proofErr w:type="spellStart"/>
+            <w:r>
+              <w:rPr>
+                <w:rFonts w:ascii="Times New Roman" w:hAnsi="Times New Roman" w:cs="Times New Roman"/>
+                <w:spacing w:val="-2"/>
+                <w:sz w:val="24"/>
+                <w:szCs w:val="24"/>
+              </w:rPr>
+              <w:t>iLRN</w:t>
+            </w:r>
+            <w:proofErr w:type="spellEnd"/>
+            <w:r>
+              <w:rPr>
+                <w:rFonts w:ascii="Times New Roman" w:hAnsi="Times New Roman" w:cs="Times New Roman"/>
+                <w:spacing w:val="-2"/>
+                <w:sz w:val="24"/>
+                <w:szCs w:val="24"/>
+              </w:rPr>
+              <w:t>)</w:t>
             </w:r>
           </w:p>
         </w:tc>

</xml_diff>

<commit_message>
Rebuild from CV: VR experiential learning paper published; add GenAI literacy preprint
- 'From experience to action' now published in Interactive Learning
  Environments (2026) with DOI; badge flips Accepted -> Published.
- Adds 'Rethinking Generative AI Literacy' (arXiv preprint), carried
  from the CV as Under review.
- Journal article count 20 -> 21.

Co-Authored-By: Claude Opus 4.8 <noreply@anthropic.com>
</commit_message>
<xml_diff>
--- a/CV_David.docx
+++ b/CV_David.docx
@@ -10528,7 +10528,7 @@
           <w:szCs w:val="24"/>
           <w:shd w:val="clear" w:color="auto" w:fill="FFFFFF"/>
         </w:rPr>
-        <w:t>0</w:t>
+        <w:t>1</w:t>
       </w:r>
       <w:r>
         <w:rPr>
@@ -10639,7 +10639,7 @@
           <w:szCs w:val="24"/>
           <w:shd w:val="clear" w:color="auto" w:fill="FFFFFF"/>
         </w:rPr>
-        <w:t>9</w:t>
+        <w:t>0</w:t>
       </w:r>
       <w:r>
         <w:rPr>
@@ -10677,7 +10677,7 @@
           <w:szCs w:val="24"/>
           <w:shd w:val="clear" w:color="auto" w:fill="FFFFFF"/>
         </w:rPr>
-        <w:t>Accepted</w:t>
+        <w:t>2026</w:t>
       </w:r>
       <w:r>
         <w:rPr>
@@ -10686,7 +10686,66 @@
           <w:szCs w:val="24"/>
           <w:shd w:val="clear" w:color="auto" w:fill="FFFFFF"/>
         </w:rPr>
-        <w:t>). From experience to action: sequential dynamics of experiential learning in immersive virtual reality-supported safety training (Manuscript Number: 264134817)</w:t>
+        <w:t>). From experience to action: sequential dynamics of experiential learning in immersive virtual reality-supported safety training</w:t>
+      </w:r>
+      <w:r>
+        <w:rPr>
+          <w:rFonts w:ascii="Times New Roman" w:eastAsia="Times New Roman" w:hAnsi="Times New Roman" w:cs="Times New Roman"/>
+          <w:sz w:val="24"/>
+          <w:szCs w:val="24"/>
+          <w:shd w:val="clear" w:color="auto" w:fill="FFFFFF"/>
+        </w:rPr>
+        <w:t xml:space="preserve">. </w:t>
+      </w:r>
+      <w:r>
+        <w:rPr>
+          <w:rFonts w:ascii="Times New Roman" w:eastAsia="Times New Roman" w:hAnsi="Times New Roman" w:cs="Times New Roman"/>
+          <w:i/>
+          <w:iCs/>
+          <w:sz w:val="24"/>
+          <w:szCs w:val="24"/>
+          <w:shd w:val="clear" w:color="auto" w:fill="FFFFFF"/>
+        </w:rPr>
+        <w:t>Interactive Learning Environments</w:t>
+      </w:r>
+      <w:r>
+        <w:rPr>
+          <w:rFonts w:ascii="Times New Roman" w:eastAsia="Times New Roman" w:hAnsi="Times New Roman" w:cs="Times New Roman"/>
+          <w:sz w:val="24"/>
+          <w:szCs w:val="24"/>
+          <w:shd w:val="clear" w:color="auto" w:fill="FFFFFF"/>
+        </w:rPr>
+        <w:t>, 1–20.</w:t>
+      </w:r>
+      <w:r>
+        <w:rPr>
+          <w:rFonts w:ascii="Times New Roman" w:eastAsia="Times New Roman" w:hAnsi="Times New Roman" w:cs="Times New Roman"/>
+          <w:sz w:val="24"/>
+          <w:szCs w:val="24"/>
+          <w:shd w:val="clear" w:color="auto" w:fill="FFFFFF"/>
+        </w:rPr>
+        <w:t xml:space="preserve"> </w:t>
+      </w:r>
+      <w:hyperlink r:id="rId10" w:history="1">
+        <w:r>
+          <w:rPr>
+            <w:rStyle w:val="Hyperlink"/>
+            <w:rFonts w:ascii="Times New Roman" w:eastAsia="Times New Roman" w:hAnsi="Times New Roman" w:cs="Times New Roman"/>
+            <w:sz w:val="24"/>
+            <w:szCs w:val="24"/>
+            <w:shd w:val="clear" w:color="auto" w:fill="FFFFFF"/>
+          </w:rPr>
+          <w:t>https://doi.org/10.1080/10494820.2026.2709674</w:t>
+        </w:r>
+      </w:hyperlink>
+      <w:r>
+        <w:rPr>
+          <w:rFonts w:ascii="Times New Roman" w:eastAsia="Times New Roman" w:hAnsi="Times New Roman" w:cs="Times New Roman"/>
+          <w:sz w:val="24"/>
+          <w:szCs w:val="24"/>
+          <w:shd w:val="clear" w:color="auto" w:fill="FFFFFF"/>
+        </w:rPr>
+        <w:t xml:space="preserve"> </w:t>
       </w:r>
     </w:p>
     <w:p>
@@ -10719,7 +10778,7 @@
           <w:szCs w:val="24"/>
           <w:shd w:val="clear" w:color="auto" w:fill="FFFFFF"/>
         </w:rPr>
-        <w:t>8</w:t>
+        <w:t>9</w:t>
       </w:r>
       <w:r>
         <w:rPr>
@@ -10906,35 +10965,391 @@
           <w:sz w:val="24"/>
           <w:szCs w:val="24"/>
         </w:rPr>
-        <w:t>-</w:t>
-      </w:r>
-      <w:proofErr w:type="gramStart"/>
+        <w:t>-003</w:t>
+      </w:r>
       <w:r>
         <w:rPr>
           <w:rFonts w:ascii="Times New Roman" w:eastAsia="Times New Roman" w:hAnsi="Times New Roman" w:cs="Times New Roman"/>
           <w:sz w:val="24"/>
           <w:szCs w:val="24"/>
         </w:rPr>
-        <w:t>003</w:t>
+        <w:t>61</w:t>
       </w:r>
       <w:r>
         <w:rPr>
           <w:rFonts w:ascii="Times New Roman" w:eastAsia="Times New Roman" w:hAnsi="Times New Roman" w:cs="Times New Roman"/>
           <w:sz w:val="24"/>
           <w:szCs w:val="24"/>
-        </w:rPr>
-        <w:t>61</w:t>
-      </w:r>
-      <w:r>
+          <w:shd w:val="clear" w:color="auto" w:fill="FFFFFF"/>
+        </w:rPr>
+        <w:t>)</w:t>
+      </w:r>
+    </w:p>
+    <w:p>
+      <w:pPr>
+        <w:shd w:val="clear" w:color="auto" w:fill="FFFFFF"/>
+        <w:ind w:left="720" w:hanging="630"/>
         <w:rPr>
           <w:rFonts w:ascii="Times New Roman" w:eastAsia="Times New Roman" w:hAnsi="Times New Roman" w:cs="Times New Roman"/>
           <w:sz w:val="24"/>
           <w:szCs w:val="24"/>
           <w:shd w:val="clear" w:color="auto" w:fill="FFFFFF"/>
-        </w:rPr>
-        <w:t xml:space="preserve"> )</w:t>
-      </w:r>
-      <w:proofErr w:type="gramEnd"/>
+          <w:lang w:val="en-GB"/>
+        </w:rPr>
+      </w:pPr>
+      <w:r>
+        <w:rPr>
+          <w:rFonts w:ascii="Times New Roman" w:eastAsia="Calibri" w:hAnsi="Times New Roman" w:cs="Times New Roman"/>
+          <w:sz w:val="24"/>
+          <w:szCs w:val="24"/>
+          <w:shd w:val="clear" w:color="auto" w:fill="FFFFFF"/>
+        </w:rPr>
+        <w:t>[</w:t>
+      </w:r>
+      <w:r>
+        <w:rPr>
+          <w:rFonts w:ascii="Times New Roman" w:eastAsia="Calibri" w:hAnsi="Times New Roman" w:cs="Times New Roman"/>
+          <w:sz w:val="24"/>
+          <w:szCs w:val="24"/>
+          <w:shd w:val="clear" w:color="auto" w:fill="FFFFFF"/>
+        </w:rPr>
+        <w:t xml:space="preserve">18] </w:t>
+      </w:r>
+      <w:r>
+        <w:rPr>
+          <w:rFonts w:ascii="Times New Roman" w:hAnsi="Times New Roman" w:cs="Times New Roman"/>
+          <w:sz w:val="24"/>
+          <w:szCs w:val="24"/>
+          <w:shd w:val="clear" w:color="auto" w:fill="FFFFFF"/>
+          <w:lang w:val="en-GB"/>
+        </w:rPr>
+        <w:t>Hossain,</w:t>
+      </w:r>
+      <w:r>
+        <w:rPr>
+          <w:rFonts w:ascii="Times New Roman" w:hAnsi="Times New Roman" w:cs="Times New Roman"/>
+          <w:sz w:val="24"/>
+          <w:szCs w:val="24"/>
+          <w:shd w:val="clear" w:color="auto" w:fill="FFFFFF"/>
+          <w:lang w:val="en-GB"/>
+        </w:rPr>
+        <w:t xml:space="preserve"> S.,</w:t>
+      </w:r>
+      <w:r>
+        <w:rPr>
+          <w:rFonts w:ascii="Times New Roman" w:hAnsi="Times New Roman" w:cs="Times New Roman"/>
+          <w:sz w:val="24"/>
+          <w:szCs w:val="24"/>
+          <w:shd w:val="clear" w:color="auto" w:fill="FFFFFF"/>
+          <w:lang w:val="en-GB"/>
+        </w:rPr>
+        <w:t xml:space="preserve"> Ahmadi</w:t>
+      </w:r>
+      <w:r>
+        <w:rPr>
+          <w:rFonts w:ascii="Times New Roman" w:hAnsi="Times New Roman" w:cs="Times New Roman"/>
+          <w:sz w:val="24"/>
+          <w:szCs w:val="24"/>
+          <w:shd w:val="clear" w:color="auto" w:fill="FFFFFF"/>
+          <w:lang w:val="en-GB"/>
+        </w:rPr>
+        <w:t xml:space="preserve"> S.</w:t>
+      </w:r>
+      <w:r>
+        <w:rPr>
+          <w:rFonts w:ascii="Times New Roman" w:hAnsi="Times New Roman" w:cs="Times New Roman"/>
+          <w:sz w:val="24"/>
+          <w:szCs w:val="24"/>
+          <w:shd w:val="clear" w:color="auto" w:fill="FFFFFF"/>
+          <w:lang w:val="en-GB"/>
+        </w:rPr>
+        <w:t>, Li</w:t>
+      </w:r>
+      <w:r>
+        <w:rPr>
+          <w:rFonts w:ascii="Times New Roman" w:hAnsi="Times New Roman" w:cs="Times New Roman"/>
+          <w:sz w:val="24"/>
+          <w:szCs w:val="24"/>
+          <w:shd w:val="clear" w:color="auto" w:fill="FFFFFF"/>
+          <w:lang w:val="en-GB"/>
+        </w:rPr>
+        <w:t xml:space="preserve"> L.</w:t>
+      </w:r>
+      <w:r>
+        <w:rPr>
+          <w:rFonts w:ascii="Times New Roman" w:hAnsi="Times New Roman" w:cs="Times New Roman"/>
+          <w:sz w:val="24"/>
+          <w:szCs w:val="24"/>
+          <w:shd w:val="clear" w:color="auto" w:fill="FFFFFF"/>
+          <w:lang w:val="en-GB"/>
+        </w:rPr>
+        <w:t xml:space="preserve">, </w:t>
+      </w:r>
+      <w:r>
+        <w:rPr>
+          <w:rFonts w:ascii="Times New Roman" w:hAnsi="Times New Roman" w:cs="Times New Roman"/>
+          <w:b/>
+          <w:bCs/>
+          <w:sz w:val="24"/>
+          <w:szCs w:val="24"/>
+          <w:shd w:val="clear" w:color="auto" w:fill="FFFFFF"/>
+          <w:lang w:val="en-GB"/>
+        </w:rPr>
+        <w:t>Awoyemi</w:t>
+      </w:r>
+      <w:r>
+        <w:rPr>
+          <w:rFonts w:ascii="Times New Roman" w:hAnsi="Times New Roman" w:cs="Times New Roman"/>
+          <w:b/>
+          <w:bCs/>
+          <w:sz w:val="24"/>
+          <w:szCs w:val="24"/>
+          <w:shd w:val="clear" w:color="auto" w:fill="FFFFFF"/>
+          <w:lang w:val="en-GB"/>
+        </w:rPr>
+        <w:t xml:space="preserve"> ID</w:t>
+      </w:r>
+      <w:r>
+        <w:rPr>
+          <w:rFonts w:ascii="Times New Roman" w:hAnsi="Times New Roman" w:cs="Times New Roman"/>
+          <w:sz w:val="24"/>
+          <w:szCs w:val="24"/>
+          <w:shd w:val="clear" w:color="auto" w:fill="FFFFFF"/>
+          <w:lang w:val="en-GB"/>
+        </w:rPr>
+        <w:t>, Huang</w:t>
+      </w:r>
+      <w:r>
+        <w:rPr>
+          <w:rFonts w:ascii="Times New Roman" w:hAnsi="Times New Roman" w:cs="Times New Roman"/>
+          <w:sz w:val="24"/>
+          <w:szCs w:val="24"/>
+          <w:shd w:val="clear" w:color="auto" w:fill="FFFFFF"/>
+          <w:lang w:val="en-GB"/>
+        </w:rPr>
+        <w:t xml:space="preserve"> W.</w:t>
+      </w:r>
+      <w:r>
+        <w:rPr>
+          <w:rFonts w:ascii="Times New Roman" w:hAnsi="Times New Roman" w:cs="Times New Roman"/>
+          <w:sz w:val="24"/>
+          <w:szCs w:val="24"/>
+          <w:shd w:val="clear" w:color="auto" w:fill="FFFFFF"/>
+          <w:lang w:val="en-GB"/>
+        </w:rPr>
+        <w:t>, Zhou</w:t>
+      </w:r>
+      <w:r>
+        <w:rPr>
+          <w:rFonts w:ascii="Times New Roman" w:hAnsi="Times New Roman" w:cs="Times New Roman"/>
+          <w:sz w:val="24"/>
+          <w:szCs w:val="24"/>
+          <w:shd w:val="clear" w:color="auto" w:fill="FFFFFF"/>
+          <w:lang w:val="en-GB"/>
+        </w:rPr>
+        <w:t xml:space="preserve"> C</w:t>
+      </w:r>
+      <w:r>
+        <w:rPr>
+          <w:rFonts w:ascii="Times New Roman" w:hAnsi="Times New Roman" w:cs="Times New Roman"/>
+          <w:sz w:val="24"/>
+          <w:szCs w:val="24"/>
+          <w:shd w:val="clear" w:color="auto" w:fill="FFFFFF"/>
+          <w:lang w:val="en-GB"/>
+        </w:rPr>
+        <w:t>.</w:t>
+      </w:r>
+      <w:r>
+        <w:rPr>
+          <w:rFonts w:ascii="Times New Roman" w:hAnsi="Times New Roman" w:cs="Times New Roman"/>
+          <w:sz w:val="24"/>
+          <w:szCs w:val="24"/>
+          <w:shd w:val="clear" w:color="auto" w:fill="FFFFFF"/>
+          <w:lang w:val="en-GB"/>
+        </w:rPr>
+        <w:t>, Li</w:t>
+      </w:r>
+      <w:r>
+        <w:rPr>
+          <w:rFonts w:ascii="Times New Roman" w:hAnsi="Times New Roman" w:cs="Times New Roman"/>
+          <w:sz w:val="24"/>
+          <w:szCs w:val="24"/>
+          <w:shd w:val="clear" w:color="auto" w:fill="FFFFFF"/>
+          <w:lang w:val="en-GB"/>
+        </w:rPr>
+        <w:t xml:space="preserve"> J.</w:t>
+      </w:r>
+      <w:r>
+        <w:rPr>
+          <w:rFonts w:ascii="Times New Roman" w:hAnsi="Times New Roman" w:cs="Times New Roman"/>
+          <w:sz w:val="24"/>
+          <w:szCs w:val="24"/>
+          <w:shd w:val="clear" w:color="auto" w:fill="FFFFFF"/>
+          <w:lang w:val="en-GB"/>
+        </w:rPr>
+        <w:t>, Haniya</w:t>
+      </w:r>
+      <w:r>
+        <w:rPr>
+          <w:rFonts w:ascii="Times New Roman" w:hAnsi="Times New Roman" w:cs="Times New Roman"/>
+          <w:sz w:val="24"/>
+          <w:szCs w:val="24"/>
+          <w:shd w:val="clear" w:color="auto" w:fill="FFFFFF"/>
+          <w:lang w:val="en-GB"/>
+        </w:rPr>
+        <w:t xml:space="preserve"> S.</w:t>
+      </w:r>
+      <w:r>
+        <w:rPr>
+          <w:rFonts w:ascii="Times New Roman" w:hAnsi="Times New Roman" w:cs="Times New Roman"/>
+          <w:sz w:val="24"/>
+          <w:szCs w:val="24"/>
+          <w:shd w:val="clear" w:color="auto" w:fill="FFFFFF"/>
+          <w:lang w:val="en-GB"/>
+        </w:rPr>
+        <w:t>, Khanam</w:t>
+      </w:r>
+      <w:r>
+        <w:rPr>
+          <w:rFonts w:ascii="Times New Roman" w:hAnsi="Times New Roman" w:cs="Times New Roman"/>
+          <w:sz w:val="24"/>
+          <w:szCs w:val="24"/>
+          <w:shd w:val="clear" w:color="auto" w:fill="FFFFFF"/>
+          <w:lang w:val="en-GB"/>
+        </w:rPr>
+        <w:t xml:space="preserve"> S.</w:t>
+      </w:r>
+      <w:r>
+        <w:rPr>
+          <w:rFonts w:ascii="Times New Roman" w:hAnsi="Times New Roman" w:cs="Times New Roman"/>
+          <w:sz w:val="24"/>
+          <w:szCs w:val="24"/>
+          <w:shd w:val="clear" w:color="auto" w:fill="FFFFFF"/>
+          <w:lang w:val="en-GB"/>
+        </w:rPr>
+        <w:t>, Subaha</w:t>
+      </w:r>
+      <w:r>
+        <w:rPr>
+          <w:rFonts w:ascii="Times New Roman" w:hAnsi="Times New Roman" w:cs="Times New Roman"/>
+          <w:sz w:val="24"/>
+          <w:szCs w:val="24"/>
+          <w:shd w:val="clear" w:color="auto" w:fill="FFFFFF"/>
+          <w:lang w:val="en-GB"/>
+        </w:rPr>
+        <w:t xml:space="preserve">, </w:t>
+      </w:r>
+      <w:r>
+        <w:rPr>
+          <w:rFonts w:ascii="Times New Roman" w:hAnsi="Times New Roman" w:cs="Times New Roman"/>
+          <w:sz w:val="24"/>
+          <w:szCs w:val="24"/>
+          <w:shd w:val="clear" w:color="auto" w:fill="FFFFFF"/>
+          <w:lang w:val="en-GB"/>
+        </w:rPr>
+        <w:t>T</w:t>
+      </w:r>
+      <w:r>
+        <w:rPr>
+          <w:rFonts w:ascii="Times New Roman" w:hAnsi="Times New Roman" w:cs="Times New Roman"/>
+          <w:sz w:val="24"/>
+          <w:szCs w:val="24"/>
+          <w:shd w:val="clear" w:color="auto" w:fill="FFFFFF"/>
+          <w:lang w:val="en-GB"/>
+        </w:rPr>
+        <w:t>. M</w:t>
+      </w:r>
+      <w:r>
+        <w:rPr>
+          <w:rFonts w:ascii="Times New Roman" w:eastAsia="Times New Roman" w:hAnsi="Times New Roman" w:cs="Times New Roman"/>
+          <w:sz w:val="24"/>
+          <w:szCs w:val="24"/>
+          <w:shd w:val="clear" w:color="auto" w:fill="FFFFFF"/>
+        </w:rPr>
+        <w:t>.</w:t>
+      </w:r>
+      <w:r>
+        <w:rPr>
+          <w:rFonts w:ascii="Times New Roman" w:eastAsia="Times New Roman" w:hAnsi="Times New Roman" w:cs="Times New Roman"/>
+          <w:sz w:val="24"/>
+          <w:szCs w:val="24"/>
+          <w:shd w:val="clear" w:color="auto" w:fill="FFFFFF"/>
+        </w:rPr>
+        <w:t xml:space="preserve"> </w:t>
+      </w:r>
+      <w:r>
+        <w:rPr>
+          <w:rFonts w:ascii="Times New Roman" w:eastAsia="Times New Roman" w:hAnsi="Times New Roman" w:cs="Times New Roman"/>
+          <w:sz w:val="24"/>
+          <w:szCs w:val="24"/>
+          <w:shd w:val="clear" w:color="auto" w:fill="FFFFFF"/>
+        </w:rPr>
+        <w:t xml:space="preserve">(Under review). </w:t>
+      </w:r>
+      <w:r>
+        <w:rPr>
+          <w:rFonts w:ascii="Times New Roman" w:eastAsia="Times New Roman" w:hAnsi="Times New Roman" w:cs="Times New Roman"/>
+          <w:sz w:val="24"/>
+          <w:szCs w:val="24"/>
+          <w:shd w:val="clear" w:color="auto" w:fill="FFFFFF"/>
+        </w:rPr>
+        <w:t>Rethinking Generative AI Literacy: An Integrative, Developmental, and Dialectical Framework for K-12 Teacher Education</w:t>
+      </w:r>
+      <w:r>
+        <w:rPr>
+          <w:rFonts w:ascii="Times New Roman" w:eastAsia="Times New Roman" w:hAnsi="Times New Roman" w:cs="Times New Roman"/>
+          <w:sz w:val="24"/>
+          <w:szCs w:val="24"/>
+          <w:shd w:val="clear" w:color="auto" w:fill="FFFFFF"/>
+        </w:rPr>
+        <w:t>.</w:t>
+      </w:r>
+      <w:hyperlink r:id="rId11" w:history="1">
+        <w:r>
+          <w:rPr>
+            <w:rStyle w:val="Hyperlink"/>
+            <w:rFonts w:ascii="Times New Roman" w:eastAsia="Times New Roman" w:hAnsi="Times New Roman" w:cs="Times New Roman"/>
+            <w:sz w:val="24"/>
+            <w:szCs w:val="24"/>
+            <w:shd w:val="clear" w:color="auto" w:fill="FFFFFF"/>
+          </w:rPr>
+          <w:t xml:space="preserve"> </w:t>
+        </w:r>
+        <w:proofErr w:type="spellStart"/>
+        <w:r>
+          <w:rPr>
+            <w:rStyle w:val="Hyperlink"/>
+            <w:rFonts w:ascii="Times New Roman" w:eastAsia="Times New Roman" w:hAnsi="Times New Roman" w:cs="Times New Roman"/>
+            <w:sz w:val="24"/>
+            <w:szCs w:val="24"/>
+            <w:shd w:val="clear" w:color="auto" w:fill="FFFFFF"/>
+            <w:lang w:val="en-GB"/>
+          </w:rPr>
+          <w:t>arXiv</w:t>
+        </w:r>
+        <w:proofErr w:type="spellEnd"/>
+        <w:r>
+          <w:rPr>
+            <w:rStyle w:val="Hyperlink"/>
+            <w:rFonts w:ascii="Times New Roman" w:eastAsia="Times New Roman" w:hAnsi="Times New Roman" w:cs="Times New Roman"/>
+            <w:sz w:val="24"/>
+            <w:szCs w:val="24"/>
+            <w:shd w:val="clear" w:color="auto" w:fill="FFFFFF"/>
+            <w:lang w:val="en-GB"/>
+          </w:rPr>
+          <w:t xml:space="preserve"> preprint arXiv:2608.01705</w:t>
+        </w:r>
+      </w:hyperlink>
+      <w:r>
+        <w:rPr>
+          <w:rFonts w:ascii="Times New Roman" w:eastAsia="Times New Roman" w:hAnsi="Times New Roman" w:cs="Times New Roman"/>
+          <w:sz w:val="24"/>
+          <w:szCs w:val="24"/>
+          <w:shd w:val="clear" w:color="auto" w:fill="FFFFFF"/>
+          <w:lang w:val="en-GB"/>
+        </w:rPr>
+        <w:t xml:space="preserve"> </w:t>
+      </w:r>
     </w:p>
     <w:p>
       <w:pPr>
@@ -11035,7 +11450,7 @@
         </w:rPr>
         <w:t xml:space="preserve">, A. (2026). Human-centered generative AI in education: ethical challenges and equity-driven solutions. Ethics &amp; Behavior, 1–27. </w:t>
       </w:r>
-      <w:hyperlink r:id="rId10" w:history="1">
+      <w:hyperlink r:id="rId12" w:history="1">
         <w:r>
           <w:rPr>
             <w:rStyle w:val="Hyperlink"/>
@@ -11218,7 +11633,7 @@
         </w:rPr>
         <w:t xml:space="preserve"> 1-21. </w:t>
       </w:r>
-      <w:hyperlink r:id="rId11" w:history="1">
+      <w:hyperlink r:id="rId13" w:history="1">
         <w:r>
           <w:rPr>
             <w:rStyle w:val="Hyperlink"/>
@@ -11752,7 +12167,7 @@
         </w:rPr>
         <w:t xml:space="preserve"> 1-30.  </w:t>
       </w:r>
-      <w:hyperlink r:id="rId12" w:history="1">
+      <w:hyperlink r:id="rId14" w:history="1">
         <w:r>
           <w:rPr>
             <w:rStyle w:val="Hyperlink"/>
@@ -11908,7 +12323,7 @@
         </w:rPr>
         <w:t xml:space="preserve">), 295-318. </w:t>
       </w:r>
-      <w:hyperlink r:id="rId13" w:history="1">
+      <w:hyperlink r:id="rId15" w:history="1">
         <w:r>
           <w:rPr>
             <w:rFonts w:ascii="Times New Roman" w:eastAsia="Times New Roman" w:hAnsi="Times New Roman" w:cs="Times New Roman"/>
@@ -12048,7 +12463,7 @@
         </w:rPr>
         <w:t xml:space="preserve">(8), 997. </w:t>
       </w:r>
-      <w:hyperlink r:id="rId14" w:history="1">
+      <w:hyperlink r:id="rId16" w:history="1">
         <w:r>
           <w:rPr>
             <w:rFonts w:ascii="Times New Roman" w:eastAsia="Times New Roman" w:hAnsi="Times New Roman" w:cs="Times New Roman"/>
@@ -12221,7 +12636,7 @@
         </w:rPr>
         <w:t xml:space="preserve">(5), e70074. </w:t>
       </w:r>
-      <w:hyperlink r:id="rId15" w:history="1">
+      <w:hyperlink r:id="rId17" w:history="1">
         <w:r>
           <w:rPr>
             <w:rFonts w:ascii="Times New Roman" w:eastAsia="Times New Roman" w:hAnsi="Times New Roman" w:cs="Times New Roman"/>
@@ -12354,7 +12769,7 @@
         </w:rPr>
         <w:t xml:space="preserve">(7), 848. </w:t>
       </w:r>
-      <w:hyperlink r:id="rId16" w:history="1">
+      <w:hyperlink r:id="rId18" w:history="1">
         <w:r>
           <w:rPr>
             <w:rFonts w:ascii="Times New Roman" w:eastAsia="Times New Roman" w:hAnsi="Times New Roman" w:cs="Times New Roman"/>
@@ -12447,7 +12862,7 @@
         </w:rPr>
         <w:t xml:space="preserve">., .... &amp; Feyijimi, T. (2025). Artificial intelligence in higher education: a systematic review of contributions to SDG 4 (quality education) and SDG 10 (reduced inequality). International Journal of Educational Management, 1-18. </w:t>
       </w:r>
-      <w:hyperlink r:id="rId17" w:history="1">
+      <w:hyperlink r:id="rId19" w:history="1">
         <w:r>
           <w:rPr>
             <w:rFonts w:ascii="Times New Roman" w:eastAsia="Times New Roman" w:hAnsi="Times New Roman" w:cs="Times New Roman"/>
@@ -29052,7 +29467,7 @@
       </w:r>
     </w:p>
     <w:sectPr>
-      <w:footerReference w:type="default" r:id="rId18"/>
+      <w:footerReference w:type="default" r:id="rId20"/>
       <w:pgSz w:w="12240" w:h="15840"/>
       <w:pgMar w:top="720" w:right="720" w:bottom="720" w:left="720" w:header="720" w:footer="0" w:gutter="0"/>
       <w:cols w:space="720"/>
@@ -35466,7 +35881,6 @@
   <w:style w:type="character" w:default="1" w:styleId="DefaultParagraphFont">
     <w:name w:val="Default Paragraph Font"/>
     <w:uiPriority w:val="1"/>
-    <w:semiHidden/>
     <w:unhideWhenUsed/>
   </w:style>
   <w:style w:type="table" w:default="1" w:styleId="TableNormal">

</xml_diff>

<commit_message>
Replace arXiv preprint reference with AI and Ethics journal
The GenAI literacy manuscript is under review at AI and Ethics
(Springer Nature), not a standalone arXiv preprint. Removed the
arXiv hyperlink from the CV entry and named the journal instead;
status stays Under review.

Co-Authored-By: Claude Opus 4.8 <noreply@anthropic.com>
</commit_message>
<xml_diff>
--- a/CV_David.docx
+++ b/CV_David.docx
@@ -6908,25 +6908,7 @@
                 <w:sz w:val="24"/>
                 <w:szCs w:val="24"/>
               </w:rPr>
-              <w:t xml:space="preserve"> Introduction to Immersive Virtual Reality (IVR) in Facilitating Multimedia Learning. Invited to present an overview of IVR applications in educational contexts, emphasizing cognitive and experiential learning principles. Behavioral and </w:t>
-            </w:r>
-            <w:proofErr w:type="spellStart"/>
-            <w:r>
-              <w:rPr>
-                <w:rFonts w:ascii="Times New Roman" w:eastAsia="Times New Roman" w:hAnsi="Times New Roman" w:cs="Times New Roman"/>
-                <w:sz w:val="24"/>
-                <w:szCs w:val="24"/>
-              </w:rPr>
-              <w:t>Microgenetic</w:t>
-            </w:r>
-            <w:proofErr w:type="spellEnd"/>
-            <w:r>
-              <w:rPr>
-                <w:rFonts w:ascii="Times New Roman" w:eastAsia="Times New Roman" w:hAnsi="Times New Roman" w:cs="Times New Roman"/>
-                <w:sz w:val="24"/>
-                <w:szCs w:val="24"/>
-              </w:rPr>
-              <w:t xml:space="preserve"> Analysis. Designed and led an interactive workshop exploring methods for analyzing learning processes over time, with a focus on applied research.        </w:t>
+              <w:t xml:space="preserve"> Introduction to Immersive Virtual Reality (IVR) in Facilitating Multimedia Learning. Invited to present an overview of IVR applications in educational contexts, emphasizing cognitive and experiential learning principles. Behavioral and Microgenetic Analysis. Designed and led an interactive workshop exploring methods for analyzing learning processes over time, with a focus on applied research.        </w:t>
             </w:r>
           </w:p>
         </w:tc>
@@ -7221,25 +7203,7 @@
                 <w:szCs w:val="24"/>
               </w:rPr>
               <w:tab/>
-              <w:t xml:space="preserve">                                                                 Introduction to Immersive Virtual Reality (IVR) in Facilitating Multimedia Learning. Invited to present an overview of IVR applications in educational contexts, emphasizing cognitive and experiential learning principles. Behavioral and </w:t>
-            </w:r>
-            <w:proofErr w:type="spellStart"/>
-            <w:r>
-              <w:rPr>
-                <w:rFonts w:ascii="Times New Roman" w:eastAsia="Times New Roman" w:hAnsi="Times New Roman" w:cs="Times New Roman"/>
-                <w:sz w:val="24"/>
-                <w:szCs w:val="24"/>
-              </w:rPr>
-              <w:t>Microgenetic</w:t>
-            </w:r>
-            <w:proofErr w:type="spellEnd"/>
-            <w:r>
-              <w:rPr>
-                <w:rFonts w:ascii="Times New Roman" w:eastAsia="Times New Roman" w:hAnsi="Times New Roman" w:cs="Times New Roman"/>
-                <w:sz w:val="24"/>
-                <w:szCs w:val="24"/>
-              </w:rPr>
-              <w:t xml:space="preserve"> Analysis. Designed and led an interactive workshop exploring methods for analyzing learning processes over time, with a focus on applied research techniques.    </w:t>
+              <w:t xml:space="preserve">                                                                 Introduction to Immersive Virtual Reality (IVR) in Facilitating Multimedia Learning. Invited to present an overview of IVR applications in educational contexts, emphasizing cognitive and experiential learning principles. Behavioral and Microgenetic Analysis. Designed and led an interactive workshop exploring methods for analyzing learning processes over time, with a focus on applied research techniques.    </w:t>
             </w:r>
           </w:p>
         </w:tc>
@@ -8474,7 +8438,6 @@
               </w:rPr>
               <w:t xml:space="preserve"> </w:t>
             </w:r>
-            <w:proofErr w:type="gramStart"/>
             <w:r>
               <w:rPr>
                 <w:rFonts w:ascii="Times New Roman" w:hAnsi="Times New Roman" w:cs="Times New Roman"/>
@@ -8503,7 +8466,6 @@
               </w:rPr>
               <w:t>of</w:t>
             </w:r>
-            <w:proofErr w:type="gramEnd"/>
             <w:r>
               <w:rPr>
                 <w:rFonts w:ascii="Times New Roman" w:hAnsi="Times New Roman" w:cs="Times New Roman"/>
@@ -9417,7 +9379,6 @@
                 <w:szCs w:val="24"/>
               </w:rPr>
             </w:pPr>
-            <w:proofErr w:type="spellStart"/>
             <w:r>
               <w:rPr>
                 <w:rFonts w:ascii="Times New Roman" w:hAnsi="Times New Roman" w:cs="Times New Roman"/>
@@ -9427,7 +9388,6 @@
               </w:rPr>
               <w:t>Abarikpo</w:t>
             </w:r>
-            <w:proofErr w:type="spellEnd"/>
             <w:r>
               <w:rPr>
                 <w:rFonts w:ascii="Times New Roman" w:hAnsi="Times New Roman" w:cs="Times New Roman"/>
@@ -9494,7 +9454,6 @@
               </w:rPr>
               <w:t xml:space="preserve">, </w:t>
             </w:r>
-            <w:proofErr w:type="spellStart"/>
             <w:r>
               <w:rPr>
                 <w:rFonts w:ascii="Times New Roman" w:hAnsi="Times New Roman" w:cs="Times New Roman"/>
@@ -9503,18 +9462,7 @@
                 <w:sz w:val="24"/>
                 <w:szCs w:val="24"/>
               </w:rPr>
-              <w:t>Ahoada</w:t>
-            </w:r>
-            <w:proofErr w:type="spellEnd"/>
-            <w:r>
-              <w:rPr>
-                <w:rFonts w:ascii="Times New Roman" w:hAnsi="Times New Roman" w:cs="Times New Roman"/>
-                <w:spacing w:val="-7"/>
-                <w:position w:val="1"/>
-                <w:sz w:val="24"/>
-                <w:szCs w:val="24"/>
-              </w:rPr>
-              <w:t xml:space="preserve">, </w:t>
+              <w:t xml:space="preserve">Ahoada, </w:t>
             </w:r>
             <w:r>
               <w:rPr>
@@ -10557,47 +10505,7 @@
           <w:szCs w:val="24"/>
           <w:shd w:val="clear" w:color="auto" w:fill="FFFFFF"/>
         </w:rPr>
-        <w:t xml:space="preserve"> Moon, J., Aldemir, T., </w:t>
-      </w:r>
-      <w:proofErr w:type="spellStart"/>
-      <w:r>
-        <w:rPr>
-          <w:rFonts w:ascii="Times New Roman" w:eastAsia="Times New Roman" w:hAnsi="Times New Roman" w:cs="Times New Roman"/>
-          <w:sz w:val="24"/>
-          <w:szCs w:val="24"/>
-          <w:shd w:val="clear" w:color="auto" w:fill="FFFFFF"/>
-        </w:rPr>
-        <w:t>Ghooreian</w:t>
-      </w:r>
-      <w:proofErr w:type="spellEnd"/>
-      <w:r>
-        <w:rPr>
-          <w:rFonts w:ascii="Times New Roman" w:eastAsia="Times New Roman" w:hAnsi="Times New Roman" w:cs="Times New Roman"/>
-          <w:sz w:val="24"/>
-          <w:szCs w:val="24"/>
-          <w:shd w:val="clear" w:color="auto" w:fill="FFFFFF"/>
-        </w:rPr>
-        <w:t xml:space="preserve">, A., &amp; </w:t>
-      </w:r>
-      <w:proofErr w:type="spellStart"/>
-      <w:r>
-        <w:rPr>
-          <w:rFonts w:ascii="Times New Roman" w:eastAsia="Times New Roman" w:hAnsi="Times New Roman" w:cs="Times New Roman"/>
-          <w:sz w:val="24"/>
-          <w:szCs w:val="24"/>
-          <w:shd w:val="clear" w:color="auto" w:fill="FFFFFF"/>
-        </w:rPr>
-        <w:t>Sabanwar</w:t>
-      </w:r>
-      <w:proofErr w:type="spellEnd"/>
-      <w:r>
-        <w:rPr>
-          <w:rFonts w:ascii="Times New Roman" w:eastAsia="Times New Roman" w:hAnsi="Times New Roman" w:cs="Times New Roman"/>
-          <w:sz w:val="24"/>
-          <w:szCs w:val="24"/>
-          <w:shd w:val="clear" w:color="auto" w:fill="FFFFFF"/>
-        </w:rPr>
-        <w:t>, V. (Under review). A Systematic Review of Empirical Research on AI in K-12 STEM Education (2020-2025) through a Sociotechnical Lens (Manuscript Number: ETRD-D-26-01416)</w:t>
+        <w:t xml:space="preserve"> Moon, J., Aldemir, T., Ghooreian, A., &amp; Sabanwar, V. (Under review). A Systematic Review of Empirical Research on AI in K-12 STEM Education (2020-2025) through a Sociotechnical Lens (Manuscript Number: ETRD-D-26-01416)</w:t>
       </w:r>
     </w:p>
     <w:p>
@@ -10845,7 +10753,6 @@
         </w:rPr>
         <w:t xml:space="preserve">, &amp; </w:t>
       </w:r>
-      <w:proofErr w:type="spellStart"/>
       <w:r>
         <w:rPr>
           <w:rFonts w:ascii="Times New Roman" w:eastAsia="Times New Roman" w:hAnsi="Times New Roman" w:cs="Times New Roman"/>
@@ -10853,17 +10760,7 @@
           <w:szCs w:val="24"/>
           <w:shd w:val="clear" w:color="auto" w:fill="FFFFFF"/>
         </w:rPr>
-        <w:t>Ghooreian</w:t>
-      </w:r>
-      <w:proofErr w:type="spellEnd"/>
-      <w:r>
-        <w:rPr>
-          <w:rFonts w:ascii="Times New Roman" w:eastAsia="Times New Roman" w:hAnsi="Times New Roman" w:cs="Times New Roman"/>
-          <w:sz w:val="24"/>
-          <w:szCs w:val="24"/>
-          <w:shd w:val="clear" w:color="auto" w:fill="FFFFFF"/>
-        </w:rPr>
-        <w:t>, A</w:t>
+        <w:t>Ghooreian, A</w:t>
       </w:r>
       <w:r>
         <w:rPr>
@@ -11302,53 +11199,7 @@
           <w:szCs w:val="24"/>
           <w:shd w:val="clear" w:color="auto" w:fill="FFFFFF"/>
         </w:rPr>
-        <w:t>.</w:t>
-      </w:r>
-      <w:hyperlink r:id="rId11" w:history="1">
-        <w:r>
-          <w:rPr>
-            <w:rStyle w:val="Hyperlink"/>
-            <w:rFonts w:ascii="Times New Roman" w:eastAsia="Times New Roman" w:hAnsi="Times New Roman" w:cs="Times New Roman"/>
-            <w:sz w:val="24"/>
-            <w:szCs w:val="24"/>
-            <w:shd w:val="clear" w:color="auto" w:fill="FFFFFF"/>
-          </w:rPr>
-          <w:t xml:space="preserve"> </w:t>
-        </w:r>
-        <w:proofErr w:type="spellStart"/>
-        <w:r>
-          <w:rPr>
-            <w:rStyle w:val="Hyperlink"/>
-            <w:rFonts w:ascii="Times New Roman" w:eastAsia="Times New Roman" w:hAnsi="Times New Roman" w:cs="Times New Roman"/>
-            <w:sz w:val="24"/>
-            <w:szCs w:val="24"/>
-            <w:shd w:val="clear" w:color="auto" w:fill="FFFFFF"/>
-            <w:lang w:val="en-GB"/>
-          </w:rPr>
-          <w:t>arXiv</w:t>
-        </w:r>
-        <w:proofErr w:type="spellEnd"/>
-        <w:r>
-          <w:rPr>
-            <w:rStyle w:val="Hyperlink"/>
-            <w:rFonts w:ascii="Times New Roman" w:eastAsia="Times New Roman" w:hAnsi="Times New Roman" w:cs="Times New Roman"/>
-            <w:sz w:val="24"/>
-            <w:szCs w:val="24"/>
-            <w:shd w:val="clear" w:color="auto" w:fill="FFFFFF"/>
-            <w:lang w:val="en-GB"/>
-          </w:rPr>
-          <w:t xml:space="preserve"> preprint arXiv:2608.01705</w:t>
-        </w:r>
-      </w:hyperlink>
-      <w:r>
-        <w:rPr>
-          <w:rFonts w:ascii="Times New Roman" w:eastAsia="Times New Roman" w:hAnsi="Times New Roman" w:cs="Times New Roman"/>
-          <w:sz w:val="24"/>
-          <w:szCs w:val="24"/>
-          <w:shd w:val="clear" w:color="auto" w:fill="FFFFFF"/>
-          <w:lang w:val="en-GB"/>
-        </w:rPr>
-        <w:t xml:space="preserve"> </w:t>
+        <w:t>. AI and Ethics.</w:t>
       </w:r>
     </w:p>
     <w:p>
@@ -11428,29 +11279,9 @@
           <w:szCs w:val="24"/>
           <w:shd w:val="clear" w:color="auto" w:fill="FFFFFF"/>
         </w:rPr>
-        <w:t xml:space="preserve">., Baah-Mintah, R., &amp; </w:t>
-      </w:r>
-      <w:proofErr w:type="spellStart"/>
-      <w:r>
-        <w:rPr>
-          <w:rFonts w:ascii="Times New Roman" w:eastAsia="Times New Roman" w:hAnsi="Times New Roman" w:cs="Times New Roman"/>
-          <w:sz w:val="24"/>
-          <w:szCs w:val="24"/>
-          <w:shd w:val="clear" w:color="auto" w:fill="FFFFFF"/>
-        </w:rPr>
-        <w:t>Ghooreian</w:t>
-      </w:r>
-      <w:proofErr w:type="spellEnd"/>
-      <w:r>
-        <w:rPr>
-          <w:rFonts w:ascii="Times New Roman" w:eastAsia="Times New Roman" w:hAnsi="Times New Roman" w:cs="Times New Roman"/>
-          <w:sz w:val="24"/>
-          <w:szCs w:val="24"/>
-          <w:shd w:val="clear" w:color="auto" w:fill="FFFFFF"/>
-        </w:rPr>
-        <w:t xml:space="preserve">, A. (2026). Human-centered generative AI in education: ethical challenges and equity-driven solutions. Ethics &amp; Behavior, 1–27. </w:t>
-      </w:r>
-      <w:hyperlink r:id="rId12" w:history="1">
+        <w:t xml:space="preserve">., Baah-Mintah, R., &amp; Ghooreian, A. (2026). Human-centered generative AI in education: ethical challenges and equity-driven solutions. Ethics &amp; Behavior, 1–27. </w:t>
+      </w:r>
+      <w:hyperlink r:id="rId11" w:history="1">
         <w:r>
           <w:rPr>
             <w:rStyle w:val="Hyperlink"/>
@@ -11591,27 +11422,7 @@
           <w:szCs w:val="24"/>
           <w:shd w:val="clear" w:color="auto" w:fill="FFFFFF"/>
         </w:rPr>
-        <w:t xml:space="preserve">Luo, F., </w:t>
-      </w:r>
-      <w:proofErr w:type="spellStart"/>
-      <w:r>
-        <w:rPr>
-          <w:rFonts w:ascii="Times New Roman" w:eastAsia="Times New Roman" w:hAnsi="Times New Roman" w:cs="Times New Roman"/>
-          <w:sz w:val="24"/>
-          <w:szCs w:val="24"/>
-          <w:shd w:val="clear" w:color="auto" w:fill="FFFFFF"/>
-        </w:rPr>
-        <w:t>Amayou</w:t>
-      </w:r>
-      <w:proofErr w:type="spellEnd"/>
-      <w:r>
-        <w:rPr>
-          <w:rFonts w:ascii="Times New Roman" w:eastAsia="Times New Roman" w:hAnsi="Times New Roman" w:cs="Times New Roman"/>
-          <w:sz w:val="24"/>
-          <w:szCs w:val="24"/>
-          <w:shd w:val="clear" w:color="auto" w:fill="FFFFFF"/>
-        </w:rPr>
-        <w:t xml:space="preserve">, J., Nasrin, F., Abedini, P., Mousavi, V., Awoyemi, I. D., ... &amp; Crawford, C. (2026). Promoting elementary students’ computer science conceptual knowledge and coding performance: a mixed methods case study. </w:t>
+        <w:t xml:space="preserve">Luo, F., Amayou, J., Nasrin, F., Abedini, P., Mousavi, V., Awoyemi, I. D., ... &amp; Crawford, C. (2026). Promoting elementary students’ computer science conceptual knowledge and coding performance: a mixed methods case study. </w:t>
       </w:r>
       <w:r>
         <w:rPr>
@@ -11633,7 +11444,7 @@
         </w:rPr>
         <w:t xml:space="preserve"> 1-21. </w:t>
       </w:r>
-      <w:hyperlink r:id="rId13" w:history="1">
+      <w:hyperlink r:id="rId12" w:history="1">
         <w:r>
           <w:rPr>
             <w:rStyle w:val="Hyperlink"/>
@@ -11929,25 +11740,24 @@
           <w:sz w:val="24"/>
           <w:szCs w:val="24"/>
         </w:rPr>
-        <w:t xml:space="preserve">Abu S., Yuvaraja H. K., </w:t>
-      </w:r>
-      <w:proofErr w:type="spellStart"/>
+        <w:t xml:space="preserve">Abu S., Yuvaraja H. K., Patiballa S. K., </w:t>
+      </w:r>
       <w:r>
         <w:rPr>
           <w:rFonts w:ascii="Times New Roman" w:eastAsia="Times New Roman" w:hAnsi="Times New Roman" w:cs="Times New Roman"/>
           <w:sz w:val="24"/>
           <w:szCs w:val="24"/>
-        </w:rPr>
-        <w:t>Patiballa</w:t>
-      </w:r>
-      <w:proofErr w:type="spellEnd"/>
+          <w:shd w:val="clear" w:color="auto" w:fill="FFFFFF"/>
+        </w:rPr>
+        <w:t xml:space="preserve">&amp; Moon, J. (Under review). </w:t>
+      </w:r>
       <w:r>
         <w:rPr>
           <w:rFonts w:ascii="Times New Roman" w:eastAsia="Times New Roman" w:hAnsi="Times New Roman" w:cs="Times New Roman"/>
           <w:sz w:val="24"/>
           <w:szCs w:val="24"/>
         </w:rPr>
-        <w:t xml:space="preserve"> S. K., </w:t>
+        <w:t>​​Exploring fidelity dimensions in extended reality technologies for mechanical engineering education: A Systematic Review</w:t>
       </w:r>
       <w:r>
         <w:rPr>
@@ -11956,7 +11766,7 @@
           <w:szCs w:val="24"/>
           <w:shd w:val="clear" w:color="auto" w:fill="FFFFFF"/>
         </w:rPr>
-        <w:t xml:space="preserve">&amp; Moon, J. (Under review). </w:t>
+        <w:t xml:space="preserve">. </w:t>
       </w:r>
       <w:r>
         <w:rPr>
@@ -11964,27 +11774,8 @@
           <w:sz w:val="24"/>
           <w:szCs w:val="24"/>
         </w:rPr>
-        <w:t>​​Exploring fidelity dimensions in extended reality technologies for mechanical engineering education: A Systematic Review</w:t>
-      </w:r>
-      <w:r>
-        <w:rPr>
-          <w:rFonts w:ascii="Times New Roman" w:eastAsia="Times New Roman" w:hAnsi="Times New Roman" w:cs="Times New Roman"/>
-          <w:sz w:val="24"/>
-          <w:szCs w:val="24"/>
-          <w:shd w:val="clear" w:color="auto" w:fill="FFFFFF"/>
-        </w:rPr>
-        <w:t xml:space="preserve">. </w:t>
-      </w:r>
-      <w:proofErr w:type="spellStart"/>
-      <w:r>
-        <w:rPr>
-          <w:rFonts w:ascii="Times New Roman" w:eastAsia="Times New Roman" w:hAnsi="Times New Roman" w:cs="Times New Roman"/>
-          <w:sz w:val="24"/>
-          <w:szCs w:val="24"/>
-        </w:rPr>
         <w:t>TechTrends</w:t>
       </w:r>
-      <w:proofErr w:type="spellEnd"/>
       <w:r>
         <w:rPr>
           <w:rFonts w:ascii="Times New Roman" w:eastAsia="Times New Roman" w:hAnsi="Times New Roman" w:cs="Times New Roman"/>
@@ -12072,69 +11863,8 @@
           <w:szCs w:val="24"/>
           <w:shd w:val="clear" w:color="auto" w:fill="FFFFFF"/>
         </w:rPr>
-        <w:t xml:space="preserve">., &amp; Abu S. (2026). Decoding learning states in </w:t>
-      </w:r>
-      <w:proofErr w:type="spellStart"/>
-      <w:r>
-        <w:rPr>
-          <w:rFonts w:ascii="Times New Roman" w:eastAsia="Times New Roman" w:hAnsi="Times New Roman" w:cs="Times New Roman"/>
-          <w:sz w:val="24"/>
-          <w:szCs w:val="24"/>
-          <w:shd w:val="clear" w:color="auto" w:fill="FFFFFF"/>
-        </w:rPr>
-        <w:t>vr</w:t>
-      </w:r>
-      <w:proofErr w:type="spellEnd"/>
-      <w:r>
-        <w:rPr>
-          <w:rFonts w:ascii="Times New Roman" w:eastAsia="Times New Roman" w:hAnsi="Times New Roman" w:cs="Times New Roman"/>
-          <w:sz w:val="24"/>
-          <w:szCs w:val="24"/>
-          <w:shd w:val="clear" w:color="auto" w:fill="FFFFFF"/>
-        </w:rPr>
-        <w:t xml:space="preserve"> safety training: a </w:t>
-      </w:r>
-      <w:proofErr w:type="spellStart"/>
-      <w:r>
-        <w:rPr>
-          <w:rFonts w:ascii="Times New Roman" w:eastAsia="Times New Roman" w:hAnsi="Times New Roman" w:cs="Times New Roman"/>
-          <w:sz w:val="24"/>
-          <w:szCs w:val="24"/>
-          <w:shd w:val="clear" w:color="auto" w:fill="FFFFFF"/>
-        </w:rPr>
-        <w:t>bayesian</w:t>
-      </w:r>
-      <w:proofErr w:type="spellEnd"/>
-      <w:r>
-        <w:rPr>
-          <w:rFonts w:ascii="Times New Roman" w:eastAsia="Times New Roman" w:hAnsi="Times New Roman" w:cs="Times New Roman"/>
-          <w:sz w:val="24"/>
-          <w:szCs w:val="24"/>
-          <w:shd w:val="clear" w:color="auto" w:fill="FFFFFF"/>
-        </w:rPr>
-        <w:t xml:space="preserve"> cognitive diagnostic approach to </w:t>
-      </w:r>
-      <w:proofErr w:type="spellStart"/>
-      <w:r>
-        <w:rPr>
-          <w:rFonts w:ascii="Times New Roman" w:eastAsia="Times New Roman" w:hAnsi="Times New Roman" w:cs="Times New Roman"/>
-          <w:sz w:val="24"/>
-          <w:szCs w:val="24"/>
-          <w:shd w:val="clear" w:color="auto" w:fill="FFFFFF"/>
-        </w:rPr>
-        <w:t>microgenetic</w:t>
-      </w:r>
-      <w:proofErr w:type="spellEnd"/>
-      <w:r>
-        <w:rPr>
-          <w:rFonts w:ascii="Times New Roman" w:eastAsia="Times New Roman" w:hAnsi="Times New Roman" w:cs="Times New Roman"/>
-          <w:sz w:val="24"/>
-          <w:szCs w:val="24"/>
-          <w:shd w:val="clear" w:color="auto" w:fill="FFFFFF"/>
-        </w:rPr>
-        <w:t xml:space="preserve"> behavioral analytics. </w:t>
-      </w:r>
-      <w:proofErr w:type="spellStart"/>
+        <w:t xml:space="preserve">., &amp; Abu S. (2026). Decoding learning states in vr safety training: a bayesian cognitive diagnostic approach to microgenetic behavioral analytics. </w:t>
+      </w:r>
       <w:r>
         <w:rPr>
           <w:rFonts w:ascii="Times New Roman" w:eastAsia="Times New Roman" w:hAnsi="Times New Roman" w:cs="Times New Roman"/>
@@ -12144,30 +11874,18 @@
           <w:szCs w:val="24"/>
           <w:shd w:val="clear" w:color="auto" w:fill="FFFFFF"/>
         </w:rPr>
-        <w:t>Behaviourmetrika</w:t>
-      </w:r>
-      <w:proofErr w:type="spellEnd"/>
-      <w:r>
-        <w:rPr>
-          <w:rFonts w:ascii="Times New Roman" w:eastAsia="Times New Roman" w:hAnsi="Times New Roman" w:cs="Times New Roman"/>
-          <w:i/>
-          <w:iCs/>
+        <w:t>Behaviourmetrika.</w:t>
+      </w:r>
+      <w:r>
+        <w:rPr>
+          <w:rFonts w:ascii="Times New Roman" w:eastAsia="Calibri" w:hAnsi="Times New Roman" w:cs="Times New Roman"/>
           <w:sz w:val="24"/>
           <w:szCs w:val="24"/>
           <w:shd w:val="clear" w:color="auto" w:fill="FFFFFF"/>
         </w:rPr>
-        <w:t>.</w:t>
-      </w:r>
-      <w:r>
-        <w:rPr>
-          <w:rFonts w:ascii="Times New Roman" w:eastAsia="Calibri" w:hAnsi="Times New Roman" w:cs="Times New Roman"/>
-          <w:sz w:val="24"/>
-          <w:szCs w:val="24"/>
-          <w:shd w:val="clear" w:color="auto" w:fill="FFFFFF"/>
-        </w:rPr>
         <w:t xml:space="preserve"> 1-30.  </w:t>
       </w:r>
-      <w:hyperlink r:id="rId14" w:history="1">
+      <w:hyperlink r:id="rId13" w:history="1">
         <w:r>
           <w:rPr>
             <w:rStyle w:val="Hyperlink"/>
@@ -12323,7 +12041,7 @@
         </w:rPr>
         <w:t xml:space="preserve">), 295-318. </w:t>
       </w:r>
-      <w:hyperlink r:id="rId15" w:history="1">
+      <w:hyperlink r:id="rId14" w:history="1">
         <w:r>
           <w:rPr>
             <w:rFonts w:ascii="Times New Roman" w:eastAsia="Times New Roman" w:hAnsi="Times New Roman" w:cs="Times New Roman"/>
@@ -12463,7 +12181,7 @@
         </w:rPr>
         <w:t xml:space="preserve">(8), 997. </w:t>
       </w:r>
-      <w:hyperlink r:id="rId16" w:history="1">
+      <w:hyperlink r:id="rId15" w:history="1">
         <w:r>
           <w:rPr>
             <w:rFonts w:ascii="Times New Roman" w:eastAsia="Times New Roman" w:hAnsi="Times New Roman" w:cs="Times New Roman"/>
@@ -12554,47 +12272,7 @@
           <w:szCs w:val="24"/>
           <w:shd w:val="clear" w:color="auto" w:fill="FFFFFF"/>
         </w:rPr>
-        <w:t xml:space="preserve">., </w:t>
-      </w:r>
-      <w:proofErr w:type="spellStart"/>
-      <w:r>
-        <w:rPr>
-          <w:rFonts w:ascii="Times New Roman" w:eastAsia="Times New Roman" w:hAnsi="Times New Roman" w:cs="Times New Roman"/>
-          <w:sz w:val="24"/>
-          <w:szCs w:val="24"/>
-          <w:shd w:val="clear" w:color="auto" w:fill="FFFFFF"/>
-        </w:rPr>
-        <w:t>Ghooreian</w:t>
-      </w:r>
-      <w:proofErr w:type="spellEnd"/>
-      <w:r>
-        <w:rPr>
-          <w:rFonts w:ascii="Times New Roman" w:eastAsia="Times New Roman" w:hAnsi="Times New Roman" w:cs="Times New Roman"/>
-          <w:sz w:val="24"/>
-          <w:szCs w:val="24"/>
-          <w:shd w:val="clear" w:color="auto" w:fill="FFFFFF"/>
-        </w:rPr>
-        <w:t xml:space="preserve">, A., &amp; </w:t>
-      </w:r>
-      <w:proofErr w:type="spellStart"/>
-      <w:r>
-        <w:rPr>
-          <w:rFonts w:ascii="Times New Roman" w:eastAsia="Times New Roman" w:hAnsi="Times New Roman" w:cs="Times New Roman"/>
-          <w:sz w:val="24"/>
-          <w:szCs w:val="24"/>
-          <w:shd w:val="clear" w:color="auto" w:fill="FFFFFF"/>
-        </w:rPr>
-        <w:t>Ramenzapour</w:t>
-      </w:r>
-      <w:proofErr w:type="spellEnd"/>
-      <w:r>
-        <w:rPr>
-          <w:rFonts w:ascii="Times New Roman" w:eastAsia="Times New Roman" w:hAnsi="Times New Roman" w:cs="Times New Roman"/>
-          <w:sz w:val="24"/>
-          <w:szCs w:val="24"/>
-          <w:shd w:val="clear" w:color="auto" w:fill="FFFFFF"/>
-        </w:rPr>
-        <w:t>, E. (2025). A Systematic Review of Technology‐Enhanced Learning Approaches to Foster Construction Engineering and Management Competencies. </w:t>
+        <w:t>., Ghooreian, A., &amp; Ramenzapour, E. (2025). A Systematic Review of Technology‐Enhanced Learning Approaches to Foster Construction Engineering and Management Competencies. </w:t>
       </w:r>
       <w:r>
         <w:rPr>
@@ -12636,7 +12314,7 @@
         </w:rPr>
         <w:t xml:space="preserve">(5), e70074. </w:t>
       </w:r>
-      <w:hyperlink r:id="rId17" w:history="1">
+      <w:hyperlink r:id="rId16" w:history="1">
         <w:r>
           <w:rPr>
             <w:rFonts w:ascii="Times New Roman" w:eastAsia="Times New Roman" w:hAnsi="Times New Roman" w:cs="Times New Roman"/>
@@ -12769,7 +12447,7 @@
         </w:rPr>
         <w:t xml:space="preserve">(7), 848. </w:t>
       </w:r>
-      <w:hyperlink r:id="rId18" w:history="1">
+      <w:hyperlink r:id="rId17" w:history="1">
         <w:r>
           <w:rPr>
             <w:rFonts w:ascii="Times New Roman" w:eastAsia="Times New Roman" w:hAnsi="Times New Roman" w:cs="Times New Roman"/>
@@ -12862,7 +12540,7 @@
         </w:rPr>
         <w:t xml:space="preserve">., .... &amp; Feyijimi, T. (2025). Artificial intelligence in higher education: a systematic review of contributions to SDG 4 (quality education) and SDG 10 (reduced inequality). International Journal of Educational Management, 1-18. </w:t>
       </w:r>
-      <w:hyperlink r:id="rId19" w:history="1">
+      <w:hyperlink r:id="rId18" w:history="1">
         <w:r>
           <w:rPr>
             <w:rFonts w:ascii="Times New Roman" w:eastAsia="Times New Roman" w:hAnsi="Times New Roman" w:cs="Times New Roman"/>
@@ -12925,47 +12603,7 @@
           <w:szCs w:val="24"/>
           <w:shd w:val="clear" w:color="auto" w:fill="FFFFFF"/>
         </w:rPr>
-        <w:t xml:space="preserve">., Gwandu, Z. L., Isah, S., &amp; Murtala, A. (2024). Effect of parental socio-economic background on secondary school students career choice in </w:t>
-      </w:r>
-      <w:proofErr w:type="spellStart"/>
-      <w:r>
-        <w:rPr>
-          <w:rFonts w:ascii="Times New Roman" w:eastAsia="Calibri" w:hAnsi="Times New Roman" w:cs="Times New Roman"/>
-          <w:sz w:val="24"/>
-          <w:szCs w:val="24"/>
-          <w:shd w:val="clear" w:color="auto" w:fill="FFFFFF"/>
-        </w:rPr>
-        <w:t>kebbi</w:t>
-      </w:r>
-      <w:proofErr w:type="spellEnd"/>
-      <w:r>
-        <w:rPr>
-          <w:rFonts w:ascii="Times New Roman" w:eastAsia="Calibri" w:hAnsi="Times New Roman" w:cs="Times New Roman"/>
-          <w:sz w:val="24"/>
-          <w:szCs w:val="24"/>
-          <w:shd w:val="clear" w:color="auto" w:fill="FFFFFF"/>
-        </w:rPr>
-        <w:t xml:space="preserve"> state, </w:t>
-      </w:r>
-      <w:proofErr w:type="spellStart"/>
-      <w:r>
-        <w:rPr>
-          <w:rFonts w:ascii="Times New Roman" w:eastAsia="Calibri" w:hAnsi="Times New Roman" w:cs="Times New Roman"/>
-          <w:sz w:val="24"/>
-          <w:szCs w:val="24"/>
-          <w:shd w:val="clear" w:color="auto" w:fill="FFFFFF"/>
-        </w:rPr>
-        <w:t>nigeria</w:t>
-      </w:r>
-      <w:proofErr w:type="spellEnd"/>
-      <w:r>
-        <w:rPr>
-          <w:rFonts w:ascii="Times New Roman" w:eastAsia="Calibri" w:hAnsi="Times New Roman" w:cs="Times New Roman"/>
-          <w:sz w:val="24"/>
-          <w:szCs w:val="24"/>
-          <w:shd w:val="clear" w:color="auto" w:fill="FFFFFF"/>
-        </w:rPr>
-        <w:t>.</w:t>
+        <w:t>., Gwandu, Z. L., Isah, S., &amp; Murtala, A. (2024). Effect of parental socio-economic background on secondary school students career choice in kebbi state, nigeria.</w:t>
       </w:r>
       <w:r>
         <w:rPr>
@@ -13009,7 +12647,6 @@
         </w:rPr>
         <w:t xml:space="preserve">[4] </w:t>
       </w:r>
-      <w:proofErr w:type="spellStart"/>
       <w:r>
         <w:rPr>
           <w:rFonts w:ascii="Times New Roman" w:eastAsia="Calibri" w:hAnsi="Times New Roman" w:cs="Times New Roman"/>
@@ -13017,37 +12654,7 @@
           <w:sz w:val="24"/>
           <w:szCs w:val="24"/>
         </w:rPr>
-        <w:t>Falode</w:t>
-      </w:r>
-      <w:proofErr w:type="spellEnd"/>
-      <w:r>
-        <w:rPr>
-          <w:rFonts w:ascii="Times New Roman" w:eastAsia="Calibri" w:hAnsi="Times New Roman" w:cs="Times New Roman"/>
-          <w:bCs/>
-          <w:sz w:val="24"/>
-          <w:szCs w:val="24"/>
-        </w:rPr>
-        <w:t xml:space="preserve">, O.C.; </w:t>
-      </w:r>
-      <w:proofErr w:type="spellStart"/>
-      <w:r>
-        <w:rPr>
-          <w:rFonts w:ascii="Times New Roman" w:eastAsia="Calibri" w:hAnsi="Times New Roman" w:cs="Times New Roman"/>
-          <w:bCs/>
-          <w:sz w:val="24"/>
-          <w:szCs w:val="24"/>
-        </w:rPr>
-        <w:t>Ilufoye</w:t>
-      </w:r>
-      <w:proofErr w:type="spellEnd"/>
-      <w:r>
-        <w:rPr>
-          <w:rFonts w:ascii="Times New Roman" w:eastAsia="Calibri" w:hAnsi="Times New Roman" w:cs="Times New Roman"/>
-          <w:bCs/>
-          <w:sz w:val="24"/>
-          <w:szCs w:val="24"/>
-        </w:rPr>
-        <w:t xml:space="preserve">, T. O.; </w:t>
+        <w:t xml:space="preserve">Falode, O.C.; Ilufoye, T. O.; </w:t>
       </w:r>
       <w:r>
         <w:rPr>
@@ -13110,7 +12717,6 @@
         </w:rPr>
         <w:t xml:space="preserve">[3] </w:t>
       </w:r>
-      <w:proofErr w:type="spellStart"/>
       <w:r>
         <w:rPr>
           <w:rFonts w:ascii="Times New Roman" w:eastAsia="Calibri" w:hAnsi="Times New Roman" w:cs="Times New Roman"/>
@@ -13118,17 +12724,7 @@
           <w:sz w:val="24"/>
           <w:szCs w:val="24"/>
         </w:rPr>
-        <w:t>Falode</w:t>
-      </w:r>
-      <w:proofErr w:type="spellEnd"/>
-      <w:r>
-        <w:rPr>
-          <w:rFonts w:ascii="Times New Roman" w:eastAsia="Calibri" w:hAnsi="Times New Roman" w:cs="Times New Roman"/>
-          <w:bCs/>
-          <w:sz w:val="24"/>
-          <w:szCs w:val="24"/>
-        </w:rPr>
-        <w:t xml:space="preserve">, O.C.; </w:t>
+        <w:t xml:space="preserve">Falode, O.C.; </w:t>
       </w:r>
       <w:r>
         <w:rPr>
@@ -13140,7 +12736,6 @@
         </w:rPr>
         <w:t xml:space="preserve">Awoyemi, I. D.; </w:t>
       </w:r>
-      <w:proofErr w:type="spellStart"/>
       <w:r>
         <w:rPr>
           <w:rFonts w:ascii="Times New Roman" w:eastAsia="Calibri" w:hAnsi="Times New Roman" w:cs="Times New Roman"/>
@@ -13148,17 +12743,7 @@
           <w:sz w:val="24"/>
           <w:szCs w:val="24"/>
         </w:rPr>
-        <w:t>Ilufoye</w:t>
-      </w:r>
-      <w:proofErr w:type="spellEnd"/>
-      <w:r>
-        <w:rPr>
-          <w:rFonts w:ascii="Times New Roman" w:eastAsia="Calibri" w:hAnsi="Times New Roman" w:cs="Times New Roman"/>
-          <w:bCs/>
-          <w:sz w:val="24"/>
-          <w:szCs w:val="24"/>
-        </w:rPr>
-        <w:t>, T. O.</w:t>
+        <w:t>Ilufoye, T. O.</w:t>
       </w:r>
       <w:r>
         <w:rPr>
@@ -13188,31 +12773,7 @@
           <w:sz w:val="24"/>
           <w:szCs w:val="24"/>
         </w:rPr>
-        <w:t>Al-</w:t>
-      </w:r>
-      <w:proofErr w:type="spellStart"/>
-      <w:r>
-        <w:rPr>
-          <w:rFonts w:ascii="Times New Roman" w:eastAsia="Calibri" w:hAnsi="Times New Roman" w:cs="Times New Roman"/>
-          <w:bCs/>
-          <w:i/>
-          <w:iCs/>
-          <w:sz w:val="24"/>
-          <w:szCs w:val="24"/>
-        </w:rPr>
-        <w:t>Himah</w:t>
-      </w:r>
-      <w:proofErr w:type="spellEnd"/>
-      <w:r>
-        <w:rPr>
-          <w:rFonts w:ascii="Times New Roman" w:eastAsia="Calibri" w:hAnsi="Times New Roman" w:cs="Times New Roman"/>
-          <w:bCs/>
-          <w:i/>
-          <w:iCs/>
-          <w:sz w:val="24"/>
-          <w:szCs w:val="24"/>
-        </w:rPr>
-        <w:t xml:space="preserve"> Journal of Education, 2(</w:t>
+        <w:t>Al-Himah Journal of Education, 2(</w:t>
       </w:r>
       <w:r>
         <w:rPr>
@@ -13246,7 +12807,6 @@
         </w:rPr>
         <w:t xml:space="preserve">[2] </w:t>
       </w:r>
-      <w:proofErr w:type="spellStart"/>
       <w:r>
         <w:rPr>
           <w:rFonts w:ascii="Times New Roman" w:eastAsia="Calibri" w:hAnsi="Times New Roman" w:cs="Times New Roman"/>
@@ -13254,37 +12814,7 @@
           <w:sz w:val="24"/>
           <w:szCs w:val="24"/>
         </w:rPr>
-        <w:t>Falode</w:t>
-      </w:r>
-      <w:proofErr w:type="spellEnd"/>
-      <w:r>
-        <w:rPr>
-          <w:rFonts w:ascii="Times New Roman" w:eastAsia="Calibri" w:hAnsi="Times New Roman" w:cs="Times New Roman"/>
-          <w:bCs/>
-          <w:sz w:val="24"/>
-          <w:szCs w:val="24"/>
-        </w:rPr>
-        <w:t xml:space="preserve">, O.C.; Gambari, A.I.; Shittu, T.; Gimba, R.W.; </w:t>
-      </w:r>
-      <w:proofErr w:type="spellStart"/>
-      <w:r>
-        <w:rPr>
-          <w:rFonts w:ascii="Times New Roman" w:eastAsia="Calibri" w:hAnsi="Times New Roman" w:cs="Times New Roman"/>
-          <w:bCs/>
-          <w:sz w:val="24"/>
-          <w:szCs w:val="24"/>
-        </w:rPr>
-        <w:t>Falode</w:t>
-      </w:r>
-      <w:proofErr w:type="spellEnd"/>
-      <w:r>
-        <w:rPr>
-          <w:rFonts w:ascii="Times New Roman" w:eastAsia="Calibri" w:hAnsi="Times New Roman" w:cs="Times New Roman"/>
-          <w:bCs/>
-          <w:sz w:val="24"/>
-          <w:szCs w:val="24"/>
-        </w:rPr>
-        <w:t xml:space="preserve">, M.E. &amp; </w:t>
+        <w:t xml:space="preserve">Falode, O.C.; Gambari, A.I.; Shittu, T.; Gimba, R.W.; Falode, M.E. &amp; </w:t>
       </w:r>
       <w:r>
         <w:rPr>
@@ -13303,27 +12833,7 @@
           <w:sz w:val="24"/>
           <w:szCs w:val="24"/>
         </w:rPr>
-        <w:t xml:space="preserve">  (2015). Effectiveness of virtual classroom in teaching and learning of senior secondary school mathematics concepts in </w:t>
-      </w:r>
-      <w:proofErr w:type="spellStart"/>
-      <w:r>
-        <w:rPr>
-          <w:rFonts w:ascii="Times New Roman" w:eastAsia="Calibri" w:hAnsi="Times New Roman" w:cs="Times New Roman"/>
-          <w:bCs/>
-          <w:sz w:val="24"/>
-          <w:szCs w:val="24"/>
-        </w:rPr>
-        <w:t>minna</w:t>
-      </w:r>
-      <w:proofErr w:type="spellEnd"/>
-      <w:r>
-        <w:rPr>
-          <w:rFonts w:ascii="Times New Roman" w:eastAsia="Calibri" w:hAnsi="Times New Roman" w:cs="Times New Roman"/>
-          <w:bCs/>
-          <w:sz w:val="24"/>
-          <w:szCs w:val="24"/>
-        </w:rPr>
-        <w:t xml:space="preserve">. </w:t>
+        <w:t xml:space="preserve">  (2015). Effectiveness of virtual classroom in teaching and learning of senior secondary school mathematics concepts in minna. </w:t>
       </w:r>
       <w:r>
         <w:rPr>
@@ -13365,7 +12875,6 @@
         </w:rPr>
         <w:t xml:space="preserve">[1] </w:t>
       </w:r>
-      <w:proofErr w:type="spellStart"/>
       <w:r>
         <w:rPr>
           <w:rFonts w:ascii="Times New Roman" w:eastAsia="Calibri" w:hAnsi="Times New Roman" w:cs="Times New Roman"/>
@@ -13373,37 +12882,7 @@
           <w:sz w:val="24"/>
           <w:szCs w:val="24"/>
         </w:rPr>
-        <w:t>Falode</w:t>
-      </w:r>
-      <w:proofErr w:type="spellEnd"/>
-      <w:r>
-        <w:rPr>
-          <w:rFonts w:ascii="Times New Roman" w:eastAsia="Calibri" w:hAnsi="Times New Roman" w:cs="Times New Roman"/>
-          <w:bCs/>
-          <w:sz w:val="24"/>
-          <w:szCs w:val="24"/>
-        </w:rPr>
-        <w:t xml:space="preserve">, O.C.; Usman, Z.N.; </w:t>
-      </w:r>
-      <w:proofErr w:type="spellStart"/>
-      <w:r>
-        <w:rPr>
-          <w:rFonts w:ascii="Times New Roman" w:eastAsia="Calibri" w:hAnsi="Times New Roman" w:cs="Times New Roman"/>
-          <w:bCs/>
-          <w:sz w:val="24"/>
-          <w:szCs w:val="24"/>
-        </w:rPr>
-        <w:t>Ilufoye</w:t>
-      </w:r>
-      <w:proofErr w:type="spellEnd"/>
-      <w:r>
-        <w:rPr>
-          <w:rFonts w:ascii="Times New Roman" w:eastAsia="Calibri" w:hAnsi="Times New Roman" w:cs="Times New Roman"/>
-          <w:bCs/>
-          <w:sz w:val="24"/>
-          <w:szCs w:val="24"/>
-        </w:rPr>
-        <w:t xml:space="preserve">, T. O.  &amp; </w:t>
+        <w:t xml:space="preserve">Falode, O.C.; Usman, Z.N.; Ilufoye, T. O.  &amp; </w:t>
       </w:r>
       <w:r>
         <w:rPr>
@@ -13834,47 +13313,7 @@
           <w:szCs w:val="24"/>
           <w:shd w:val="clear" w:color="auto" w:fill="FFFFFF"/>
         </w:rPr>
-        <w:t xml:space="preserve">Abu, S., </w:t>
-      </w:r>
-      <w:proofErr w:type="spellStart"/>
-      <w:r>
-        <w:rPr>
-          <w:rFonts w:ascii="Times New Roman" w:eastAsia="Times New Roman" w:hAnsi="Times New Roman" w:cs="Times New Roman"/>
-          <w:sz w:val="24"/>
-          <w:szCs w:val="24"/>
-          <w:shd w:val="clear" w:color="auto" w:fill="FFFFFF"/>
-        </w:rPr>
-        <w:t>Ghooreian</w:t>
-      </w:r>
-      <w:proofErr w:type="spellEnd"/>
-      <w:r>
-        <w:rPr>
-          <w:rFonts w:ascii="Times New Roman" w:eastAsia="Times New Roman" w:hAnsi="Times New Roman" w:cs="Times New Roman"/>
-          <w:sz w:val="24"/>
-          <w:szCs w:val="24"/>
-          <w:shd w:val="clear" w:color="auto" w:fill="FFFFFF"/>
-        </w:rPr>
-        <w:t xml:space="preserve">, A., </w:t>
-      </w:r>
-      <w:proofErr w:type="spellStart"/>
-      <w:r>
-        <w:rPr>
-          <w:rFonts w:ascii="Times New Roman" w:eastAsia="Times New Roman" w:hAnsi="Times New Roman" w:cs="Times New Roman"/>
-          <w:sz w:val="24"/>
-          <w:szCs w:val="24"/>
-          <w:shd w:val="clear" w:color="auto" w:fill="FFFFFF"/>
-        </w:rPr>
-        <w:t>Ogunniran</w:t>
-      </w:r>
-      <w:proofErr w:type="spellEnd"/>
-      <w:r>
-        <w:rPr>
-          <w:rFonts w:ascii="Times New Roman" w:eastAsia="Times New Roman" w:hAnsi="Times New Roman" w:cs="Times New Roman"/>
-          <w:sz w:val="24"/>
-          <w:szCs w:val="24"/>
-          <w:shd w:val="clear" w:color="auto" w:fill="FFFFFF"/>
-        </w:rPr>
-        <w:t xml:space="preserve">, M., </w:t>
+        <w:t xml:space="preserve">Abu, S., Ghooreian, A., Ogunniran, M., </w:t>
       </w:r>
       <w:r>
         <w:rPr>
@@ -13938,67 +13377,7 @@
           <w:szCs w:val="24"/>
           <w:shd w:val="clear" w:color="auto" w:fill="FFFFFF"/>
         </w:rPr>
-        <w:t xml:space="preserve">., &amp; </w:t>
-      </w:r>
-      <w:proofErr w:type="spellStart"/>
-      <w:r>
-        <w:rPr>
-          <w:rFonts w:ascii="Times New Roman" w:eastAsia="Times New Roman" w:hAnsi="Times New Roman" w:cs="Times New Roman"/>
-          <w:sz w:val="24"/>
-          <w:szCs w:val="24"/>
-          <w:shd w:val="clear" w:color="auto" w:fill="FFFFFF"/>
-        </w:rPr>
-        <w:t>Ilufoye</w:t>
-      </w:r>
-      <w:proofErr w:type="spellEnd"/>
-      <w:r>
-        <w:rPr>
-          <w:rFonts w:ascii="Times New Roman" w:eastAsia="Times New Roman" w:hAnsi="Times New Roman" w:cs="Times New Roman"/>
-          <w:sz w:val="24"/>
-          <w:szCs w:val="24"/>
-          <w:shd w:val="clear" w:color="auto" w:fill="FFFFFF"/>
-        </w:rPr>
-        <w:t xml:space="preserve">, T. O. (2020). Maximizing virtual </w:t>
-      </w:r>
-      <w:proofErr w:type="gramStart"/>
-      <w:r>
-        <w:rPr>
-          <w:rFonts w:ascii="Times New Roman" w:eastAsia="Times New Roman" w:hAnsi="Times New Roman" w:cs="Times New Roman"/>
-          <w:sz w:val="24"/>
-          <w:szCs w:val="24"/>
-          <w:shd w:val="clear" w:color="auto" w:fill="FFFFFF"/>
-        </w:rPr>
-        <w:t>classroom</w:t>
-      </w:r>
-      <w:proofErr w:type="gramEnd"/>
-      <w:r>
-        <w:rPr>
-          <w:rFonts w:ascii="Times New Roman" w:eastAsia="Times New Roman" w:hAnsi="Times New Roman" w:cs="Times New Roman"/>
-          <w:sz w:val="24"/>
-          <w:szCs w:val="24"/>
-          <w:shd w:val="clear" w:color="auto" w:fill="FFFFFF"/>
-        </w:rPr>
-        <w:t xml:space="preserve"> for effective teaching. In O. C. </w:t>
-      </w:r>
-      <w:proofErr w:type="spellStart"/>
-      <w:r>
-        <w:rPr>
-          <w:rFonts w:ascii="Times New Roman" w:eastAsia="Times New Roman" w:hAnsi="Times New Roman" w:cs="Times New Roman"/>
-          <w:sz w:val="24"/>
-          <w:szCs w:val="24"/>
-          <w:shd w:val="clear" w:color="auto" w:fill="FFFFFF"/>
-        </w:rPr>
-        <w:t>Falode</w:t>
-      </w:r>
-      <w:proofErr w:type="spellEnd"/>
-      <w:r>
-        <w:rPr>
-          <w:rFonts w:ascii="Times New Roman" w:eastAsia="Times New Roman" w:hAnsi="Times New Roman" w:cs="Times New Roman"/>
-          <w:sz w:val="24"/>
-          <w:szCs w:val="24"/>
-          <w:shd w:val="clear" w:color="auto" w:fill="FFFFFF"/>
-        </w:rPr>
-        <w:t xml:space="preserve"> (Ed.), Novel practices in education (pp. 96 -115). Novel Education Research Group. </w:t>
+        <w:t xml:space="preserve">., &amp; Ilufoye, T. O. (2020). Maximizing virtual classroom for effective teaching. In O. C. Falode (Ed.), Novel practices in education (pp. 96 -115). Novel Education Research Group. </w:t>
       </w:r>
     </w:p>
     <w:p>
@@ -14107,29 +13486,7 @@
           <w:sz w:val="24"/>
           <w:szCs w:val="24"/>
         </w:rPr>
-        <w:t xml:space="preserve">Unpacking in-VR learning dynamics for heat stress training: A </w:t>
-      </w:r>
-      <w:proofErr w:type="spellStart"/>
-      <w:r>
-        <w:rPr>
-          <w:rFonts w:ascii="Times New Roman" w:eastAsia="Times New Roman" w:hAnsi="Times New Roman" w:cs="Times New Roman"/>
-          <w:i/>
-          <w:iCs/>
-          <w:sz w:val="24"/>
-          <w:szCs w:val="24"/>
-        </w:rPr>
-        <w:t>microgenetic</w:t>
-      </w:r>
-      <w:proofErr w:type="spellEnd"/>
-      <w:r>
-        <w:rPr>
-          <w:rFonts w:ascii="Times New Roman" w:eastAsia="Times New Roman" w:hAnsi="Times New Roman" w:cs="Times New Roman"/>
-          <w:i/>
-          <w:iCs/>
-          <w:sz w:val="24"/>
-          <w:szCs w:val="24"/>
-        </w:rPr>
-        <w:t xml:space="preserve"> and sequential behavior analysis</w:t>
+        <w:t>Unpacking in-VR learning dynamics for heat stress training: A microgenetic and sequential behavior analysis</w:t>
       </w:r>
       <w:r>
         <w:rPr>
@@ -14405,25 +13762,7 @@
           <w:sz w:val="24"/>
           <w:szCs w:val="24"/>
         </w:rPr>
-        <w:t xml:space="preserve">Nasrin, F., </w:t>
-      </w:r>
-      <w:proofErr w:type="spellStart"/>
-      <w:r>
-        <w:rPr>
-          <w:rFonts w:ascii="Times New Roman" w:eastAsia="Times New Roman" w:hAnsi="Times New Roman" w:cs="Times New Roman"/>
-          <w:sz w:val="24"/>
-          <w:szCs w:val="24"/>
-        </w:rPr>
-        <w:t>Amayou</w:t>
-      </w:r>
-      <w:proofErr w:type="spellEnd"/>
-      <w:r>
-        <w:rPr>
-          <w:rFonts w:ascii="Times New Roman" w:eastAsia="Times New Roman" w:hAnsi="Times New Roman" w:cs="Times New Roman"/>
-          <w:sz w:val="24"/>
-          <w:szCs w:val="24"/>
-        </w:rPr>
-        <w:t xml:space="preserve">, J., </w:t>
+        <w:t xml:space="preserve">Nasrin, F., Amayou, J., </w:t>
       </w:r>
       <w:r>
         <w:rPr>
@@ -14501,25 +13840,7 @@
           <w:sz w:val="24"/>
           <w:szCs w:val="24"/>
         </w:rPr>
-        <w:t xml:space="preserve">Abu, S., </w:t>
-      </w:r>
-      <w:proofErr w:type="spellStart"/>
-      <w:r>
-        <w:rPr>
-          <w:rFonts w:ascii="Times New Roman" w:eastAsia="Times New Roman" w:hAnsi="Times New Roman" w:cs="Times New Roman"/>
-          <w:sz w:val="24"/>
-          <w:szCs w:val="24"/>
-        </w:rPr>
-        <w:t>Ghooreian</w:t>
-      </w:r>
-      <w:proofErr w:type="spellEnd"/>
-      <w:r>
-        <w:rPr>
-          <w:rFonts w:ascii="Times New Roman" w:eastAsia="Times New Roman" w:hAnsi="Times New Roman" w:cs="Times New Roman"/>
-          <w:sz w:val="24"/>
-          <w:szCs w:val="24"/>
-        </w:rPr>
-        <w:t xml:space="preserve">, A., </w:t>
+        <w:t xml:space="preserve">Abu, S., Ghooreian, A., </w:t>
       </w:r>
       <w:r>
         <w:rPr>
@@ -14946,25 +14267,7 @@
           <w:sz w:val="24"/>
           <w:szCs w:val="24"/>
         </w:rPr>
-        <w:t xml:space="preserve">. D, Abu, S., Yuvaraja, H., Moon, J., </w:t>
-      </w:r>
-      <w:proofErr w:type="spellStart"/>
-      <w:r>
-        <w:rPr>
-          <w:rFonts w:ascii="Times New Roman" w:eastAsia="Calibri" w:hAnsi="Times New Roman" w:cs="Times New Roman"/>
-          <w:sz w:val="24"/>
-          <w:szCs w:val="24"/>
-        </w:rPr>
-        <w:t>Patiballa</w:t>
-      </w:r>
-      <w:proofErr w:type="spellEnd"/>
-      <w:r>
-        <w:rPr>
-          <w:rFonts w:ascii="Times New Roman" w:eastAsia="Calibri" w:hAnsi="Times New Roman" w:cs="Times New Roman"/>
-          <w:sz w:val="24"/>
-          <w:szCs w:val="24"/>
-        </w:rPr>
-        <w:t>, S. (AECT, 2025 October). Exploring fidelity dimensions in extended reality technologies for mechanical engineering education: A systematic review, Concurrent Session, (Paper Presentation).</w:t>
+        <w:t>. D, Abu, S., Yuvaraja, H., Moon, J., Patiballa, S. (AECT, 2025 October). Exploring fidelity dimensions in extended reality technologies for mechanical engineering education: A systematic review, Concurrent Session, (Paper Presentation).</w:t>
       </w:r>
     </w:p>
     <w:p>
@@ -15039,31 +14342,7 @@
           <w:szCs w:val="24"/>
           <w:shd w:val="clear" w:color="auto" w:fill="FFFFFF"/>
         </w:rPr>
-        <w:t xml:space="preserve">Teaching and </w:t>
-      </w:r>
-      <w:proofErr w:type="gramStart"/>
-      <w:r>
-        <w:rPr>
-          <w:rFonts w:ascii="Times New Roman" w:eastAsia="Times New Roman" w:hAnsi="Times New Roman" w:cs="Times New Roman"/>
-          <w:i/>
-          <w:iCs/>
-          <w:sz w:val="24"/>
-          <w:szCs w:val="24"/>
-          <w:shd w:val="clear" w:color="auto" w:fill="FFFFFF"/>
-        </w:rPr>
-        <w:t>Learning</w:t>
-      </w:r>
-      <w:proofErr w:type="gramEnd"/>
-      <w:r>
-        <w:rPr>
-          <w:rFonts w:ascii="Times New Roman" w:eastAsia="Times New Roman" w:hAnsi="Times New Roman" w:cs="Times New Roman"/>
-          <w:i/>
-          <w:iCs/>
-          <w:sz w:val="24"/>
-          <w:szCs w:val="24"/>
-          <w:shd w:val="clear" w:color="auto" w:fill="FFFFFF"/>
-        </w:rPr>
-        <w:t xml:space="preserve"> with AI: A Sharing Conference Between Educational Practitioners</w:t>
+        <w:t>Teaching and Learning with AI: A Sharing Conference Between Educational Practitioners</w:t>
       </w:r>
       <w:r>
         <w:rPr>
@@ -15335,7 +14614,6 @@
         </w:rPr>
         <w:t xml:space="preserve">., </w:t>
       </w:r>
-      <w:proofErr w:type="spellStart"/>
       <w:r>
         <w:rPr>
           <w:rFonts w:ascii="Times New Roman" w:eastAsia="Calibri" w:hAnsi="Times New Roman" w:cs="Times New Roman"/>
@@ -15345,19 +14623,7 @@
           <w:u w:val="single"/>
           <w:shd w:val="clear" w:color="auto" w:fill="FFFFFF"/>
         </w:rPr>
-        <w:t>Unggi</w:t>
-      </w:r>
-      <w:proofErr w:type="spellEnd"/>
-      <w:r>
-        <w:rPr>
-          <w:rFonts w:ascii="Times New Roman" w:eastAsia="Calibri" w:hAnsi="Times New Roman" w:cs="Times New Roman"/>
-          <w:spacing w:val="7"/>
-          <w:sz w:val="24"/>
-          <w:szCs w:val="24"/>
-          <w:u w:val="single"/>
-          <w:shd w:val="clear" w:color="auto" w:fill="FFFFFF"/>
-        </w:rPr>
-        <w:t xml:space="preserve"> Lee., &amp;</w:t>
+        <w:t>Unggi Lee., &amp;</w:t>
       </w:r>
       <w:r>
         <w:rPr>
@@ -15748,7 +15014,6 @@
         </w:rPr>
         <w:t xml:space="preserve"> </w:t>
       </w:r>
-      <w:proofErr w:type="spellStart"/>
       <w:r>
         <w:rPr>
           <w:rFonts w:ascii="Times New Roman" w:eastAsia="Calibri" w:hAnsi="Times New Roman" w:cs="Times New Roman"/>
@@ -15757,18 +15022,7 @@
           <w:bdr w:val="none" w:sz="0" w:space="0" w:color="auto" w:frame="1"/>
           <w:shd w:val="clear" w:color="auto" w:fill="FFFFFF"/>
         </w:rPr>
-        <w:t>Ijeluola</w:t>
-      </w:r>
-      <w:proofErr w:type="spellEnd"/>
-      <w:r>
-        <w:rPr>
-          <w:rFonts w:ascii="Times New Roman" w:eastAsia="Calibri" w:hAnsi="Times New Roman" w:cs="Times New Roman"/>
-          <w:sz w:val="24"/>
-          <w:szCs w:val="24"/>
-          <w:bdr w:val="none" w:sz="0" w:space="0" w:color="auto" w:frame="1"/>
-          <w:shd w:val="clear" w:color="auto" w:fill="FFFFFF"/>
-        </w:rPr>
-        <w:t>, S.</w:t>
+        <w:t>Ijeluola, S.</w:t>
       </w:r>
       <w:r>
         <w:rPr>
@@ -15797,64 +15051,24 @@
           <w:szCs w:val="24"/>
           <w:shd w:val="clear" w:color="auto" w:fill="FFFFFF"/>
         </w:rPr>
-        <w:t xml:space="preserve">, &amp; </w:t>
-      </w:r>
-      <w:proofErr w:type="spellStart"/>
+        <w:t>, &amp; Adefisayo, A. (October 2024</w:t>
+      </w:r>
       <w:r>
         <w:rPr>
           <w:rFonts w:ascii="Times New Roman" w:eastAsia="Calibri" w:hAnsi="Times New Roman" w:cs="Times New Roman"/>
           <w:sz w:val="24"/>
           <w:szCs w:val="24"/>
+        </w:rPr>
+        <w:t>)</w:t>
+      </w:r>
+      <w:r>
+        <w:rPr>
+          <w:rFonts w:ascii="Times New Roman" w:eastAsia="Calibri" w:hAnsi="Times New Roman" w:cs="Times New Roman"/>
+          <w:sz w:val="24"/>
+          <w:szCs w:val="24"/>
           <w:shd w:val="clear" w:color="auto" w:fill="FFFFFF"/>
         </w:rPr>
-        <w:t>Adefisayo</w:t>
-      </w:r>
-      <w:proofErr w:type="spellEnd"/>
-      <w:r>
-        <w:rPr>
-          <w:rFonts w:ascii="Times New Roman" w:eastAsia="Calibri" w:hAnsi="Times New Roman" w:cs="Times New Roman"/>
-          <w:sz w:val="24"/>
-          <w:szCs w:val="24"/>
-          <w:shd w:val="clear" w:color="auto" w:fill="FFFFFF"/>
-        </w:rPr>
-        <w:t>, A. (October 2024</w:t>
-      </w:r>
-      <w:r>
-        <w:rPr>
-          <w:rFonts w:ascii="Times New Roman" w:eastAsia="Calibri" w:hAnsi="Times New Roman" w:cs="Times New Roman"/>
-          <w:sz w:val="24"/>
-          <w:szCs w:val="24"/>
-        </w:rPr>
-        <w:t>)</w:t>
-      </w:r>
-      <w:r>
-        <w:rPr>
-          <w:rFonts w:ascii="Times New Roman" w:eastAsia="Calibri" w:hAnsi="Times New Roman" w:cs="Times New Roman"/>
-          <w:sz w:val="24"/>
-          <w:szCs w:val="24"/>
-          <w:shd w:val="clear" w:color="auto" w:fill="FFFFFF"/>
-        </w:rPr>
-        <w:t>. Leveraging Generative Artificial Intelligence (</w:t>
-      </w:r>
-      <w:proofErr w:type="spellStart"/>
-      <w:r>
-        <w:rPr>
-          <w:rFonts w:ascii="Times New Roman" w:eastAsia="Calibri" w:hAnsi="Times New Roman" w:cs="Times New Roman"/>
-          <w:sz w:val="24"/>
-          <w:szCs w:val="24"/>
-          <w:shd w:val="clear" w:color="auto" w:fill="FFFFFF"/>
-        </w:rPr>
-        <w:t>gAI</w:t>
-      </w:r>
-      <w:proofErr w:type="spellEnd"/>
-      <w:r>
-        <w:rPr>
-          <w:rFonts w:ascii="Times New Roman" w:eastAsia="Calibri" w:hAnsi="Times New Roman" w:cs="Times New Roman"/>
-          <w:sz w:val="24"/>
-          <w:szCs w:val="24"/>
-          <w:shd w:val="clear" w:color="auto" w:fill="FFFFFF"/>
-        </w:rPr>
-        <w:t xml:space="preserve">) in Learning Design: A Mixed-Methods Examination of Instructional Designers’ Experience. </w:t>
+        <w:t xml:space="preserve">. Leveraging Generative Artificial Intelligence (gAI) in Learning Design: A Mixed-Methods Examination of Instructional Designers’ Experience. </w:t>
       </w:r>
       <w:r>
         <w:rPr>
@@ -15901,7 +15115,6 @@
         </w:rPr>
         <w:t xml:space="preserve"> </w:t>
       </w:r>
-      <w:proofErr w:type="spellStart"/>
       <w:r>
         <w:rPr>
           <w:rFonts w:ascii="Times New Roman" w:eastAsia="Calibri" w:hAnsi="Times New Roman" w:cs="Times New Roman"/>
@@ -15910,47 +15123,16 @@
           <w:bdr w:val="none" w:sz="0" w:space="0" w:color="auto" w:frame="1"/>
           <w:shd w:val="clear" w:color="auto" w:fill="FFFFFF"/>
         </w:rPr>
-        <w:t>Ijeluola</w:t>
-      </w:r>
-      <w:proofErr w:type="spellEnd"/>
+        <w:t>Ijeluola, S.</w:t>
+      </w:r>
       <w:r>
         <w:rPr>
           <w:rFonts w:ascii="Times New Roman" w:eastAsia="Calibri" w:hAnsi="Times New Roman" w:cs="Times New Roman"/>
           <w:sz w:val="24"/>
           <w:szCs w:val="24"/>
-          <w:bdr w:val="none" w:sz="0" w:space="0" w:color="auto" w:frame="1"/>
           <w:shd w:val="clear" w:color="auto" w:fill="FFFFFF"/>
         </w:rPr>
-        <w:t>, S.</w:t>
-      </w:r>
-      <w:r>
-        <w:rPr>
-          <w:rFonts w:ascii="Times New Roman" w:eastAsia="Calibri" w:hAnsi="Times New Roman" w:cs="Times New Roman"/>
-          <w:sz w:val="24"/>
-          <w:szCs w:val="24"/>
-          <w:shd w:val="clear" w:color="auto" w:fill="FFFFFF"/>
-        </w:rPr>
-        <w:t xml:space="preserve">, </w:t>
-      </w:r>
-      <w:proofErr w:type="spellStart"/>
-      <w:r>
-        <w:rPr>
-          <w:rFonts w:ascii="Times New Roman" w:eastAsia="Calibri" w:hAnsi="Times New Roman" w:cs="Times New Roman"/>
-          <w:sz w:val="24"/>
-          <w:szCs w:val="24"/>
-          <w:shd w:val="clear" w:color="auto" w:fill="FFFFFF"/>
-        </w:rPr>
-        <w:t>Adefisayo</w:t>
-      </w:r>
-      <w:proofErr w:type="spellEnd"/>
-      <w:r>
-        <w:rPr>
-          <w:rFonts w:ascii="Times New Roman" w:eastAsia="Calibri" w:hAnsi="Times New Roman" w:cs="Times New Roman"/>
-          <w:sz w:val="24"/>
-          <w:szCs w:val="24"/>
-          <w:shd w:val="clear" w:color="auto" w:fill="FFFFFF"/>
-        </w:rPr>
-        <w:t xml:space="preserve">, A., &amp; </w:t>
+        <w:t xml:space="preserve">, Adefisayo, A., &amp; </w:t>
       </w:r>
       <w:r>
         <w:rPr>
@@ -16061,27 +15243,7 @@
           <w:szCs w:val="24"/>
           <w:shd w:val="clear" w:color="auto" w:fill="FFFFFF"/>
         </w:rPr>
-        <w:t>., &amp; Baah-Mintah, R. (</w:t>
-      </w:r>
-      <w:proofErr w:type="gramStart"/>
-      <w:r>
-        <w:rPr>
-          <w:rFonts w:ascii="Times New Roman" w:eastAsia="Calibri" w:hAnsi="Times New Roman" w:cs="Times New Roman"/>
-          <w:sz w:val="24"/>
-          <w:szCs w:val="24"/>
-          <w:shd w:val="clear" w:color="auto" w:fill="FFFFFF"/>
-        </w:rPr>
-        <w:t>October,</w:t>
-      </w:r>
-      <w:proofErr w:type="gramEnd"/>
-      <w:r>
-        <w:rPr>
-          <w:rFonts w:ascii="Times New Roman" w:eastAsia="Calibri" w:hAnsi="Times New Roman" w:cs="Times New Roman"/>
-          <w:sz w:val="24"/>
-          <w:szCs w:val="24"/>
-          <w:shd w:val="clear" w:color="auto" w:fill="FFFFFF"/>
-        </w:rPr>
-        <w:t xml:space="preserve"> 2024)</w:t>
+        <w:t>., &amp; Baah-Mintah, R. (October, 2024)</w:t>
       </w:r>
       <w:r>
         <w:rPr>
@@ -16144,23 +15306,13 @@
         </w:rPr>
         <w:t xml:space="preserve"> </w:t>
       </w:r>
-      <w:proofErr w:type="spellStart"/>
       <w:r>
         <w:rPr>
           <w:rFonts w:ascii="Times New Roman" w:eastAsia="Calibri" w:hAnsi="Times New Roman" w:cs="Times New Roman"/>
           <w:sz w:val="24"/>
           <w:szCs w:val="24"/>
         </w:rPr>
-        <w:t>Barielnen</w:t>
-      </w:r>
-      <w:proofErr w:type="spellEnd"/>
-      <w:r>
-        <w:rPr>
-          <w:rFonts w:ascii="Times New Roman" w:eastAsia="Calibri" w:hAnsi="Times New Roman" w:cs="Times New Roman"/>
-          <w:sz w:val="24"/>
-          <w:szCs w:val="24"/>
-        </w:rPr>
-        <w:t>, V</w:t>
+        <w:t>Barielnen, V</w:t>
       </w:r>
       <w:r>
         <w:rPr>
@@ -16313,27 +15465,7 @@
           <w:szCs w:val="24"/>
           <w:shd w:val="clear" w:color="auto" w:fill="FFFFFF"/>
         </w:rPr>
-        <w:t>. (</w:t>
-      </w:r>
-      <w:proofErr w:type="gramStart"/>
-      <w:r>
-        <w:rPr>
-          <w:rFonts w:ascii="Times New Roman" w:eastAsia="Calibri" w:hAnsi="Times New Roman" w:cs="Times New Roman"/>
-          <w:sz w:val="24"/>
-          <w:szCs w:val="24"/>
-          <w:shd w:val="clear" w:color="auto" w:fill="FFFFFF"/>
-        </w:rPr>
-        <w:t>April,</w:t>
-      </w:r>
-      <w:proofErr w:type="gramEnd"/>
-      <w:r>
-        <w:rPr>
-          <w:rFonts w:ascii="Times New Roman" w:eastAsia="Calibri" w:hAnsi="Times New Roman" w:cs="Times New Roman"/>
-          <w:sz w:val="24"/>
-          <w:szCs w:val="24"/>
-          <w:shd w:val="clear" w:color="auto" w:fill="FFFFFF"/>
-        </w:rPr>
-        <w:t xml:space="preserve"> 2024). Elementary students’ problem-solving and visual</w:t>
+        <w:t>. (April, 2024). Elementary students’ problem-solving and visual</w:t>
       </w:r>
       <w:r>
         <w:rPr>
@@ -16674,25 +15806,7 @@
           <w:sz w:val="24"/>
           <w:szCs w:val="24"/>
         </w:rPr>
-        <w:t xml:space="preserve">Innovative Technology Experiences for Students and Teachers (ITEST). Lead PI: Dr. </w:t>
-      </w:r>
-      <w:proofErr w:type="spellStart"/>
-      <w:r>
-        <w:rPr>
-          <w:rFonts w:ascii="Times New Roman" w:eastAsia="Times New Roman" w:hAnsi="Times New Roman" w:cs="Times New Roman"/>
-          <w:sz w:val="24"/>
-          <w:szCs w:val="24"/>
-        </w:rPr>
-        <w:t>Feiya</w:t>
-      </w:r>
-      <w:proofErr w:type="spellEnd"/>
-      <w:r>
-        <w:rPr>
-          <w:rFonts w:ascii="Times New Roman" w:eastAsia="Times New Roman" w:hAnsi="Times New Roman" w:cs="Times New Roman"/>
-          <w:sz w:val="24"/>
-          <w:szCs w:val="24"/>
-        </w:rPr>
-        <w:t xml:space="preserve"> Luo (Resubmission; $ 1,125,666) [Awarded]. </w:t>
+        <w:t xml:space="preserve">Innovative Technology Experiences for Students and Teachers (ITEST). Lead PI: Dr. Feiya Luo (Resubmission; $ 1,125,666) [Awarded]. </w:t>
       </w:r>
     </w:p>
     <w:p>
@@ -21008,7 +20122,6 @@
               </w:rPr>
               <w:t xml:space="preserve"> </w:t>
             </w:r>
-            <w:proofErr w:type="gramStart"/>
             <w:r>
               <w:rPr>
                 <w:rFonts w:ascii="Times New Roman" w:hAnsi="Times New Roman" w:cs="Times New Roman"/>
@@ -21037,7 +20150,6 @@
               </w:rPr>
               <w:t>and</w:t>
             </w:r>
-            <w:proofErr w:type="gramEnd"/>
             <w:r>
               <w:rPr>
                 <w:rFonts w:ascii="Times New Roman" w:hAnsi="Times New Roman" w:cs="Times New Roman"/>
@@ -22963,7 +22075,6 @@
                 <w:lang w:eastAsia="zh-CN"/>
               </w:rPr>
             </w:pPr>
-            <w:proofErr w:type="spellStart"/>
             <w:r>
               <w:rPr>
                 <w:rFonts w:ascii="Times New Roman" w:eastAsia="SimSun" w:hAnsi="Times New Roman" w:cs="Times New Roman"/>
@@ -22972,18 +22083,7 @@
                 <w:shd w:val="clear" w:color="auto" w:fill="FFFFFF"/>
                 <w:lang w:eastAsia="zh-CN"/>
               </w:rPr>
-              <w:t>Behaviour</w:t>
-            </w:r>
-            <w:proofErr w:type="spellEnd"/>
-            <w:r>
-              <w:rPr>
-                <w:rFonts w:ascii="Times New Roman" w:eastAsia="SimSun" w:hAnsi="Times New Roman" w:cs="Times New Roman"/>
-                <w:sz w:val="24"/>
-                <w:szCs w:val="24"/>
-                <w:shd w:val="clear" w:color="auto" w:fill="FFFFFF"/>
-                <w:lang w:eastAsia="zh-CN"/>
-              </w:rPr>
-              <w:t xml:space="preserve"> &amp; Information Technology</w:t>
+              <w:t>Behaviour &amp; Information Technology</w:t>
             </w:r>
           </w:p>
         </w:tc>
@@ -23524,17 +22624,7 @@
                 <w:szCs w:val="24"/>
                 <w:lang w:eastAsia="zh-CN"/>
               </w:rPr>
-              <w:t>Association of Educational and Communication Technology (</w:t>
-            </w:r>
-            <w:proofErr w:type="gramStart"/>
-            <w:r>
-              <w:rPr>
-                <w:rFonts w:ascii="Times New Roman" w:eastAsia="SimSun" w:hAnsi="Times New Roman" w:cs="Times New Roman"/>
-                <w:sz w:val="24"/>
-                <w:szCs w:val="24"/>
-                <w:lang w:eastAsia="zh-CN"/>
-              </w:rPr>
-              <w:t>AECT)</w:t>
+              <w:t>Association of Educational and Communication Technology (AECT)</w:t>
             </w:r>
             <w:r>
               <w:rPr>
@@ -23544,18 +22634,7 @@
                 <w:bdr w:val="none" w:sz="0" w:space="0" w:color="auto" w:frame="1"/>
                 <w:lang w:eastAsia="zh-CN"/>
               </w:rPr>
-              <w:t xml:space="preserve">   </w:t>
-            </w:r>
-            <w:proofErr w:type="gramEnd"/>
-            <w:r>
-              <w:rPr>
-                <w:rFonts w:ascii="Times New Roman" w:eastAsia="Times New Roman" w:hAnsi="Times New Roman" w:cs="Times New Roman"/>
-                <w:sz w:val="24"/>
-                <w:szCs w:val="24"/>
-                <w:bdr w:val="none" w:sz="0" w:space="0" w:color="auto" w:frame="1"/>
-                <w:lang w:eastAsia="zh-CN"/>
-              </w:rPr>
-              <w:t xml:space="preserve">      </w:t>
+              <w:t xml:space="preserve">         </w:t>
             </w:r>
           </w:p>
         </w:tc>
@@ -23820,27 +22899,7 @@
                 <w:szCs w:val="24"/>
                 <w:lang w:eastAsia="zh-CN"/>
               </w:rPr>
-              <w:t>Special Interest Group on Computer Science Education (</w:t>
-            </w:r>
-            <w:proofErr w:type="gramStart"/>
-            <w:r>
-              <w:rPr>
-                <w:rFonts w:ascii="Times New Roman" w:eastAsia="SimSun" w:hAnsi="Times New Roman" w:cs="Times New Roman"/>
-                <w:sz w:val="24"/>
-                <w:szCs w:val="24"/>
-                <w:lang w:eastAsia="zh-CN"/>
-              </w:rPr>
-              <w:t xml:space="preserve">SIGCSE)   </w:t>
-            </w:r>
-            <w:proofErr w:type="gramEnd"/>
-            <w:r>
-              <w:rPr>
-                <w:rFonts w:ascii="Times New Roman" w:eastAsia="SimSun" w:hAnsi="Times New Roman" w:cs="Times New Roman"/>
-                <w:sz w:val="24"/>
-                <w:szCs w:val="24"/>
-                <w:lang w:eastAsia="zh-CN"/>
-              </w:rPr>
-              <w:t xml:space="preserve">                       </w:t>
+              <w:t xml:space="preserve">Special Interest Group on Computer Science Education (SIGCSE)                          </w:t>
             </w:r>
           </w:p>
         </w:tc>
@@ -23903,17 +22962,7 @@
                 <w:szCs w:val="24"/>
                 <w:lang w:eastAsia="zh-CN"/>
               </w:rPr>
-              <w:t>Association of Educational and Communication Technology (</w:t>
-            </w:r>
-            <w:proofErr w:type="gramStart"/>
-            <w:r>
-              <w:rPr>
-                <w:rFonts w:ascii="Times New Roman" w:eastAsia="SimSun" w:hAnsi="Times New Roman" w:cs="Times New Roman"/>
-                <w:sz w:val="24"/>
-                <w:szCs w:val="24"/>
-                <w:lang w:eastAsia="zh-CN"/>
-              </w:rPr>
-              <w:t>AECT)</w:t>
+              <w:t>Association of Educational and Communication Technology (AECT)</w:t>
             </w:r>
             <w:r>
               <w:rPr>
@@ -23923,18 +22972,7 @@
                 <w:bdr w:val="none" w:sz="0" w:space="0" w:color="auto" w:frame="1"/>
                 <w:lang w:eastAsia="zh-CN"/>
               </w:rPr>
-              <w:t xml:space="preserve">   </w:t>
-            </w:r>
-            <w:proofErr w:type="gramEnd"/>
-            <w:r>
-              <w:rPr>
-                <w:rFonts w:ascii="Times New Roman" w:eastAsia="Times New Roman" w:hAnsi="Times New Roman" w:cs="Times New Roman"/>
-                <w:sz w:val="24"/>
-                <w:szCs w:val="24"/>
-                <w:bdr w:val="none" w:sz="0" w:space="0" w:color="auto" w:frame="1"/>
-                <w:lang w:eastAsia="zh-CN"/>
-              </w:rPr>
-              <w:t xml:space="preserve">      </w:t>
+              <w:t xml:space="preserve">         </w:t>
             </w:r>
           </w:p>
         </w:tc>
@@ -25641,7 +24679,6 @@
                 <w:szCs w:val="24"/>
               </w:rPr>
             </w:pPr>
-            <w:proofErr w:type="spellStart"/>
             <w:r>
               <w:rPr>
                 <w:rFonts w:ascii="Times New Roman" w:hAnsi="Times New Roman" w:cs="Times New Roman"/>
@@ -25649,17 +24686,7 @@
                 <w:sz w:val="24"/>
                 <w:szCs w:val="24"/>
               </w:rPr>
-              <w:t>McJulien</w:t>
-            </w:r>
-            <w:proofErr w:type="spellEnd"/>
-            <w:r>
-              <w:rPr>
-                <w:rFonts w:ascii="Times New Roman" w:hAnsi="Times New Roman" w:cs="Times New Roman"/>
-                <w:w w:val="90"/>
-                <w:sz w:val="24"/>
-                <w:szCs w:val="24"/>
-              </w:rPr>
-              <w:t xml:space="preserve"> Graduate Student Scholarship Award ($500)</w:t>
+              <w:t>McJulien Graduate Student Scholarship Award ($500)</w:t>
             </w:r>
           </w:p>
         </w:tc>
@@ -26287,7 +25314,6 @@
                 <w:szCs w:val="24"/>
               </w:rPr>
             </w:pPr>
-            <w:proofErr w:type="gramStart"/>
             <w:r>
               <w:rPr>
                 <w:rFonts w:ascii="Times New Roman" w:hAnsi="Times New Roman" w:cs="Times New Roman"/>
@@ -26315,7 +25341,6 @@
               </w:rPr>
               <w:t>Together</w:t>
             </w:r>
-            <w:proofErr w:type="gramEnd"/>
             <w:r>
               <w:rPr>
                 <w:rFonts w:ascii="Times New Roman" w:hAnsi="Times New Roman" w:cs="Times New Roman"/>
@@ -27252,27 +26277,7 @@
                 <w:sz w:val="24"/>
                 <w:szCs w:val="24"/>
               </w:rPr>
-              <w:t>(</w:t>
-            </w:r>
-            <w:proofErr w:type="spellStart"/>
-            <w:r>
-              <w:rPr>
-                <w:rFonts w:ascii="Times New Roman" w:hAnsi="Times New Roman" w:cs="Times New Roman"/>
-                <w:spacing w:val="-2"/>
-                <w:sz w:val="24"/>
-                <w:szCs w:val="24"/>
-              </w:rPr>
-              <w:t>iLRN</w:t>
-            </w:r>
-            <w:proofErr w:type="spellEnd"/>
-            <w:r>
-              <w:rPr>
-                <w:rFonts w:ascii="Times New Roman" w:hAnsi="Times New Roman" w:cs="Times New Roman"/>
-                <w:spacing w:val="-2"/>
-                <w:sz w:val="24"/>
-                <w:szCs w:val="24"/>
-              </w:rPr>
-              <w:t>)</w:t>
+              <w:t>(iLRN)</w:t>
             </w:r>
           </w:p>
         </w:tc>
@@ -29467,7 +28472,7 @@
       </w:r>
     </w:p>
     <w:sectPr>
-      <w:footerReference w:type="default" r:id="rId20"/>
+      <w:footerReference w:type="default" r:id="rId19"/>
       <w:pgSz w:w="12240" w:h="15840"/>
       <w:pgMar w:top="720" w:right="720" w:bottom="720" w:left="720" w:header="720" w:footer="0" w:gutter="0"/>
       <w:cols w:space="720"/>
@@ -35881,6 +34886,7 @@
   <w:style w:type="character" w:default="1" w:styleId="DefaultParagraphFont">
     <w:name w:val="Default Paragraph Font"/>
     <w:uiPriority w:val="1"/>
+    <w:semiHidden/>
     <w:unhideWhenUsed/>
   </w:style>
   <w:style w:type="table" w:default="1" w:styleId="TableNormal">

</xml_diff>

<commit_message>
Add GenAI-RTS manuscript under review at AI and Ethics
Inserts entry [22] at the top of the peer-reviewed journal list:
Hossain, Nawmi, Ahmadi, Beck, Awoyemi, & Li - 'Measuring How Students
Rely on Generative AI in Academic Writing: Development and
Multi-Source Validation of the Generative AI Reliance Types Scale
(GenAI-RTS)'. Matches the existing CV formatting convention
(Times New Roman 12pt, Awoyemi author name bold).

Journal article count 21 -> 22.

Co-Authored-By: Claude Opus 4.8 <noreply@anthropic.com>
</commit_message>
<xml_diff>
--- a/CV_David.docx
+++ b/CV_David.docx
@@ -10444,6 +10444,45 @@
           <w:szCs w:val="24"/>
         </w:rPr>
         <w:t xml:space="preserve"> Journal Articles</w:t>
+      </w:r>
+    </w:p>
+    <w:p>
+      <w:pPr>
+        <w:widowControl/>
+        <w:shd w:val="clear" w:color="auto" w:fill="FFFFFF"/>
+        <w:autoSpaceDE/>
+        <w:autoSpaceDN/>
+        <w:ind w:left="720" w:hanging="630"/>
+        <w:rPr>
+          <w:rFonts w:ascii="Times New Roman" w:eastAsia="Times New Roman" w:hAnsi="Times New Roman" w:cs="Times New Roman"/>
+          <w:sz w:val="24"/>
+          <w:szCs w:val="24"/>
+          <w:shd w:val="clear" w:color="auto" w:fill="FFFFFF"/>
+        </w:rPr>
+      </w:pPr>
+      <w:r>
+        <w:rPr>
+          <w:rFonts w:ascii="Times New Roman" w:hAnsi="Times New Roman"/>
+          <w:b w:val="0"/>
+          <w:sz w:val="24"/>
+        </w:rPr>
+        <w:t xml:space="preserve">[22] Hossain, S., Nawmi, T. A., Ahmadi, S., Beck, B., </w:t>
+      </w:r>
+      <w:r>
+        <w:rPr>
+          <w:rFonts w:ascii="Times New Roman" w:hAnsi="Times New Roman"/>
+          <w:b/>
+          <w:sz w:val="24"/>
+        </w:rPr>
+        <w:t>Awoyemi, I. D.</w:t>
+      </w:r>
+      <w:r>
+        <w:rPr>
+          <w:rFonts w:ascii="Times New Roman" w:hAnsi="Times New Roman"/>
+          <w:b w:val="0"/>
+          <w:sz w:val="24"/>
+        </w:rPr>
+        <w:t>, &amp; Li, L. (Under review). Measuring How Students Rely on Generative AI in Academic Writing: Development and Multi-Source Validation of the Generative AI Reliance Types Scale (GenAI-RTS). AI and Ethics.</w:t>
       </w:r>
     </w:p>
     <w:p>

</xml_diff>